<commit_message>
Completa el punto 2.3 con el Plan de Desarrollo 2026-2030 y ajusta la acreditación en 1.13
Co-Authored-By: Claude Opus 5.5 <noreply@anthropic.com>
Claude-Session: https://claude.ai/code/session_01Li7yxA95TVg4oPXuqG5DZe
</commit_message>
<xml_diff>
--- a/rediseno_2026/2. Antecedentes.docx
+++ b/rediseno_2026/2. Antecedentes.docx
@@ -1607,23 +1607,37 @@
           <w:i w:val="0"/>
           <w:sz w:val="20"/>
         </w:rPr>
-        <w:t>El Reglamento de Innovación Curricular, aprobado mediante Resolución del Honorable Consejo Universitario N.º 032/2025, establece en su Artículo 12 que el plan de desarrollo de la Carrera debe estar alineado y armonizado con el de la Universidad Mayor de San Andrés.</w:t>
+        <w:t>La Carrera de Contaduría Pública cuenta con el Plan Estratégico de Desarrollo Institucional 2026-2030, que orienta su gestión hacia la formación de Contadores Públicos Autorizados con idoneidad técnica, capacidad crítica y liderazgo ético, en un contexto marcado por las tecnologías emergentes, la actualización de los marcos normativos contables y de aseguramiento, y la creciente exigencia social de transparencia y responsabilidad pública.</w:t>
       </w:r>
     </w:p>
     <w:p>
       <w:pPr>
-        <w:spacing w:before="0" w:after="200" w:line="240" w:lineRule="auto"/>
-        <w:jc w:val="both"/>
+        <w:keepNext/>
+        <w:tabs>
+          <w:tab w:pos="709" w:val="left"/>
+        </w:tabs>
+        <w:spacing w:before="80" w:after="200" w:line="240" w:lineRule="auto"/>
+        <w:ind w:left="709" w:hanging="709"/>
+        <w:jc w:val="left"/>
       </w:pPr>
       <w:r>
         <w:rPr>
           <w:rFonts w:ascii="Century Gothic" w:hAnsi="Century Gothic" w:cs="Century Gothic" w:eastAsia="Century Gothic"/>
-          <w:b w:val="0"/>
+          <w:b/>
           <w:i w:val="0"/>
-          <w:sz w:val="20"/>
-          <w:highlight w:val="green"/>
+          <w:sz w:val="22"/>
         </w:rPr>
-        <w:t>La planificación de la Universidad se rige por el Plan Estratégico Institucional 2021-2025 con visión al 2030, aprobado mediante Resolución del Honorable Consejo Universitario N.º 355/2023, de 6 de septiembre de 2023, que organiza su acción en las áreas de formación profesional, investigación, interacción social y gestión institucional.</w:t>
+        <w:t>2.3.1</w:t>
+        <w:tab/>
+      </w:r>
+      <w:r>
+        <w:rPr>
+          <w:rFonts w:ascii="Century Gothic" w:hAnsi="Century Gothic" w:cs="Century Gothic" w:eastAsia="Century Gothic"/>
+          <w:b/>
+          <w:i w:val="0"/>
+          <w:sz w:val="22"/>
+        </w:rPr>
+        <w:t>Marco normativo y alineación institucional</w:t>
       </w:r>
     </w:p>
     <w:p>
@@ -1638,427 +1652,122 @@
           <w:i w:val="0"/>
           <w:sz w:val="20"/>
         </w:rPr>
-        <w:t>En concordancia con ese marco, los ejes estratégicos de la Carrera, definidos en el punto 2.4, se articulan con las áreas del Plan Estratégico Institucional de la siguiente manera:</w:t>
+        <w:t>El Plan se sustenta en los principios de autonomía universitaria y cogobierno paritario docente estudiantil, y se articula con los siguientes instrumentos:</w:t>
       </w:r>
     </w:p>
-    <w:tbl>
-      <w:tblPr>
-        <w:tblW w:type="auto" w:w="0"/>
-        <w:jc w:val="center"/>
-        <w:tblLayout w:type="fixed"/>
-        <w:tblLook w:firstColumn="1" w:firstRow="1" w:lastColumn="0" w:lastRow="0" w:noHBand="0" w:noVBand="1" w:val="04A0"/>
-      </w:tblPr>
-      <w:tblGrid>
-        <w:gridCol w:w="2835"/>
-        <w:gridCol w:w="6236"/>
-      </w:tblGrid>
-      <w:tr>
-        <w:trPr>
-          <w:tblHeader/>
-        </w:trPr>
-        <w:tc>
-          <w:tcPr>
-            <w:tcW w:type="dxa" w:w="2835"/>
-            <w:tcBorders>
-              <w:top w:val="single" w:sz="4" w:space="0" w:color="4472C4"/>
-              <w:left w:val="single" w:sz="4" w:space="0" w:color="4472C4"/>
-              <w:bottom w:val="single" w:sz="4" w:space="0" w:color="4472C4"/>
-              <w:right w:val="single" w:sz="4" w:space="0" w:color="4472C4"/>
-            </w:tcBorders>
-            <w:shd w:val="clear" w:color="auto" w:fill="4472C4"/>
-            <w:vAlign w:val="center"/>
-          </w:tcPr>
-          <w:p>
-            <w:pPr>
-              <w:spacing w:before="0" w:after="0" w:line="240" w:lineRule="auto"/>
-              <w:jc w:val="center"/>
-            </w:pPr>
-            <w:r>
-              <w:rPr>
-                <w:rFonts w:ascii="Century Gothic" w:hAnsi="Century Gothic" w:cs="Century Gothic" w:eastAsia="Century Gothic"/>
-                <w:b/>
-                <w:i w:val="0"/>
-                <w:color w:val="FFFFFF"/>
-                <w:sz w:val="20"/>
-              </w:rPr>
-              <w:t>Área del PEI UMSA</w:t>
-            </w:r>
-          </w:p>
-        </w:tc>
-        <w:tc>
-          <w:tcPr>
-            <w:tcW w:type="dxa" w:w="6236"/>
-            <w:tcBorders>
-              <w:top w:val="single" w:sz="4" w:space="0" w:color="4472C4"/>
-              <w:left w:val="single" w:sz="4" w:space="0" w:color="4472C4"/>
-              <w:bottom w:val="single" w:sz="4" w:space="0" w:color="4472C4"/>
-              <w:right w:val="single" w:sz="4" w:space="0" w:color="4472C4"/>
-            </w:tcBorders>
-            <w:shd w:val="clear" w:color="auto" w:fill="4472C4"/>
-            <w:vAlign w:val="center"/>
-          </w:tcPr>
-          <w:p>
-            <w:pPr>
-              <w:spacing w:before="0" w:after="0" w:line="240" w:lineRule="auto"/>
-              <w:jc w:val="center"/>
-            </w:pPr>
-            <w:r>
-              <w:rPr>
-                <w:rFonts w:ascii="Century Gothic" w:hAnsi="Century Gothic" w:cs="Century Gothic" w:eastAsia="Century Gothic"/>
-                <w:b/>
-                <w:i w:val="0"/>
-                <w:color w:val="FFFFFF"/>
-                <w:sz w:val="20"/>
-              </w:rPr>
-              <w:t>Eje estratégico de la Carrera</w:t>
-            </w:r>
-          </w:p>
-        </w:tc>
-      </w:tr>
-      <w:tr>
-        <w:tc>
-          <w:tcPr>
-            <w:tcW w:type="dxa" w:w="2835"/>
-            <w:tcBorders>
-              <w:top w:val="single" w:sz="4" w:space="0" w:color="8EAADB"/>
-              <w:left w:val="single" w:sz="4" w:space="0" w:color="8EAADB"/>
-              <w:bottom w:val="single" w:sz="4" w:space="0" w:color="8EAADB"/>
-              <w:right w:val="single" w:sz="4" w:space="0" w:color="8EAADB"/>
-            </w:tcBorders>
-            <w:shd w:val="clear" w:color="auto" w:fill="D9E2F3"/>
-            <w:vAlign w:val="top"/>
-          </w:tcPr>
-          <w:p>
-            <w:pPr>
-              <w:spacing w:before="0" w:after="0" w:line="240" w:lineRule="auto"/>
-              <w:jc w:val="left"/>
-            </w:pPr>
-            <w:r>
-              <w:rPr>
-                <w:rFonts w:ascii="Century Gothic" w:hAnsi="Century Gothic" w:cs="Century Gothic" w:eastAsia="Century Gothic"/>
-                <w:b w:val="0"/>
-                <w:i w:val="0"/>
-                <w:sz w:val="20"/>
-                <w:highlight w:val="green"/>
-              </w:rPr>
-              <w:t>Formación profesional</w:t>
-            </w:r>
-          </w:p>
-        </w:tc>
-        <w:tc>
-          <w:tcPr>
-            <w:tcW w:type="dxa" w:w="6236"/>
-            <w:tcBorders>
-              <w:top w:val="single" w:sz="4" w:space="0" w:color="8EAADB"/>
-              <w:left w:val="single" w:sz="4" w:space="0" w:color="8EAADB"/>
-              <w:bottom w:val="single" w:sz="4" w:space="0" w:color="8EAADB"/>
-              <w:right w:val="single" w:sz="4" w:space="0" w:color="8EAADB"/>
-            </w:tcBorders>
-            <w:shd w:val="clear" w:color="auto" w:fill="D9E2F3"/>
-            <w:vAlign w:val="top"/>
-          </w:tcPr>
-          <w:p>
-            <w:pPr>
-              <w:tabs>
-                <w:tab w:pos="255" w:val="left"/>
-              </w:tabs>
-              <w:spacing w:before="0" w:after="0" w:line="240" w:lineRule="auto"/>
-              <w:ind w:left="255" w:hanging="255"/>
-              <w:jc w:val="left"/>
-            </w:pPr>
-            <w:r>
-              <w:rPr>
-                <w:rFonts w:ascii="Century Gothic" w:hAnsi="Century Gothic" w:cs="Century Gothic" w:eastAsia="Century Gothic"/>
-                <w:sz w:val="20"/>
-              </w:rPr>
-              <w:t>▪</w:t>
-              <w:tab/>
-            </w:r>
-            <w:r>
-              <w:rPr>
-                <w:rFonts w:ascii="Century Gothic" w:hAnsi="Century Gothic" w:cs="Century Gothic" w:eastAsia="Century Gothic"/>
-                <w:b w:val="0"/>
-                <w:i w:val="0"/>
-                <w:sz w:val="20"/>
-              </w:rPr>
-              <w:t>Calidad y pertinencia curricular</w:t>
-            </w:r>
-          </w:p>
-          <w:p>
-            <w:pPr>
-              <w:tabs>
-                <w:tab w:pos="255" w:val="left"/>
-              </w:tabs>
-              <w:spacing w:before="0" w:after="0" w:line="240" w:lineRule="auto"/>
-              <w:ind w:left="255" w:hanging="255"/>
-              <w:jc w:val="left"/>
-            </w:pPr>
-            <w:r>
-              <w:rPr>
-                <w:rFonts w:ascii="Century Gothic" w:hAnsi="Century Gothic" w:cs="Century Gothic" w:eastAsia="Century Gothic"/>
-                <w:sz w:val="20"/>
-              </w:rPr>
-              <w:t>▪</w:t>
-              <w:tab/>
-            </w:r>
-            <w:r>
-              <w:rPr>
-                <w:rFonts w:ascii="Century Gothic" w:hAnsi="Century Gothic" w:cs="Century Gothic" w:eastAsia="Century Gothic"/>
-                <w:b w:val="0"/>
-                <w:i w:val="0"/>
-                <w:sz w:val="20"/>
-              </w:rPr>
-              <w:t>Transformación digital e innovación</w:t>
-            </w:r>
-          </w:p>
-          <w:p>
-            <w:pPr>
-              <w:tabs>
-                <w:tab w:pos="255" w:val="left"/>
-              </w:tabs>
-              <w:spacing w:before="0" w:after="0" w:line="240" w:lineRule="auto"/>
-              <w:ind w:left="255" w:hanging="255"/>
-              <w:jc w:val="left"/>
-            </w:pPr>
-            <w:r>
-              <w:rPr>
-                <w:rFonts w:ascii="Century Gothic" w:hAnsi="Century Gothic" w:cs="Century Gothic" w:eastAsia="Century Gothic"/>
-                <w:sz w:val="20"/>
-              </w:rPr>
-              <w:t>▪</w:t>
-              <w:tab/>
-            </w:r>
-            <w:r>
-              <w:rPr>
-                <w:rFonts w:ascii="Century Gothic" w:hAnsi="Century Gothic" w:cs="Century Gothic" w:eastAsia="Century Gothic"/>
-                <w:b w:val="0"/>
-                <w:i w:val="0"/>
-                <w:sz w:val="20"/>
-              </w:rPr>
-              <w:t>Internacionalización y movilidad global</w:t>
-            </w:r>
-          </w:p>
-        </w:tc>
-      </w:tr>
-      <w:tr>
-        <w:tc>
-          <w:tcPr>
-            <w:tcW w:type="dxa" w:w="2835"/>
-            <w:tcBorders>
-              <w:top w:val="single" w:sz="4" w:space="0" w:color="8EAADB"/>
-              <w:left w:val="single" w:sz="4" w:space="0" w:color="8EAADB"/>
-              <w:bottom w:val="single" w:sz="4" w:space="0" w:color="8EAADB"/>
-              <w:right w:val="single" w:sz="4" w:space="0" w:color="8EAADB"/>
-            </w:tcBorders>
-            <w:shd w:val="clear" w:color="auto" w:fill="D9E2F3"/>
-            <w:vAlign w:val="top"/>
-          </w:tcPr>
-          <w:p>
-            <w:pPr>
-              <w:spacing w:before="0" w:after="0" w:line="240" w:lineRule="auto"/>
-              <w:jc w:val="left"/>
-            </w:pPr>
-            <w:r>
-              <w:rPr>
-                <w:rFonts w:ascii="Century Gothic" w:hAnsi="Century Gothic" w:cs="Century Gothic" w:eastAsia="Century Gothic"/>
-                <w:b w:val="0"/>
-                <w:i w:val="0"/>
-                <w:sz w:val="20"/>
-                <w:highlight w:val="green"/>
-              </w:rPr>
-              <w:t>Investigación</w:t>
-            </w:r>
-          </w:p>
-        </w:tc>
-        <w:tc>
-          <w:tcPr>
-            <w:tcW w:type="dxa" w:w="6236"/>
-            <w:tcBorders>
-              <w:top w:val="single" w:sz="4" w:space="0" w:color="8EAADB"/>
-              <w:left w:val="single" w:sz="4" w:space="0" w:color="8EAADB"/>
-              <w:bottom w:val="single" w:sz="4" w:space="0" w:color="8EAADB"/>
-              <w:right w:val="single" w:sz="4" w:space="0" w:color="8EAADB"/>
-            </w:tcBorders>
-            <w:shd w:val="clear" w:color="auto" w:fill="D9E2F3"/>
-            <w:vAlign w:val="top"/>
-          </w:tcPr>
-          <w:p>
-            <w:pPr>
-              <w:tabs>
-                <w:tab w:pos="255" w:val="left"/>
-              </w:tabs>
-              <w:spacing w:before="0" w:after="0" w:line="240" w:lineRule="auto"/>
-              <w:ind w:left="255" w:hanging="255"/>
-              <w:jc w:val="left"/>
-            </w:pPr>
-            <w:r>
-              <w:rPr>
-                <w:rFonts w:ascii="Century Gothic" w:hAnsi="Century Gothic" w:cs="Century Gothic" w:eastAsia="Century Gothic"/>
-                <w:sz w:val="20"/>
-              </w:rPr>
-              <w:t>▪</w:t>
-              <w:tab/>
-            </w:r>
-            <w:r>
-              <w:rPr>
-                <w:rFonts w:ascii="Century Gothic" w:hAnsi="Century Gothic" w:cs="Century Gothic" w:eastAsia="Century Gothic"/>
-                <w:b w:val="0"/>
-                <w:i w:val="0"/>
-                <w:sz w:val="20"/>
-              </w:rPr>
-              <w:t>Investigación y pensamiento crítico</w:t>
-            </w:r>
-          </w:p>
-        </w:tc>
-      </w:tr>
-      <w:tr>
-        <w:tc>
-          <w:tcPr>
-            <w:tcW w:type="dxa" w:w="2835"/>
-            <w:tcBorders>
-              <w:top w:val="single" w:sz="4" w:space="0" w:color="8EAADB"/>
-              <w:left w:val="single" w:sz="4" w:space="0" w:color="8EAADB"/>
-              <w:bottom w:val="single" w:sz="4" w:space="0" w:color="8EAADB"/>
-              <w:right w:val="single" w:sz="4" w:space="0" w:color="8EAADB"/>
-            </w:tcBorders>
-            <w:shd w:val="clear" w:color="auto" w:fill="D9E2F3"/>
-            <w:vAlign w:val="top"/>
-          </w:tcPr>
-          <w:p>
-            <w:pPr>
-              <w:spacing w:before="0" w:after="0" w:line="240" w:lineRule="auto"/>
-              <w:jc w:val="left"/>
-            </w:pPr>
-            <w:r>
-              <w:rPr>
-                <w:rFonts w:ascii="Century Gothic" w:hAnsi="Century Gothic" w:cs="Century Gothic" w:eastAsia="Century Gothic"/>
-                <w:b w:val="0"/>
-                <w:i w:val="0"/>
-                <w:sz w:val="20"/>
-                <w:highlight w:val="green"/>
-              </w:rPr>
-              <w:t>Interacción social</w:t>
-            </w:r>
-          </w:p>
-        </w:tc>
-        <w:tc>
-          <w:tcPr>
-            <w:tcW w:type="dxa" w:w="6236"/>
-            <w:tcBorders>
-              <w:top w:val="single" w:sz="4" w:space="0" w:color="8EAADB"/>
-              <w:left w:val="single" w:sz="4" w:space="0" w:color="8EAADB"/>
-              <w:bottom w:val="single" w:sz="4" w:space="0" w:color="8EAADB"/>
-              <w:right w:val="single" w:sz="4" w:space="0" w:color="8EAADB"/>
-            </w:tcBorders>
-            <w:shd w:val="clear" w:color="auto" w:fill="D9E2F3"/>
-            <w:vAlign w:val="top"/>
-          </w:tcPr>
-          <w:p>
-            <w:pPr>
-              <w:tabs>
-                <w:tab w:pos="255" w:val="left"/>
-              </w:tabs>
-              <w:spacing w:before="0" w:after="0" w:line="240" w:lineRule="auto"/>
-              <w:ind w:left="255" w:hanging="255"/>
-              <w:jc w:val="left"/>
-            </w:pPr>
-            <w:r>
-              <w:rPr>
-                <w:rFonts w:ascii="Century Gothic" w:hAnsi="Century Gothic" w:cs="Century Gothic" w:eastAsia="Century Gothic"/>
-                <w:sz w:val="20"/>
-              </w:rPr>
-              <w:t>▪</w:t>
-              <w:tab/>
-            </w:r>
-            <w:r>
-              <w:rPr>
-                <w:rFonts w:ascii="Century Gothic" w:hAnsi="Century Gothic" w:cs="Century Gothic" w:eastAsia="Century Gothic"/>
-                <w:b w:val="0"/>
-                <w:i w:val="0"/>
-                <w:sz w:val="20"/>
-              </w:rPr>
-              <w:t>Vinculación práctica e interacción social</w:t>
-            </w:r>
-          </w:p>
-        </w:tc>
-      </w:tr>
-      <w:tr>
-        <w:tc>
-          <w:tcPr>
-            <w:tcW w:type="dxa" w:w="2835"/>
-            <w:tcBorders>
-              <w:top w:val="single" w:sz="4" w:space="0" w:color="8EAADB"/>
-              <w:left w:val="single" w:sz="4" w:space="0" w:color="8EAADB"/>
-              <w:bottom w:val="single" w:sz="4" w:space="0" w:color="8EAADB"/>
-              <w:right w:val="single" w:sz="4" w:space="0" w:color="8EAADB"/>
-            </w:tcBorders>
-            <w:shd w:val="clear" w:color="auto" w:fill="D9E2F3"/>
-            <w:vAlign w:val="top"/>
-          </w:tcPr>
-          <w:p>
-            <w:pPr>
-              <w:spacing w:before="0" w:after="0" w:line="240" w:lineRule="auto"/>
-              <w:jc w:val="left"/>
-            </w:pPr>
-            <w:r>
-              <w:rPr>
-                <w:rFonts w:ascii="Century Gothic" w:hAnsi="Century Gothic" w:cs="Century Gothic" w:eastAsia="Century Gothic"/>
-                <w:b w:val="0"/>
-                <w:i w:val="0"/>
-                <w:sz w:val="20"/>
-                <w:highlight w:val="green"/>
-              </w:rPr>
-              <w:t>Gestión institucional</w:t>
-            </w:r>
-          </w:p>
-        </w:tc>
-        <w:tc>
-          <w:tcPr>
-            <w:tcW w:type="dxa" w:w="6236"/>
-            <w:tcBorders>
-              <w:top w:val="single" w:sz="4" w:space="0" w:color="8EAADB"/>
-              <w:left w:val="single" w:sz="4" w:space="0" w:color="8EAADB"/>
-              <w:bottom w:val="single" w:sz="4" w:space="0" w:color="8EAADB"/>
-              <w:right w:val="single" w:sz="4" w:space="0" w:color="8EAADB"/>
-            </w:tcBorders>
-            <w:shd w:val="clear" w:color="auto" w:fill="D9E2F3"/>
-            <w:vAlign w:val="top"/>
-          </w:tcPr>
-          <w:p>
-            <w:pPr>
-              <w:tabs>
-                <w:tab w:pos="255" w:val="left"/>
-              </w:tabs>
-              <w:spacing w:before="0" w:after="0" w:line="240" w:lineRule="auto"/>
-              <w:ind w:left="255" w:hanging="255"/>
-              <w:jc w:val="left"/>
-            </w:pPr>
-            <w:r>
-              <w:rPr>
-                <w:rFonts w:ascii="Century Gothic" w:hAnsi="Century Gothic" w:cs="Century Gothic" w:eastAsia="Century Gothic"/>
-                <w:sz w:val="20"/>
-              </w:rPr>
-              <w:t>▪</w:t>
-              <w:tab/>
-            </w:r>
-            <w:r>
-              <w:rPr>
-                <w:rFonts w:ascii="Century Gothic" w:hAnsi="Century Gothic" w:cs="Century Gothic" w:eastAsia="Century Gothic"/>
-                <w:b w:val="0"/>
-                <w:i w:val="0"/>
-                <w:sz w:val="20"/>
-              </w:rPr>
-              <w:t>Ética, responsabilidad pública y gobernanza</w:t>
-            </w:r>
-          </w:p>
-        </w:tc>
-      </w:tr>
-    </w:tbl>
     <w:p>
       <w:pPr>
-        <w:spacing w:before="0" w:after="120" w:line="240" w:lineRule="auto"/>
-        <w:jc w:val="left"/>
+        <w:numPr>
+          <w:ilvl w:val="0"/>
+          <w:numId w:val="902"/>
+        </w:numPr>
+        <w:spacing w:before="0" w:after="160" w:line="240" w:lineRule="auto"/>
+        <w:jc w:val="both"/>
       </w:pPr>
+      <w:r>
+        <w:rPr>
+          <w:rFonts w:ascii="Century Gothic" w:hAnsi="Century Gothic" w:cs="Century Gothic" w:eastAsia="Century Gothic"/>
+          <w:b/>
+          <w:i w:val="0"/>
+          <w:sz w:val="20"/>
+        </w:rPr>
+        <w:t>Reglamento de Innovación Curricular de la UMSA,</w:t>
+      </w:r>
+      <w:r>
+        <w:rPr>
+          <w:rFonts w:ascii="Century Gothic" w:hAnsi="Century Gothic" w:cs="Century Gothic" w:eastAsia="Century Gothic"/>
+          <w:b w:val="0"/>
+          <w:i w:val="0"/>
+          <w:sz w:val="20"/>
+        </w:rPr>
+        <w:t xml:space="preserve"> aprobado por Resolución HCU N.º 032/2025, que establece los niveles de innovación curricular, los criterios de calidad y la estructura del plan de estudios, y que en su Artículo 12 exige que el plan de desarrollo de la Carrera esté alineado con el de la Universidad.</w:t>
+      </w:r>
+    </w:p>
+    <w:p>
+      <w:pPr>
+        <w:numPr>
+          <w:ilvl w:val="0"/>
+          <w:numId w:val="902"/>
+        </w:numPr>
+        <w:spacing w:before="0" w:after="160" w:line="240" w:lineRule="auto"/>
+        <w:jc w:val="both"/>
+      </w:pPr>
+      <w:r>
+        <w:rPr>
+          <w:rFonts w:ascii="Century Gothic" w:hAnsi="Century Gothic" w:cs="Century Gothic" w:eastAsia="Century Gothic"/>
+          <w:b/>
+          <w:i w:val="0"/>
+          <w:sz w:val="20"/>
+        </w:rPr>
+        <w:t>Resolución N.º 07/2024 de la VI Conferencia Nacional Ordinaria de Universidades,</w:t>
+      </w:r>
+      <w:r>
+        <w:rPr>
+          <w:rFonts w:ascii="Century Gothic" w:hAnsi="Century Gothic" w:cs="Century Gothic" w:eastAsia="Century Gothic"/>
+          <w:b w:val="0"/>
+          <w:i w:val="0"/>
+          <w:sz w:val="20"/>
+        </w:rPr>
+        <w:t xml:space="preserve"> que ratifica las conclusiones de la III-XIII Reunión Sectorial de las Carreras de Contaduría Pública y adopta el perfil del Contador Público Autorizado para el Sistema de la Universidad Boliviana.</w:t>
+      </w:r>
+    </w:p>
+    <w:p>
+      <w:pPr>
+        <w:numPr>
+          <w:ilvl w:val="0"/>
+          <w:numId w:val="902"/>
+        </w:numPr>
+        <w:spacing w:before="0" w:after="160" w:line="240" w:lineRule="auto"/>
+        <w:jc w:val="both"/>
+      </w:pPr>
+      <w:r>
+        <w:rPr>
+          <w:rFonts w:ascii="Century Gothic" w:hAnsi="Century Gothic" w:cs="Century Gothic" w:eastAsia="Century Gothic"/>
+          <w:b/>
+          <w:i w:val="0"/>
+          <w:sz w:val="20"/>
+        </w:rPr>
+        <w:t>Normas Internacionales de Educación, IES 1 a IES 8, de la Federación Internacional de Contadores,</w:t>
+      </w:r>
+      <w:r>
+        <w:rPr>
+          <w:rFonts w:ascii="Century Gothic" w:hAnsi="Century Gothic" w:cs="Century Gothic" w:eastAsia="Century Gothic"/>
+          <w:b w:val="0"/>
+          <w:i w:val="0"/>
+          <w:sz w:val="20"/>
+        </w:rPr>
+        <w:t xml:space="preserve"> que establecen las competencias técnicas, las habilidades profesionales, los valores, la ética y las actitudes que requiere el ejercicio de la profesión, así como el desarrollo profesional continuo.</w:t>
+      </w:r>
+    </w:p>
+    <w:p>
+      <w:pPr>
+        <w:numPr>
+          <w:ilvl w:val="0"/>
+          <w:numId w:val="902"/>
+        </w:numPr>
+        <w:spacing w:before="0" w:after="200" w:line="240" w:lineRule="auto"/>
+        <w:jc w:val="both"/>
+      </w:pPr>
+      <w:r>
+        <w:rPr>
+          <w:rFonts w:ascii="Century Gothic" w:hAnsi="Century Gothic" w:cs="Century Gothic" w:eastAsia="Century Gothic"/>
+          <w:b/>
+          <w:i w:val="0"/>
+          <w:sz w:val="20"/>
+          <w:highlight w:val="green"/>
+        </w:rPr>
+        <w:t>Plan Estratégico Institucional de la UMSA 2021-2025 con visión al 2030,</w:t>
+      </w:r>
+      <w:r>
+        <w:rPr>
+          <w:rFonts w:ascii="Century Gothic" w:hAnsi="Century Gothic" w:cs="Century Gothic" w:eastAsia="Century Gothic"/>
+          <w:b w:val="0"/>
+          <w:i w:val="0"/>
+          <w:sz w:val="20"/>
+          <w:highlight w:val="green"/>
+        </w:rPr>
+        <w:t xml:space="preserve"> aprobado mediante Resolución HCU N.º 355/2023, de 6 de septiembre de 2023, que organiza la acción universitaria en las áreas de formación profesional, investigación, interacción social y gestión institucional.</w:t>
+      </w:r>
     </w:p>
     <w:p>
       <w:pPr>
@@ -2072,7 +1781,3922 @@
           <w:i w:val="0"/>
           <w:sz w:val="20"/>
         </w:rPr>
-        <w:t>El plan de desarrollo específico de la Carrera, con sus metas, indicadores y plazos, será incorporado por la Dirección de Carrera una vez concluida su actualización.</w:t>
+        <w:t>Los cuatro ejes del Plan de Desarrollo de la Carrera corresponden a esas cuatro áreas del Plan Estratégico Institucional, y los seis ejes de los objetivos de la Carrera, descritos en el punto 2.4, se ejecutan a través de ellos:</w:t>
+      </w:r>
+    </w:p>
+    <w:tbl>
+      <w:tblPr>
+        <w:tblW w:type="auto" w:w="0"/>
+        <w:jc w:val="center"/>
+        <w:tblLayout w:type="fixed"/>
+        <w:tblLook w:firstColumn="1" w:firstRow="1" w:lastColumn="0" w:lastRow="0" w:noHBand="0" w:noVBand="1" w:val="04A0"/>
+      </w:tblPr>
+      <w:tblGrid>
+        <w:gridCol w:w="2154"/>
+        <w:gridCol w:w="3175"/>
+        <w:gridCol w:w="3742"/>
+      </w:tblGrid>
+      <w:tr>
+        <w:trPr>
+          <w:tblHeader/>
+        </w:trPr>
+        <w:tc>
+          <w:tcPr>
+            <w:tcW w:type="dxa" w:w="2154"/>
+            <w:tcBorders>
+              <w:top w:val="single" w:sz="4" w:space="0" w:color="4472C4"/>
+              <w:left w:val="single" w:sz="4" w:space="0" w:color="4472C4"/>
+              <w:bottom w:val="single" w:sz="4" w:space="0" w:color="4472C4"/>
+              <w:right w:val="single" w:sz="4" w:space="0" w:color="4472C4"/>
+            </w:tcBorders>
+            <w:shd w:val="clear" w:color="auto" w:fill="4472C4"/>
+            <w:vAlign w:val="center"/>
+          </w:tcPr>
+          <w:p>
+            <w:pPr>
+              <w:spacing w:before="0" w:after="0" w:line="240" w:lineRule="auto"/>
+              <w:jc w:val="center"/>
+            </w:pPr>
+            <w:r>
+              <w:rPr>
+                <w:rFonts w:ascii="Century Gothic" w:hAnsi="Century Gothic" w:cs="Century Gothic" w:eastAsia="Century Gothic"/>
+                <w:b/>
+                <w:i w:val="0"/>
+                <w:color w:val="FFFFFF"/>
+                <w:sz w:val="20"/>
+              </w:rPr>
+              <w:t>Área del PEI UMSA</w:t>
+            </w:r>
+          </w:p>
+        </w:tc>
+        <w:tc>
+          <w:tcPr>
+            <w:tcW w:type="dxa" w:w="3175"/>
+            <w:tcBorders>
+              <w:top w:val="single" w:sz="4" w:space="0" w:color="4472C4"/>
+              <w:left w:val="single" w:sz="4" w:space="0" w:color="4472C4"/>
+              <w:bottom w:val="single" w:sz="4" w:space="0" w:color="4472C4"/>
+              <w:right w:val="single" w:sz="4" w:space="0" w:color="4472C4"/>
+            </w:tcBorders>
+            <w:shd w:val="clear" w:color="auto" w:fill="4472C4"/>
+            <w:vAlign w:val="center"/>
+          </w:tcPr>
+          <w:p>
+            <w:pPr>
+              <w:spacing w:before="0" w:after="0" w:line="240" w:lineRule="auto"/>
+              <w:jc w:val="center"/>
+            </w:pPr>
+            <w:r>
+              <w:rPr>
+                <w:rFonts w:ascii="Century Gothic" w:hAnsi="Century Gothic" w:cs="Century Gothic" w:eastAsia="Century Gothic"/>
+                <w:b/>
+                <w:i w:val="0"/>
+                <w:color w:val="FFFFFF"/>
+                <w:sz w:val="20"/>
+              </w:rPr>
+              <w:t>Eje del Plan de Desarrollo de la Carrera</w:t>
+            </w:r>
+          </w:p>
+        </w:tc>
+        <w:tc>
+          <w:tcPr>
+            <w:tcW w:type="dxa" w:w="3742"/>
+            <w:tcBorders>
+              <w:top w:val="single" w:sz="4" w:space="0" w:color="4472C4"/>
+              <w:left w:val="single" w:sz="4" w:space="0" w:color="4472C4"/>
+              <w:bottom w:val="single" w:sz="4" w:space="0" w:color="4472C4"/>
+              <w:right w:val="single" w:sz="4" w:space="0" w:color="4472C4"/>
+            </w:tcBorders>
+            <w:shd w:val="clear" w:color="auto" w:fill="4472C4"/>
+            <w:vAlign w:val="center"/>
+          </w:tcPr>
+          <w:p>
+            <w:pPr>
+              <w:spacing w:before="0" w:after="0" w:line="240" w:lineRule="auto"/>
+              <w:jc w:val="center"/>
+            </w:pPr>
+            <w:r>
+              <w:rPr>
+                <w:rFonts w:ascii="Century Gothic" w:hAnsi="Century Gothic" w:cs="Century Gothic" w:eastAsia="Century Gothic"/>
+                <w:b/>
+                <w:i w:val="0"/>
+                <w:color w:val="FFFFFF"/>
+                <w:sz w:val="20"/>
+              </w:rPr>
+              <w:t>Objetivos de la Carrera relacionados</w:t>
+            </w:r>
+          </w:p>
+        </w:tc>
+      </w:tr>
+      <w:tr>
+        <w:tc>
+          <w:tcPr>
+            <w:tcW w:type="dxa" w:w="2154"/>
+            <w:tcBorders>
+              <w:top w:val="single" w:sz="4" w:space="0" w:color="8EAADB"/>
+              <w:left w:val="single" w:sz="4" w:space="0" w:color="8EAADB"/>
+              <w:bottom w:val="single" w:sz="4" w:space="0" w:color="8EAADB"/>
+              <w:right w:val="single" w:sz="4" w:space="0" w:color="8EAADB"/>
+            </w:tcBorders>
+            <w:shd w:val="clear" w:color="auto" w:fill="D9E2F3"/>
+            <w:vAlign w:val="top"/>
+          </w:tcPr>
+          <w:p>
+            <w:pPr>
+              <w:spacing w:before="0" w:after="0" w:line="240" w:lineRule="auto"/>
+              <w:jc w:val="left"/>
+            </w:pPr>
+            <w:r>
+              <w:rPr>
+                <w:rFonts w:ascii="Century Gothic" w:hAnsi="Century Gothic" w:cs="Century Gothic" w:eastAsia="Century Gothic"/>
+                <w:b w:val="0"/>
+                <w:i w:val="0"/>
+                <w:sz w:val="20"/>
+                <w:highlight w:val="green"/>
+              </w:rPr>
+              <w:t>Formación profesional</w:t>
+            </w:r>
+          </w:p>
+        </w:tc>
+        <w:tc>
+          <w:tcPr>
+            <w:tcW w:type="dxa" w:w="3175"/>
+            <w:tcBorders>
+              <w:top w:val="single" w:sz="4" w:space="0" w:color="8EAADB"/>
+              <w:left w:val="single" w:sz="4" w:space="0" w:color="8EAADB"/>
+              <w:bottom w:val="single" w:sz="4" w:space="0" w:color="8EAADB"/>
+              <w:right w:val="single" w:sz="4" w:space="0" w:color="8EAADB"/>
+            </w:tcBorders>
+            <w:shd w:val="clear" w:color="auto" w:fill="D9E2F3"/>
+            <w:vAlign w:val="top"/>
+          </w:tcPr>
+          <w:p>
+            <w:pPr>
+              <w:spacing w:before="0" w:after="0" w:line="240" w:lineRule="auto"/>
+              <w:jc w:val="left"/>
+            </w:pPr>
+            <w:r>
+              <w:rPr>
+                <w:rFonts w:ascii="Century Gothic" w:hAnsi="Century Gothic" w:cs="Century Gothic" w:eastAsia="Century Gothic"/>
+                <w:b w:val="0"/>
+                <w:i w:val="0"/>
+                <w:sz w:val="20"/>
+              </w:rPr>
+              <w:t>Eje 1. Formación profesional de grado y postgrado</w:t>
+            </w:r>
+          </w:p>
+        </w:tc>
+        <w:tc>
+          <w:tcPr>
+            <w:tcW w:type="dxa" w:w="3742"/>
+            <w:tcBorders>
+              <w:top w:val="single" w:sz="4" w:space="0" w:color="8EAADB"/>
+              <w:left w:val="single" w:sz="4" w:space="0" w:color="8EAADB"/>
+              <w:bottom w:val="single" w:sz="4" w:space="0" w:color="8EAADB"/>
+              <w:right w:val="single" w:sz="4" w:space="0" w:color="8EAADB"/>
+            </w:tcBorders>
+            <w:shd w:val="clear" w:color="auto" w:fill="D9E2F3"/>
+            <w:vAlign w:val="top"/>
+          </w:tcPr>
+          <w:p>
+            <w:pPr>
+              <w:tabs>
+                <w:tab w:pos="255" w:val="left"/>
+              </w:tabs>
+              <w:spacing w:before="0" w:after="0" w:line="240" w:lineRule="auto"/>
+              <w:ind w:left="255" w:hanging="255"/>
+              <w:jc w:val="left"/>
+            </w:pPr>
+            <w:r>
+              <w:rPr>
+                <w:rFonts w:ascii="Century Gothic" w:hAnsi="Century Gothic" w:cs="Century Gothic" w:eastAsia="Century Gothic"/>
+                <w:sz w:val="20"/>
+              </w:rPr>
+              <w:t>▪</w:t>
+              <w:tab/>
+            </w:r>
+            <w:r>
+              <w:rPr>
+                <w:rFonts w:ascii="Century Gothic" w:hAnsi="Century Gothic" w:cs="Century Gothic" w:eastAsia="Century Gothic"/>
+                <w:b w:val="0"/>
+                <w:i w:val="0"/>
+                <w:sz w:val="20"/>
+              </w:rPr>
+              <w:t>Calidad y pertinencia curricular</w:t>
+            </w:r>
+          </w:p>
+          <w:p>
+            <w:pPr>
+              <w:tabs>
+                <w:tab w:pos="255" w:val="left"/>
+              </w:tabs>
+              <w:spacing w:before="0" w:after="0" w:line="240" w:lineRule="auto"/>
+              <w:ind w:left="255" w:hanging="255"/>
+              <w:jc w:val="left"/>
+            </w:pPr>
+            <w:r>
+              <w:rPr>
+                <w:rFonts w:ascii="Century Gothic" w:hAnsi="Century Gothic" w:cs="Century Gothic" w:eastAsia="Century Gothic"/>
+                <w:sz w:val="20"/>
+              </w:rPr>
+              <w:t>▪</w:t>
+              <w:tab/>
+            </w:r>
+            <w:r>
+              <w:rPr>
+                <w:rFonts w:ascii="Century Gothic" w:hAnsi="Century Gothic" w:cs="Century Gothic" w:eastAsia="Century Gothic"/>
+                <w:b w:val="0"/>
+                <w:i w:val="0"/>
+                <w:sz w:val="20"/>
+              </w:rPr>
+              <w:t>Internacionalización y movilidad global</w:t>
+            </w:r>
+          </w:p>
+        </w:tc>
+      </w:tr>
+      <w:tr>
+        <w:tc>
+          <w:tcPr>
+            <w:tcW w:type="dxa" w:w="2154"/>
+            <w:tcBorders>
+              <w:top w:val="single" w:sz="4" w:space="0" w:color="8EAADB"/>
+              <w:left w:val="single" w:sz="4" w:space="0" w:color="8EAADB"/>
+              <w:bottom w:val="single" w:sz="4" w:space="0" w:color="8EAADB"/>
+              <w:right w:val="single" w:sz="4" w:space="0" w:color="8EAADB"/>
+            </w:tcBorders>
+            <w:shd w:val="clear" w:color="auto" w:fill="D9E2F3"/>
+            <w:vAlign w:val="top"/>
+          </w:tcPr>
+          <w:p>
+            <w:pPr>
+              <w:spacing w:before="0" w:after="0" w:line="240" w:lineRule="auto"/>
+              <w:jc w:val="left"/>
+            </w:pPr>
+            <w:r>
+              <w:rPr>
+                <w:rFonts w:ascii="Century Gothic" w:hAnsi="Century Gothic" w:cs="Century Gothic" w:eastAsia="Century Gothic"/>
+                <w:b w:val="0"/>
+                <w:i w:val="0"/>
+                <w:sz w:val="20"/>
+                <w:highlight w:val="green"/>
+              </w:rPr>
+              <w:t>Investigación</w:t>
+            </w:r>
+          </w:p>
+        </w:tc>
+        <w:tc>
+          <w:tcPr>
+            <w:tcW w:type="dxa" w:w="3175"/>
+            <w:tcBorders>
+              <w:top w:val="single" w:sz="4" w:space="0" w:color="8EAADB"/>
+              <w:left w:val="single" w:sz="4" w:space="0" w:color="8EAADB"/>
+              <w:bottom w:val="single" w:sz="4" w:space="0" w:color="8EAADB"/>
+              <w:right w:val="single" w:sz="4" w:space="0" w:color="8EAADB"/>
+            </w:tcBorders>
+            <w:shd w:val="clear" w:color="auto" w:fill="D9E2F3"/>
+            <w:vAlign w:val="top"/>
+          </w:tcPr>
+          <w:p>
+            <w:pPr>
+              <w:spacing w:before="0" w:after="0" w:line="240" w:lineRule="auto"/>
+              <w:jc w:val="left"/>
+            </w:pPr>
+            <w:r>
+              <w:rPr>
+                <w:rFonts w:ascii="Century Gothic" w:hAnsi="Century Gothic" w:cs="Century Gothic" w:eastAsia="Century Gothic"/>
+                <w:b w:val="0"/>
+                <w:i w:val="0"/>
+                <w:sz w:val="20"/>
+              </w:rPr>
+              <w:t>Eje 2. Investigación científica, tecnológica e innovación</w:t>
+            </w:r>
+          </w:p>
+        </w:tc>
+        <w:tc>
+          <w:tcPr>
+            <w:tcW w:type="dxa" w:w="3742"/>
+            <w:tcBorders>
+              <w:top w:val="single" w:sz="4" w:space="0" w:color="8EAADB"/>
+              <w:left w:val="single" w:sz="4" w:space="0" w:color="8EAADB"/>
+              <w:bottom w:val="single" w:sz="4" w:space="0" w:color="8EAADB"/>
+              <w:right w:val="single" w:sz="4" w:space="0" w:color="8EAADB"/>
+            </w:tcBorders>
+            <w:shd w:val="clear" w:color="auto" w:fill="D9E2F3"/>
+            <w:vAlign w:val="top"/>
+          </w:tcPr>
+          <w:p>
+            <w:pPr>
+              <w:tabs>
+                <w:tab w:pos="255" w:val="left"/>
+              </w:tabs>
+              <w:spacing w:before="0" w:after="0" w:line="240" w:lineRule="auto"/>
+              <w:ind w:left="255" w:hanging="255"/>
+              <w:jc w:val="left"/>
+            </w:pPr>
+            <w:r>
+              <w:rPr>
+                <w:rFonts w:ascii="Century Gothic" w:hAnsi="Century Gothic" w:cs="Century Gothic" w:eastAsia="Century Gothic"/>
+                <w:sz w:val="20"/>
+              </w:rPr>
+              <w:t>▪</w:t>
+              <w:tab/>
+            </w:r>
+            <w:r>
+              <w:rPr>
+                <w:rFonts w:ascii="Century Gothic" w:hAnsi="Century Gothic" w:cs="Century Gothic" w:eastAsia="Century Gothic"/>
+                <w:b w:val="0"/>
+                <w:i w:val="0"/>
+                <w:sz w:val="20"/>
+              </w:rPr>
+              <w:t>Investigación y pensamiento crítico</w:t>
+            </w:r>
+          </w:p>
+        </w:tc>
+      </w:tr>
+      <w:tr>
+        <w:tc>
+          <w:tcPr>
+            <w:tcW w:type="dxa" w:w="2154"/>
+            <w:tcBorders>
+              <w:top w:val="single" w:sz="4" w:space="0" w:color="8EAADB"/>
+              <w:left w:val="single" w:sz="4" w:space="0" w:color="8EAADB"/>
+              <w:bottom w:val="single" w:sz="4" w:space="0" w:color="8EAADB"/>
+              <w:right w:val="single" w:sz="4" w:space="0" w:color="8EAADB"/>
+            </w:tcBorders>
+            <w:shd w:val="clear" w:color="auto" w:fill="D9E2F3"/>
+            <w:vAlign w:val="top"/>
+          </w:tcPr>
+          <w:p>
+            <w:pPr>
+              <w:spacing w:before="0" w:after="0" w:line="240" w:lineRule="auto"/>
+              <w:jc w:val="left"/>
+            </w:pPr>
+            <w:r>
+              <w:rPr>
+                <w:rFonts w:ascii="Century Gothic" w:hAnsi="Century Gothic" w:cs="Century Gothic" w:eastAsia="Century Gothic"/>
+                <w:b w:val="0"/>
+                <w:i w:val="0"/>
+                <w:sz w:val="20"/>
+                <w:highlight w:val="green"/>
+              </w:rPr>
+              <w:t>Interacción social</w:t>
+            </w:r>
+          </w:p>
+        </w:tc>
+        <w:tc>
+          <w:tcPr>
+            <w:tcW w:type="dxa" w:w="3175"/>
+            <w:tcBorders>
+              <w:top w:val="single" w:sz="4" w:space="0" w:color="8EAADB"/>
+              <w:left w:val="single" w:sz="4" w:space="0" w:color="8EAADB"/>
+              <w:bottom w:val="single" w:sz="4" w:space="0" w:color="8EAADB"/>
+              <w:right w:val="single" w:sz="4" w:space="0" w:color="8EAADB"/>
+            </w:tcBorders>
+            <w:shd w:val="clear" w:color="auto" w:fill="D9E2F3"/>
+            <w:vAlign w:val="top"/>
+          </w:tcPr>
+          <w:p>
+            <w:pPr>
+              <w:spacing w:before="0" w:after="0" w:line="240" w:lineRule="auto"/>
+              <w:jc w:val="left"/>
+            </w:pPr>
+            <w:r>
+              <w:rPr>
+                <w:rFonts w:ascii="Century Gothic" w:hAnsi="Century Gothic" w:cs="Century Gothic" w:eastAsia="Century Gothic"/>
+                <w:b w:val="0"/>
+                <w:i w:val="0"/>
+                <w:sz w:val="20"/>
+              </w:rPr>
+              <w:t>Eje 3. Interacción social, ética e integración institucional</w:t>
+            </w:r>
+          </w:p>
+        </w:tc>
+        <w:tc>
+          <w:tcPr>
+            <w:tcW w:type="dxa" w:w="3742"/>
+            <w:tcBorders>
+              <w:top w:val="single" w:sz="4" w:space="0" w:color="8EAADB"/>
+              <w:left w:val="single" w:sz="4" w:space="0" w:color="8EAADB"/>
+              <w:bottom w:val="single" w:sz="4" w:space="0" w:color="8EAADB"/>
+              <w:right w:val="single" w:sz="4" w:space="0" w:color="8EAADB"/>
+            </w:tcBorders>
+            <w:shd w:val="clear" w:color="auto" w:fill="D9E2F3"/>
+            <w:vAlign w:val="top"/>
+          </w:tcPr>
+          <w:p>
+            <w:pPr>
+              <w:tabs>
+                <w:tab w:pos="255" w:val="left"/>
+              </w:tabs>
+              <w:spacing w:before="0" w:after="0" w:line="240" w:lineRule="auto"/>
+              <w:ind w:left="255" w:hanging="255"/>
+              <w:jc w:val="left"/>
+            </w:pPr>
+            <w:r>
+              <w:rPr>
+                <w:rFonts w:ascii="Century Gothic" w:hAnsi="Century Gothic" w:cs="Century Gothic" w:eastAsia="Century Gothic"/>
+                <w:sz w:val="20"/>
+              </w:rPr>
+              <w:t>▪</w:t>
+              <w:tab/>
+            </w:r>
+            <w:r>
+              <w:rPr>
+                <w:rFonts w:ascii="Century Gothic" w:hAnsi="Century Gothic" w:cs="Century Gothic" w:eastAsia="Century Gothic"/>
+                <w:b w:val="0"/>
+                <w:i w:val="0"/>
+                <w:sz w:val="20"/>
+              </w:rPr>
+              <w:t>Vinculación práctica e interacción social</w:t>
+            </w:r>
+          </w:p>
+          <w:p>
+            <w:pPr>
+              <w:tabs>
+                <w:tab w:pos="255" w:val="left"/>
+              </w:tabs>
+              <w:spacing w:before="0" w:after="0" w:line="240" w:lineRule="auto"/>
+              <w:ind w:left="255" w:hanging="255"/>
+              <w:jc w:val="left"/>
+            </w:pPr>
+            <w:r>
+              <w:rPr>
+                <w:rFonts w:ascii="Century Gothic" w:hAnsi="Century Gothic" w:cs="Century Gothic" w:eastAsia="Century Gothic"/>
+                <w:sz w:val="20"/>
+              </w:rPr>
+              <w:t>▪</w:t>
+              <w:tab/>
+            </w:r>
+            <w:r>
+              <w:rPr>
+                <w:rFonts w:ascii="Century Gothic" w:hAnsi="Century Gothic" w:cs="Century Gothic" w:eastAsia="Century Gothic"/>
+                <w:b w:val="0"/>
+                <w:i w:val="0"/>
+                <w:sz w:val="20"/>
+              </w:rPr>
+              <w:t>Ética, responsabilidad pública y gobernanza</w:t>
+            </w:r>
+          </w:p>
+        </w:tc>
+      </w:tr>
+      <w:tr>
+        <w:tc>
+          <w:tcPr>
+            <w:tcW w:type="dxa" w:w="2154"/>
+            <w:tcBorders>
+              <w:top w:val="single" w:sz="4" w:space="0" w:color="8EAADB"/>
+              <w:left w:val="single" w:sz="4" w:space="0" w:color="8EAADB"/>
+              <w:bottom w:val="single" w:sz="4" w:space="0" w:color="8EAADB"/>
+              <w:right w:val="single" w:sz="4" w:space="0" w:color="8EAADB"/>
+            </w:tcBorders>
+            <w:shd w:val="clear" w:color="auto" w:fill="D9E2F3"/>
+            <w:vAlign w:val="top"/>
+          </w:tcPr>
+          <w:p>
+            <w:pPr>
+              <w:spacing w:before="0" w:after="0" w:line="240" w:lineRule="auto"/>
+              <w:jc w:val="left"/>
+            </w:pPr>
+            <w:r>
+              <w:rPr>
+                <w:rFonts w:ascii="Century Gothic" w:hAnsi="Century Gothic" w:cs="Century Gothic" w:eastAsia="Century Gothic"/>
+                <w:b w:val="0"/>
+                <w:i w:val="0"/>
+                <w:sz w:val="20"/>
+                <w:highlight w:val="green"/>
+              </w:rPr>
+              <w:t>Gestión institucional</w:t>
+            </w:r>
+          </w:p>
+        </w:tc>
+        <w:tc>
+          <w:tcPr>
+            <w:tcW w:type="dxa" w:w="3175"/>
+            <w:tcBorders>
+              <w:top w:val="single" w:sz="4" w:space="0" w:color="8EAADB"/>
+              <w:left w:val="single" w:sz="4" w:space="0" w:color="8EAADB"/>
+              <w:bottom w:val="single" w:sz="4" w:space="0" w:color="8EAADB"/>
+              <w:right w:val="single" w:sz="4" w:space="0" w:color="8EAADB"/>
+            </w:tcBorders>
+            <w:shd w:val="clear" w:color="auto" w:fill="D9E2F3"/>
+            <w:vAlign w:val="top"/>
+          </w:tcPr>
+          <w:p>
+            <w:pPr>
+              <w:spacing w:before="0" w:after="0" w:line="240" w:lineRule="auto"/>
+              <w:jc w:val="left"/>
+            </w:pPr>
+            <w:r>
+              <w:rPr>
+                <w:rFonts w:ascii="Century Gothic" w:hAnsi="Century Gothic" w:cs="Century Gothic" w:eastAsia="Century Gothic"/>
+                <w:b w:val="0"/>
+                <w:i w:val="0"/>
+                <w:sz w:val="20"/>
+              </w:rPr>
+              <w:t>Eje 4. Gestión de calidad, transformación digital y acreditación</w:t>
+            </w:r>
+          </w:p>
+        </w:tc>
+        <w:tc>
+          <w:tcPr>
+            <w:tcW w:type="dxa" w:w="3742"/>
+            <w:tcBorders>
+              <w:top w:val="single" w:sz="4" w:space="0" w:color="8EAADB"/>
+              <w:left w:val="single" w:sz="4" w:space="0" w:color="8EAADB"/>
+              <w:bottom w:val="single" w:sz="4" w:space="0" w:color="8EAADB"/>
+              <w:right w:val="single" w:sz="4" w:space="0" w:color="8EAADB"/>
+            </w:tcBorders>
+            <w:shd w:val="clear" w:color="auto" w:fill="D9E2F3"/>
+            <w:vAlign w:val="top"/>
+          </w:tcPr>
+          <w:p>
+            <w:pPr>
+              <w:tabs>
+                <w:tab w:pos="255" w:val="left"/>
+              </w:tabs>
+              <w:spacing w:before="0" w:after="0" w:line="240" w:lineRule="auto"/>
+              <w:ind w:left="255" w:hanging="255"/>
+              <w:jc w:val="left"/>
+            </w:pPr>
+            <w:r>
+              <w:rPr>
+                <w:rFonts w:ascii="Century Gothic" w:hAnsi="Century Gothic" w:cs="Century Gothic" w:eastAsia="Century Gothic"/>
+                <w:sz w:val="20"/>
+              </w:rPr>
+              <w:t>▪</w:t>
+              <w:tab/>
+            </w:r>
+            <w:r>
+              <w:rPr>
+                <w:rFonts w:ascii="Century Gothic" w:hAnsi="Century Gothic" w:cs="Century Gothic" w:eastAsia="Century Gothic"/>
+                <w:b w:val="0"/>
+                <w:i w:val="0"/>
+                <w:sz w:val="20"/>
+              </w:rPr>
+              <w:t>Transformación digital e innovación</w:t>
+            </w:r>
+          </w:p>
+        </w:tc>
+      </w:tr>
+    </w:tbl>
+    <w:p>
+      <w:pPr>
+        <w:spacing w:before="0" w:after="120" w:line="240" w:lineRule="auto"/>
+        <w:jc w:val="left"/>
+      </w:pPr>
+    </w:p>
+    <w:p>
+      <w:pPr>
+        <w:keepNext/>
+        <w:tabs>
+          <w:tab w:pos="709" w:val="left"/>
+        </w:tabs>
+        <w:spacing w:before="80" w:after="200" w:line="240" w:lineRule="auto"/>
+        <w:ind w:left="709" w:hanging="709"/>
+        <w:jc w:val="left"/>
+      </w:pPr>
+      <w:r>
+        <w:rPr>
+          <w:rFonts w:ascii="Century Gothic" w:hAnsi="Century Gothic" w:cs="Century Gothic" w:eastAsia="Century Gothic"/>
+          <w:b/>
+          <w:i w:val="0"/>
+          <w:sz w:val="22"/>
+        </w:rPr>
+        <w:t>2.3.2</w:t>
+        <w:tab/>
+      </w:r>
+      <w:r>
+        <w:rPr>
+          <w:rFonts w:ascii="Century Gothic" w:hAnsi="Century Gothic" w:cs="Century Gothic" w:eastAsia="Century Gothic"/>
+          <w:b/>
+          <w:i w:val="0"/>
+          <w:sz w:val="22"/>
+        </w:rPr>
+        <w:t>Diagnóstico estratégico</w:t>
+      </w:r>
+    </w:p>
+    <w:p>
+      <w:pPr>
+        <w:spacing w:before="0" w:after="200" w:line="240" w:lineRule="auto"/>
+        <w:jc w:val="both"/>
+      </w:pPr>
+      <w:r>
+        <w:rPr>
+          <w:rFonts w:ascii="Century Gothic" w:hAnsi="Century Gothic" w:cs="Century Gothic" w:eastAsia="Century Gothic"/>
+          <w:b w:val="0"/>
+          <w:i w:val="0"/>
+          <w:sz w:val="20"/>
+        </w:rPr>
+        <w:t>El Plan parte de la evidencia recogida en el Diagnóstico de la Carrera y en los estudios de mercado laboral. Los principales hallazgos son los siguientes:</w:t>
+      </w:r>
+    </w:p>
+    <w:p>
+      <w:pPr>
+        <w:numPr>
+          <w:ilvl w:val="0"/>
+          <w:numId w:val="903"/>
+        </w:numPr>
+        <w:spacing w:before="0" w:after="160" w:line="240" w:lineRule="auto"/>
+        <w:jc w:val="both"/>
+      </w:pPr>
+      <w:r>
+        <w:rPr>
+          <w:rFonts w:ascii="Century Gothic" w:hAnsi="Century Gothic" w:cs="Century Gothic" w:eastAsia="Century Gothic"/>
+          <w:b/>
+          <w:i w:val="0"/>
+          <w:sz w:val="20"/>
+        </w:rPr>
+        <w:t>Brecha tecnológica.</w:t>
+      </w:r>
+      <w:r>
+        <w:rPr>
+          <w:rFonts w:ascii="Century Gothic" w:hAnsi="Century Gothic" w:cs="Century Gothic" w:eastAsia="Century Gothic"/>
+          <w:b w:val="0"/>
+          <w:i w:val="0"/>
+          <w:sz w:val="20"/>
+        </w:rPr>
+        <w:t xml:space="preserve"> El estudio de Ipsos CIESMORI de 2025 registra una brecha del 93 % en habilidades tecnológicas de los egresados, y el 75 % de los profesionales demanda dominio de software contable, sistemas de planificación de recursos empresariales y herramientas de análisis de datos. El Future of Jobs Report 2025 del Foro Económico Mundial ubica a la inteligencia artificial y al análisis de grandes volúmenes de datos como las competencias de mayor crecimiento.</w:t>
+      </w:r>
+    </w:p>
+    <w:p>
+      <w:pPr>
+        <w:numPr>
+          <w:ilvl w:val="0"/>
+          <w:numId w:val="903"/>
+        </w:numPr>
+        <w:spacing w:before="0" w:after="160" w:line="240" w:lineRule="auto"/>
+        <w:jc w:val="both"/>
+      </w:pPr>
+      <w:r>
+        <w:rPr>
+          <w:rFonts w:ascii="Century Gothic" w:hAnsi="Century Gothic" w:cs="Century Gothic" w:eastAsia="Century Gothic"/>
+          <w:b/>
+          <w:i w:val="0"/>
+          <w:sz w:val="20"/>
+        </w:rPr>
+        <w:t>Saturación del mercado tradicional.</w:t>
+      </w:r>
+      <w:r>
+        <w:rPr>
+          <w:rFonts w:ascii="Century Gothic" w:hAnsi="Century Gothic" w:cs="Century Gothic" w:eastAsia="Century Gothic"/>
+          <w:b w:val="0"/>
+          <w:i w:val="0"/>
+          <w:sz w:val="20"/>
+        </w:rPr>
+        <w:t xml:space="preserve"> El 46 % de los egresados percibe saturación del mercado para el perfil limitado a la auditoría financiera clásica, mientras que más del 80 % de los ingresos de las firmas líderes proviene de consultoría de gestión, gestión integral de riesgos y servicios de sostenibilidad.</w:t>
+      </w:r>
+    </w:p>
+    <w:p>
+      <w:pPr>
+        <w:numPr>
+          <w:ilvl w:val="0"/>
+          <w:numId w:val="903"/>
+        </w:numPr>
+        <w:spacing w:before="0" w:after="160" w:line="240" w:lineRule="auto"/>
+        <w:jc w:val="both"/>
+      </w:pPr>
+      <w:r>
+        <w:rPr>
+          <w:rFonts w:ascii="Century Gothic" w:hAnsi="Century Gothic" w:cs="Century Gothic" w:eastAsia="Century Gothic"/>
+          <w:b/>
+          <w:i w:val="0"/>
+          <w:sz w:val="20"/>
+        </w:rPr>
+        <w:t>Inserción laboral concentrada en niveles operativos.</w:t>
+      </w:r>
+      <w:r>
+        <w:rPr>
+          <w:rFonts w:ascii="Century Gothic" w:hAnsi="Century Gothic" w:cs="Century Gothic" w:eastAsia="Century Gothic"/>
+          <w:b w:val="0"/>
+          <w:i w:val="0"/>
+          <w:sz w:val="20"/>
+        </w:rPr>
+        <w:t xml:space="preserve"> El 52 % de los graduados trabaja en relación de dependencia, pero el 77 % de ellos se ubica en niveles técnico operativos y solo el 23 % accede a cargos gerenciales. La auditoría interna es el principal campo de inserción, con el 35 %, y el 41 % de los profesionales ejerce de forma independiente.</w:t>
+      </w:r>
+    </w:p>
+    <w:p>
+      <w:pPr>
+        <w:numPr>
+          <w:ilvl w:val="0"/>
+          <w:numId w:val="903"/>
+        </w:numPr>
+        <w:spacing w:before="0" w:after="160" w:line="240" w:lineRule="auto"/>
+        <w:jc w:val="both"/>
+      </w:pPr>
+      <w:r>
+        <w:rPr>
+          <w:rFonts w:ascii="Century Gothic" w:hAnsi="Century Gothic" w:cs="Century Gothic" w:eastAsia="Century Gothic"/>
+          <w:b/>
+          <w:i w:val="0"/>
+          <w:sz w:val="20"/>
+        </w:rPr>
+        <w:t>Formación ética.</w:t>
+      </w:r>
+      <w:r>
+        <w:rPr>
+          <w:rFonts w:ascii="Century Gothic" w:hAnsi="Century Gothic" w:cs="Century Gothic" w:eastAsia="Century Gothic"/>
+          <w:b w:val="0"/>
+          <w:i w:val="0"/>
+          <w:sz w:val="20"/>
+        </w:rPr>
+        <w:t xml:space="preserve"> El 83 % de los estudiantes percibe un descuido en la vivencia de los valores éticos en la comunidad académica y el 82 % considera prioritaria la incorporación de la asignatura de Ética Contable Aplicada, según la encuesta del Instituto de Investigaciones de Ciencias Contables, Financieras y Auditoría de 2025.</w:t>
+      </w:r>
+    </w:p>
+    <w:p>
+      <w:pPr>
+        <w:numPr>
+          <w:ilvl w:val="0"/>
+          <w:numId w:val="903"/>
+        </w:numPr>
+        <w:spacing w:before="0" w:after="160" w:line="240" w:lineRule="auto"/>
+        <w:jc w:val="both"/>
+      </w:pPr>
+      <w:r>
+        <w:rPr>
+          <w:rFonts w:ascii="Century Gothic" w:hAnsi="Century Gothic" w:cs="Century Gothic" w:eastAsia="Century Gothic"/>
+          <w:b/>
+          <w:i w:val="0"/>
+          <w:sz w:val="20"/>
+        </w:rPr>
+        <w:t>Formación práctica.</w:t>
+      </w:r>
+      <w:r>
+        <w:rPr>
+          <w:rFonts w:ascii="Century Gothic" w:hAnsi="Century Gothic" w:cs="Century Gothic" w:eastAsia="Century Gothic"/>
+          <w:b w:val="0"/>
+          <w:i w:val="0"/>
+          <w:sz w:val="20"/>
+        </w:rPr>
+        <w:t xml:space="preserve"> La falta de experiencia práctica es la segunda barrera de contratación, con el 25 %, según la encuesta del BID de 2022, y el 88 % de los estudiantes demanda pasantías preprofesionales obligatorias y aprendizaje basado en proyectos reales.</w:t>
+      </w:r>
+    </w:p>
+    <w:p>
+      <w:pPr>
+        <w:numPr>
+          <w:ilvl w:val="0"/>
+          <w:numId w:val="903"/>
+        </w:numPr>
+        <w:spacing w:before="0" w:after="200" w:line="240" w:lineRule="auto"/>
+        <w:jc w:val="both"/>
+      </w:pPr>
+      <w:r>
+        <w:rPr>
+          <w:rFonts w:ascii="Century Gothic" w:hAnsi="Century Gothic" w:cs="Century Gothic" w:eastAsia="Century Gothic"/>
+          <w:b/>
+          <w:i w:val="0"/>
+          <w:sz w:val="20"/>
+        </w:rPr>
+        <w:t>Habilidades blandas e idioma.</w:t>
+      </w:r>
+      <w:r>
+        <w:rPr>
+          <w:rFonts w:ascii="Century Gothic" w:hAnsi="Century Gothic" w:cs="Century Gothic" w:eastAsia="Century Gothic"/>
+          <w:b w:val="0"/>
+          <w:i w:val="0"/>
+          <w:sz w:val="20"/>
+        </w:rPr>
+        <w:t xml:space="preserve"> Ipsos CIESMORI identifica brechas en gestión del tiempo, del 81 %, y en pensamiento crítico, del 78 %; el BID señala la falta de habilidades blandas como la principal barrera de contratación, con el 26 %, y el 89 % de los estudiantes identifica la demanda de idiomas y tecnología como una amenaza para su inserción laboral.</w:t>
+      </w:r>
+    </w:p>
+    <w:p>
+      <w:pPr>
+        <w:spacing w:before="0" w:after="200" w:line="240" w:lineRule="auto"/>
+        <w:jc w:val="both"/>
+      </w:pPr>
+      <w:r>
+        <w:rPr>
+          <w:rFonts w:ascii="Century Gothic" w:hAnsi="Century Gothic" w:cs="Century Gothic" w:eastAsia="Century Gothic"/>
+          <w:b w:val="0"/>
+          <w:i w:val="0"/>
+          <w:sz w:val="20"/>
+        </w:rPr>
+        <w:t>A partir de estos hallazgos se construyó la siguiente matriz FODA cruzada:</w:t>
+      </w:r>
+    </w:p>
+    <w:p>
+      <w:pPr>
+        <w:keepNext/>
+        <w:spacing w:before="40" w:after="80" w:line="240" w:lineRule="auto"/>
+        <w:jc w:val="center"/>
+      </w:pPr>
+      <w:r>
+        <w:rPr>
+          <w:rFonts w:ascii="Century Gothic" w:hAnsi="Century Gothic" w:cs="Century Gothic" w:eastAsia="Century Gothic"/>
+          <w:b/>
+          <w:i w:val="0"/>
+          <w:sz w:val="20"/>
+        </w:rPr>
+        <w:t>Cuadro 1. Matriz FODA cruzada de la Carrera</w:t>
+      </w:r>
+    </w:p>
+    <w:tbl>
+      <w:tblPr>
+        <w:tblW w:type="auto" w:w="0"/>
+        <w:jc w:val="center"/>
+        <w:tblLayout w:type="fixed"/>
+        <w:tblLook w:firstColumn="1" w:firstRow="1" w:lastColumn="0" w:lastRow="0" w:noHBand="0" w:noVBand="1" w:val="04A0"/>
+      </w:tblPr>
+      <w:tblGrid>
+        <w:gridCol w:w="2608"/>
+        <w:gridCol w:w="3231"/>
+        <w:gridCol w:w="3231"/>
+      </w:tblGrid>
+      <w:tr>
+        <w:trPr>
+          <w:tblHeader/>
+        </w:trPr>
+        <w:tc>
+          <w:tcPr>
+            <w:tcW w:type="dxa" w:w="2608"/>
+            <w:tcBorders>
+              <w:top w:val="single" w:sz="4" w:space="0" w:color="4472C4"/>
+              <w:left w:val="single" w:sz="4" w:space="0" w:color="4472C4"/>
+              <w:bottom w:val="single" w:sz="4" w:space="0" w:color="4472C4"/>
+              <w:right w:val="single" w:sz="4" w:space="0" w:color="4472C4"/>
+            </w:tcBorders>
+            <w:shd w:val="clear" w:color="auto" w:fill="4472C4"/>
+            <w:vAlign w:val="center"/>
+          </w:tcPr>
+          <w:p>
+            <w:pPr>
+              <w:spacing w:before="0" w:after="0" w:line="240" w:lineRule="auto"/>
+              <w:jc w:val="center"/>
+            </w:pPr>
+          </w:p>
+        </w:tc>
+        <w:tc>
+          <w:tcPr>
+            <w:tcW w:type="dxa" w:w="3231"/>
+            <w:tcBorders>
+              <w:top w:val="single" w:sz="4" w:space="0" w:color="4472C4"/>
+              <w:left w:val="single" w:sz="4" w:space="0" w:color="4472C4"/>
+              <w:bottom w:val="single" w:sz="4" w:space="0" w:color="4472C4"/>
+              <w:right w:val="single" w:sz="4" w:space="0" w:color="4472C4"/>
+            </w:tcBorders>
+            <w:shd w:val="clear" w:color="auto" w:fill="4472C4"/>
+            <w:vAlign w:val="center"/>
+          </w:tcPr>
+          <w:p>
+            <w:pPr>
+              <w:spacing w:before="0" w:after="0" w:line="240" w:lineRule="auto"/>
+              <w:jc w:val="center"/>
+            </w:pPr>
+            <w:r>
+              <w:rPr>
+                <w:rFonts w:ascii="Century Gothic" w:hAnsi="Century Gothic" w:cs="Century Gothic" w:eastAsia="Century Gothic"/>
+                <w:b/>
+                <w:i w:val="0"/>
+                <w:color w:val="FFFFFF"/>
+                <w:sz w:val="18"/>
+              </w:rPr>
+              <w:t>Oportunidades</w:t>
+            </w:r>
+          </w:p>
+        </w:tc>
+        <w:tc>
+          <w:tcPr>
+            <w:tcW w:type="dxa" w:w="3231"/>
+            <w:tcBorders>
+              <w:top w:val="single" w:sz="4" w:space="0" w:color="4472C4"/>
+              <w:left w:val="single" w:sz="4" w:space="0" w:color="4472C4"/>
+              <w:bottom w:val="single" w:sz="4" w:space="0" w:color="4472C4"/>
+              <w:right w:val="single" w:sz="4" w:space="0" w:color="4472C4"/>
+            </w:tcBorders>
+            <w:shd w:val="clear" w:color="auto" w:fill="4472C4"/>
+            <w:vAlign w:val="center"/>
+          </w:tcPr>
+          <w:p>
+            <w:pPr>
+              <w:spacing w:before="0" w:after="0" w:line="240" w:lineRule="auto"/>
+              <w:jc w:val="center"/>
+            </w:pPr>
+            <w:r>
+              <w:rPr>
+                <w:rFonts w:ascii="Century Gothic" w:hAnsi="Century Gothic" w:cs="Century Gothic" w:eastAsia="Century Gothic"/>
+                <w:b/>
+                <w:i w:val="0"/>
+                <w:color w:val="FFFFFF"/>
+                <w:sz w:val="18"/>
+              </w:rPr>
+              <w:t>Amenazas</w:t>
+            </w:r>
+          </w:p>
+        </w:tc>
+      </w:tr>
+      <w:tr>
+        <w:tc>
+          <w:tcPr>
+            <w:tcW w:type="dxa" w:w="2608"/>
+            <w:tcBorders>
+              <w:top w:val="single" w:sz="4" w:space="0" w:color="8EAADB"/>
+              <w:left w:val="single" w:sz="4" w:space="0" w:color="8EAADB"/>
+              <w:bottom w:val="single" w:sz="4" w:space="0" w:color="8EAADB"/>
+              <w:right w:val="single" w:sz="4" w:space="0" w:color="8EAADB"/>
+            </w:tcBorders>
+            <w:shd w:val="clear" w:color="auto" w:fill="D9E2F3"/>
+            <w:vAlign w:val="top"/>
+          </w:tcPr>
+          <w:p>
+            <w:pPr>
+              <w:spacing w:before="0" w:after="0" w:line="240" w:lineRule="auto"/>
+              <w:jc w:val="left"/>
+            </w:pPr>
+            <w:r>
+              <w:rPr>
+                <w:rFonts w:ascii="Century Gothic" w:hAnsi="Century Gothic" w:cs="Century Gothic" w:eastAsia="Century Gothic"/>
+                <w:b/>
+                <w:i w:val="0"/>
+                <w:sz w:val="18"/>
+              </w:rPr>
+              <w:t>Factores externos</w:t>
+            </w:r>
+          </w:p>
+        </w:tc>
+        <w:tc>
+          <w:tcPr>
+            <w:tcW w:type="dxa" w:w="3231"/>
+            <w:tcBorders>
+              <w:top w:val="single" w:sz="4" w:space="0" w:color="8EAADB"/>
+              <w:left w:val="single" w:sz="4" w:space="0" w:color="8EAADB"/>
+              <w:bottom w:val="single" w:sz="4" w:space="0" w:color="8EAADB"/>
+              <w:right w:val="single" w:sz="4" w:space="0" w:color="8EAADB"/>
+            </w:tcBorders>
+            <w:shd w:val="clear" w:color="auto" w:fill="D9E2F3"/>
+            <w:vAlign w:val="top"/>
+          </w:tcPr>
+          <w:p>
+            <w:pPr>
+              <w:tabs>
+                <w:tab w:pos="255" w:val="left"/>
+              </w:tabs>
+              <w:spacing w:before="0" w:after="0" w:line="240" w:lineRule="auto"/>
+              <w:ind w:left="255" w:hanging="255"/>
+              <w:jc w:val="left"/>
+            </w:pPr>
+            <w:r>
+              <w:rPr>
+                <w:rFonts w:ascii="Century Gothic" w:hAnsi="Century Gothic" w:cs="Century Gothic" w:eastAsia="Century Gothic"/>
+                <w:sz w:val="18"/>
+              </w:rPr>
+              <w:t>▪</w:t>
+              <w:tab/>
+            </w:r>
+            <w:r>
+              <w:rPr>
+                <w:rFonts w:ascii="Century Gothic" w:hAnsi="Century Gothic" w:cs="Century Gothic" w:eastAsia="Century Gothic"/>
+                <w:b w:val="0"/>
+                <w:i w:val="0"/>
+                <w:sz w:val="18"/>
+              </w:rPr>
+              <w:t>Demanda de servicios de sostenibilidad bajo las NIIF S1 y S2 y de aseguramiento de información no financiera bajo la NIEA 3000 y la NIAS 5000</w:t>
+            </w:r>
+          </w:p>
+          <w:p>
+            <w:pPr>
+              <w:tabs>
+                <w:tab w:pos="255" w:val="left"/>
+              </w:tabs>
+              <w:spacing w:before="0" w:after="0" w:line="240" w:lineRule="auto"/>
+              <w:ind w:left="255" w:hanging="255"/>
+              <w:jc w:val="left"/>
+            </w:pPr>
+            <w:r>
+              <w:rPr>
+                <w:rFonts w:ascii="Century Gothic" w:hAnsi="Century Gothic" w:cs="Century Gothic" w:eastAsia="Century Gothic"/>
+                <w:sz w:val="18"/>
+              </w:rPr>
+              <w:t>▪</w:t>
+              <w:tab/>
+            </w:r>
+            <w:r>
+              <w:rPr>
+                <w:rFonts w:ascii="Century Gothic" w:hAnsi="Century Gothic" w:cs="Century Gothic" w:eastAsia="Century Gothic"/>
+                <w:b w:val="0"/>
+                <w:i w:val="0"/>
+                <w:sz w:val="18"/>
+              </w:rPr>
+              <w:t>Crecimiento de la inteligencia artificial y la analítica de datos en finanzas</w:t>
+            </w:r>
+          </w:p>
+          <w:p>
+            <w:pPr>
+              <w:tabs>
+                <w:tab w:pos="255" w:val="left"/>
+              </w:tabs>
+              <w:spacing w:before="0" w:after="0" w:line="240" w:lineRule="auto"/>
+              <w:ind w:left="255" w:hanging="255"/>
+              <w:jc w:val="left"/>
+            </w:pPr>
+            <w:r>
+              <w:rPr>
+                <w:rFonts w:ascii="Century Gothic" w:hAnsi="Century Gothic" w:cs="Century Gothic" w:eastAsia="Century Gothic"/>
+                <w:sz w:val="18"/>
+              </w:rPr>
+              <w:t>▪</w:t>
+              <w:tab/>
+            </w:r>
+            <w:r>
+              <w:rPr>
+                <w:rFonts w:ascii="Century Gothic" w:hAnsi="Century Gothic" w:cs="Century Gothic" w:eastAsia="Century Gothic"/>
+                <w:b w:val="0"/>
+                <w:i w:val="0"/>
+                <w:sz w:val="18"/>
+              </w:rPr>
+              <w:t>Demanda estudiantil del 88 % por pasantías y aprendizaje basado en proyectos</w:t>
+            </w:r>
+          </w:p>
+          <w:p>
+            <w:pPr>
+              <w:tabs>
+                <w:tab w:pos="255" w:val="left"/>
+              </w:tabs>
+              <w:spacing w:before="0" w:after="0" w:line="240" w:lineRule="auto"/>
+              <w:ind w:left="255" w:hanging="255"/>
+              <w:jc w:val="left"/>
+            </w:pPr>
+            <w:r>
+              <w:rPr>
+                <w:rFonts w:ascii="Century Gothic" w:hAnsi="Century Gothic" w:cs="Century Gothic" w:eastAsia="Century Gothic"/>
+                <w:sz w:val="18"/>
+              </w:rPr>
+              <w:t>▪</w:t>
+              <w:tab/>
+            </w:r>
+            <w:r>
+              <w:rPr>
+                <w:rFonts w:ascii="Century Gothic" w:hAnsi="Century Gothic" w:cs="Century Gothic" w:eastAsia="Century Gothic"/>
+                <w:b w:val="0"/>
+                <w:i w:val="0"/>
+                <w:sz w:val="18"/>
+              </w:rPr>
+              <w:t>Demanda estudiantil del 82 % por formación ética bajo el Código del IESBA</w:t>
+            </w:r>
+          </w:p>
+        </w:tc>
+        <w:tc>
+          <w:tcPr>
+            <w:tcW w:type="dxa" w:w="3231"/>
+            <w:tcBorders>
+              <w:top w:val="single" w:sz="4" w:space="0" w:color="8EAADB"/>
+              <w:left w:val="single" w:sz="4" w:space="0" w:color="8EAADB"/>
+              <w:bottom w:val="single" w:sz="4" w:space="0" w:color="8EAADB"/>
+              <w:right w:val="single" w:sz="4" w:space="0" w:color="8EAADB"/>
+            </w:tcBorders>
+            <w:shd w:val="clear" w:color="auto" w:fill="D9E2F3"/>
+            <w:vAlign w:val="top"/>
+          </w:tcPr>
+          <w:p>
+            <w:pPr>
+              <w:tabs>
+                <w:tab w:pos="255" w:val="left"/>
+              </w:tabs>
+              <w:spacing w:before="0" w:after="0" w:line="240" w:lineRule="auto"/>
+              <w:ind w:left="255" w:hanging="255"/>
+              <w:jc w:val="left"/>
+            </w:pPr>
+            <w:r>
+              <w:rPr>
+                <w:rFonts w:ascii="Century Gothic" w:hAnsi="Century Gothic" w:cs="Century Gothic" w:eastAsia="Century Gothic"/>
+                <w:sz w:val="18"/>
+              </w:rPr>
+              <w:t>▪</w:t>
+              <w:tab/>
+            </w:r>
+            <w:r>
+              <w:rPr>
+                <w:rFonts w:ascii="Century Gothic" w:hAnsi="Century Gothic" w:cs="Century Gothic" w:eastAsia="Century Gothic"/>
+                <w:b w:val="0"/>
+                <w:i w:val="0"/>
+                <w:sz w:val="18"/>
+              </w:rPr>
+              <w:t>Percepción de saturación del 46 % en el mercado de auditoría financiera tradicional</w:t>
+            </w:r>
+          </w:p>
+          <w:p>
+            <w:pPr>
+              <w:tabs>
+                <w:tab w:pos="255" w:val="left"/>
+              </w:tabs>
+              <w:spacing w:before="0" w:after="0" w:line="240" w:lineRule="auto"/>
+              <w:ind w:left="255" w:hanging="255"/>
+              <w:jc w:val="left"/>
+            </w:pPr>
+            <w:r>
+              <w:rPr>
+                <w:rFonts w:ascii="Century Gothic" w:hAnsi="Century Gothic" w:cs="Century Gothic" w:eastAsia="Century Gothic"/>
+                <w:sz w:val="18"/>
+              </w:rPr>
+              <w:t>▪</w:t>
+              <w:tab/>
+            </w:r>
+            <w:r>
+              <w:rPr>
+                <w:rFonts w:ascii="Century Gothic" w:hAnsi="Century Gothic" w:cs="Century Gothic" w:eastAsia="Century Gothic"/>
+                <w:b w:val="0"/>
+                <w:i w:val="0"/>
+                <w:sz w:val="18"/>
+              </w:rPr>
+              <w:t>Automatización de las tareas transaccionales</w:t>
+            </w:r>
+          </w:p>
+          <w:p>
+            <w:pPr>
+              <w:tabs>
+                <w:tab w:pos="255" w:val="left"/>
+              </w:tabs>
+              <w:spacing w:before="0" w:after="0" w:line="240" w:lineRule="auto"/>
+              <w:ind w:left="255" w:hanging="255"/>
+              <w:jc w:val="left"/>
+            </w:pPr>
+            <w:r>
+              <w:rPr>
+                <w:rFonts w:ascii="Century Gothic" w:hAnsi="Century Gothic" w:cs="Century Gothic" w:eastAsia="Century Gothic"/>
+                <w:sz w:val="18"/>
+              </w:rPr>
+              <w:t>▪</w:t>
+              <w:tab/>
+            </w:r>
+            <w:r>
+              <w:rPr>
+                <w:rFonts w:ascii="Century Gothic" w:hAnsi="Century Gothic" w:cs="Century Gothic" w:eastAsia="Century Gothic"/>
+                <w:b w:val="0"/>
+                <w:i w:val="0"/>
+                <w:sz w:val="18"/>
+              </w:rPr>
+              <w:t>Barreras de contratación por falta de experiencia, del 25 %, y de habilidades blandas, del 26 %</w:t>
+            </w:r>
+          </w:p>
+          <w:p>
+            <w:pPr>
+              <w:tabs>
+                <w:tab w:pos="255" w:val="left"/>
+              </w:tabs>
+              <w:spacing w:before="0" w:after="0" w:line="240" w:lineRule="auto"/>
+              <w:ind w:left="255" w:hanging="255"/>
+              <w:jc w:val="left"/>
+            </w:pPr>
+            <w:r>
+              <w:rPr>
+                <w:rFonts w:ascii="Century Gothic" w:hAnsi="Century Gothic" w:cs="Century Gothic" w:eastAsia="Century Gothic"/>
+                <w:sz w:val="18"/>
+              </w:rPr>
+              <w:t>▪</w:t>
+              <w:tab/>
+            </w:r>
+            <w:r>
+              <w:rPr>
+                <w:rFonts w:ascii="Century Gothic" w:hAnsi="Century Gothic" w:cs="Century Gothic" w:eastAsia="Century Gothic"/>
+                <w:b w:val="0"/>
+                <w:i w:val="0"/>
+                <w:sz w:val="18"/>
+              </w:rPr>
+              <w:t>77 % de egresados dependientes en cargos técnico operativos</w:t>
+            </w:r>
+          </w:p>
+        </w:tc>
+      </w:tr>
+      <w:tr>
+        <w:tc>
+          <w:tcPr>
+            <w:tcW w:type="dxa" w:w="2608"/>
+            <w:tcBorders>
+              <w:top w:val="single" w:sz="4" w:space="0" w:color="8EAADB"/>
+              <w:left w:val="single" w:sz="4" w:space="0" w:color="8EAADB"/>
+              <w:bottom w:val="single" w:sz="4" w:space="0" w:color="8EAADB"/>
+              <w:right w:val="single" w:sz="4" w:space="0" w:color="8EAADB"/>
+            </w:tcBorders>
+            <w:shd w:val="clear" w:color="auto" w:fill="D9E2F3"/>
+            <w:vAlign w:val="top"/>
+          </w:tcPr>
+          <w:p>
+            <w:pPr>
+              <w:spacing w:before="0" w:after="0" w:line="240" w:lineRule="auto"/>
+              <w:jc w:val="left"/>
+            </w:pPr>
+            <w:r>
+              <w:rPr>
+                <w:rFonts w:ascii="Century Gothic" w:hAnsi="Century Gothic" w:cs="Century Gothic" w:eastAsia="Century Gothic"/>
+                <w:b/>
+                <w:i w:val="0"/>
+                <w:sz w:val="18"/>
+              </w:rPr>
+              <w:t>Fortalezas</w:t>
+            </w:r>
+          </w:p>
+          <w:p>
+            <w:pPr>
+              <w:tabs>
+                <w:tab w:pos="255" w:val="left"/>
+              </w:tabs>
+              <w:spacing w:before="0" w:after="0" w:line="240" w:lineRule="auto"/>
+              <w:ind w:left="255" w:hanging="255"/>
+              <w:jc w:val="left"/>
+            </w:pPr>
+            <w:r>
+              <w:rPr>
+                <w:rFonts w:ascii="Century Gothic" w:hAnsi="Century Gothic" w:cs="Century Gothic" w:eastAsia="Century Gothic"/>
+                <w:sz w:val="18"/>
+              </w:rPr>
+              <w:t>▪</w:t>
+              <w:tab/>
+            </w:r>
+            <w:r>
+              <w:rPr>
+                <w:rFonts w:ascii="Century Gothic" w:hAnsi="Century Gothic" w:cs="Century Gothic" w:eastAsia="Century Gothic"/>
+                <w:b w:val="0"/>
+                <w:i w:val="0"/>
+                <w:sz w:val="18"/>
+              </w:rPr>
+              <w:t>Prestigio de la UMSA como referente académico nacional</w:t>
+            </w:r>
+          </w:p>
+          <w:p>
+            <w:pPr>
+              <w:tabs>
+                <w:tab w:pos="255" w:val="left"/>
+              </w:tabs>
+              <w:spacing w:before="0" w:after="0" w:line="240" w:lineRule="auto"/>
+              <w:ind w:left="255" w:hanging="255"/>
+              <w:jc w:val="left"/>
+            </w:pPr>
+            <w:r>
+              <w:rPr>
+                <w:rFonts w:ascii="Century Gothic" w:hAnsi="Century Gothic" w:cs="Century Gothic" w:eastAsia="Century Gothic"/>
+                <w:sz w:val="18"/>
+              </w:rPr>
+              <w:t>▪</w:t>
+              <w:tab/>
+            </w:r>
+            <w:r>
+              <w:rPr>
+                <w:rFonts w:ascii="Century Gothic" w:hAnsi="Century Gothic" w:cs="Century Gothic" w:eastAsia="Century Gothic"/>
+                <w:b w:val="0"/>
+                <w:i w:val="0"/>
+                <w:sz w:val="18"/>
+              </w:rPr>
+              <w:t>Marco normativo renovado: Res. HCU 032/2025 y Res. 07/2024</w:t>
+            </w:r>
+          </w:p>
+          <w:p>
+            <w:pPr>
+              <w:tabs>
+                <w:tab w:pos="255" w:val="left"/>
+              </w:tabs>
+              <w:spacing w:before="0" w:after="0" w:line="240" w:lineRule="auto"/>
+              <w:ind w:left="255" w:hanging="255"/>
+              <w:jc w:val="left"/>
+            </w:pPr>
+            <w:r>
+              <w:rPr>
+                <w:rFonts w:ascii="Century Gothic" w:hAnsi="Century Gothic" w:cs="Century Gothic" w:eastAsia="Century Gothic"/>
+                <w:sz w:val="18"/>
+              </w:rPr>
+              <w:t>▪</w:t>
+              <w:tab/>
+            </w:r>
+            <w:r>
+              <w:rPr>
+                <w:rFonts w:ascii="Century Gothic" w:hAnsi="Century Gothic" w:cs="Century Gothic" w:eastAsia="Century Gothic"/>
+                <w:b w:val="0"/>
+                <w:i w:val="0"/>
+                <w:sz w:val="18"/>
+              </w:rPr>
+              <w:t>Docentes con amplia trayectoria contable, financiera y tributaria</w:t>
+            </w:r>
+          </w:p>
+          <w:p>
+            <w:pPr>
+              <w:tabs>
+                <w:tab w:pos="255" w:val="left"/>
+              </w:tabs>
+              <w:spacing w:before="0" w:after="0" w:line="240" w:lineRule="auto"/>
+              <w:ind w:left="255" w:hanging="255"/>
+              <w:jc w:val="left"/>
+            </w:pPr>
+            <w:r>
+              <w:rPr>
+                <w:rFonts w:ascii="Century Gothic" w:hAnsi="Century Gothic" w:cs="Century Gothic" w:eastAsia="Century Gothic"/>
+                <w:sz w:val="18"/>
+              </w:rPr>
+              <w:t>▪</w:t>
+              <w:tab/>
+            </w:r>
+            <w:r>
+              <w:rPr>
+                <w:rFonts w:ascii="Century Gothic" w:hAnsi="Century Gothic" w:cs="Century Gothic" w:eastAsia="Century Gothic"/>
+                <w:b w:val="0"/>
+                <w:i w:val="0"/>
+                <w:sz w:val="18"/>
+              </w:rPr>
+              <w:t>Instituto de investigación propio</w:t>
+            </w:r>
+          </w:p>
+        </w:tc>
+        <w:tc>
+          <w:tcPr>
+            <w:tcW w:type="dxa" w:w="3231"/>
+            <w:tcBorders>
+              <w:top w:val="single" w:sz="4" w:space="0" w:color="8EAADB"/>
+              <w:left w:val="single" w:sz="4" w:space="0" w:color="8EAADB"/>
+              <w:bottom w:val="single" w:sz="4" w:space="0" w:color="8EAADB"/>
+              <w:right w:val="single" w:sz="4" w:space="0" w:color="8EAADB"/>
+            </w:tcBorders>
+            <w:shd w:val="clear" w:color="auto" w:fill="D9E2F3"/>
+            <w:vAlign w:val="top"/>
+          </w:tcPr>
+          <w:p>
+            <w:pPr>
+              <w:spacing w:before="0" w:after="0" w:line="240" w:lineRule="auto"/>
+              <w:jc w:val="left"/>
+            </w:pPr>
+            <w:r>
+              <w:rPr>
+                <w:rFonts w:ascii="Century Gothic" w:hAnsi="Century Gothic" w:cs="Century Gothic" w:eastAsia="Century Gothic"/>
+                <w:b/>
+                <w:i w:val="0"/>
+                <w:sz w:val="18"/>
+              </w:rPr>
+              <w:t>Estrategias FO</w:t>
+            </w:r>
+          </w:p>
+          <w:p>
+            <w:pPr>
+              <w:tabs>
+                <w:tab w:pos="255" w:val="left"/>
+              </w:tabs>
+              <w:spacing w:before="0" w:after="0" w:line="240" w:lineRule="auto"/>
+              <w:ind w:left="255" w:hanging="255"/>
+              <w:jc w:val="left"/>
+            </w:pPr>
+            <w:r>
+              <w:rPr>
+                <w:rFonts w:ascii="Century Gothic" w:hAnsi="Century Gothic" w:cs="Century Gothic" w:eastAsia="Century Gothic"/>
+                <w:sz w:val="18"/>
+              </w:rPr>
+              <w:t>▪</w:t>
+              <w:tab/>
+            </w:r>
+            <w:r>
+              <w:rPr>
+                <w:rFonts w:ascii="Century Gothic" w:hAnsi="Century Gothic" w:cs="Century Gothic" w:eastAsia="Century Gothic"/>
+                <w:b w:val="0"/>
+                <w:i w:val="0"/>
+                <w:sz w:val="18"/>
+              </w:rPr>
+              <w:t>Liderar la formación en inteligencia artificial, analítica de datos y reportes de sostenibilidad con el nuevo plan de estudios</w:t>
+            </w:r>
+          </w:p>
+          <w:p>
+            <w:pPr>
+              <w:tabs>
+                <w:tab w:pos="255" w:val="left"/>
+              </w:tabs>
+              <w:spacing w:before="0" w:after="0" w:line="240" w:lineRule="auto"/>
+              <w:ind w:left="255" w:hanging="255"/>
+              <w:jc w:val="left"/>
+            </w:pPr>
+            <w:r>
+              <w:rPr>
+                <w:rFonts w:ascii="Century Gothic" w:hAnsi="Century Gothic" w:cs="Century Gothic" w:eastAsia="Century Gothic"/>
+                <w:sz w:val="18"/>
+              </w:rPr>
+              <w:t>▪</w:t>
+              <w:tab/>
+            </w:r>
+            <w:r>
+              <w:rPr>
+                <w:rFonts w:ascii="Century Gothic" w:hAnsi="Century Gothic" w:cs="Century Gothic" w:eastAsia="Century Gothic"/>
+                <w:b w:val="0"/>
+                <w:i w:val="0"/>
+                <w:sz w:val="18"/>
+              </w:rPr>
+              <w:t>Implementar un programa de pasantías preprofesionales obligatorias</w:t>
+            </w:r>
+          </w:p>
+          <w:p>
+            <w:pPr>
+              <w:tabs>
+                <w:tab w:pos="255" w:val="left"/>
+              </w:tabs>
+              <w:spacing w:before="0" w:after="0" w:line="240" w:lineRule="auto"/>
+              <w:ind w:left="255" w:hanging="255"/>
+              <w:jc w:val="left"/>
+            </w:pPr>
+            <w:r>
+              <w:rPr>
+                <w:rFonts w:ascii="Century Gothic" w:hAnsi="Century Gothic" w:cs="Century Gothic" w:eastAsia="Century Gothic"/>
+                <w:sz w:val="18"/>
+              </w:rPr>
+              <w:t>▪</w:t>
+              <w:tab/>
+            </w:r>
+            <w:r>
+              <w:rPr>
+                <w:rFonts w:ascii="Century Gothic" w:hAnsi="Century Gothic" w:cs="Century Gothic" w:eastAsia="Century Gothic"/>
+                <w:b w:val="0"/>
+                <w:i w:val="0"/>
+                <w:sz w:val="18"/>
+              </w:rPr>
+              <w:t>Posicionar al Instituto en investigación sobre aseguramiento de información no financiera</w:t>
+            </w:r>
+          </w:p>
+        </w:tc>
+        <w:tc>
+          <w:tcPr>
+            <w:tcW w:type="dxa" w:w="3231"/>
+            <w:tcBorders>
+              <w:top w:val="single" w:sz="4" w:space="0" w:color="8EAADB"/>
+              <w:left w:val="single" w:sz="4" w:space="0" w:color="8EAADB"/>
+              <w:bottom w:val="single" w:sz="4" w:space="0" w:color="8EAADB"/>
+              <w:right w:val="single" w:sz="4" w:space="0" w:color="8EAADB"/>
+            </w:tcBorders>
+            <w:shd w:val="clear" w:color="auto" w:fill="D9E2F3"/>
+            <w:vAlign w:val="top"/>
+          </w:tcPr>
+          <w:p>
+            <w:pPr>
+              <w:spacing w:before="0" w:after="0" w:line="240" w:lineRule="auto"/>
+              <w:jc w:val="left"/>
+            </w:pPr>
+            <w:r>
+              <w:rPr>
+                <w:rFonts w:ascii="Century Gothic" w:hAnsi="Century Gothic" w:cs="Century Gothic" w:eastAsia="Century Gothic"/>
+                <w:b/>
+                <w:i w:val="0"/>
+                <w:sz w:val="18"/>
+              </w:rPr>
+              <w:t>Estrategias FA</w:t>
+            </w:r>
+          </w:p>
+          <w:p>
+            <w:pPr>
+              <w:tabs>
+                <w:tab w:pos="255" w:val="left"/>
+              </w:tabs>
+              <w:spacing w:before="0" w:after="0" w:line="240" w:lineRule="auto"/>
+              <w:ind w:left="255" w:hanging="255"/>
+              <w:jc w:val="left"/>
+            </w:pPr>
+            <w:r>
+              <w:rPr>
+                <w:rFonts w:ascii="Century Gothic" w:hAnsi="Century Gothic" w:cs="Century Gothic" w:eastAsia="Century Gothic"/>
+                <w:sz w:val="18"/>
+              </w:rPr>
+              <w:t>▪</w:t>
+              <w:tab/>
+            </w:r>
+            <w:r>
+              <w:rPr>
+                <w:rFonts w:ascii="Century Gothic" w:hAnsi="Century Gothic" w:cs="Century Gothic" w:eastAsia="Century Gothic"/>
+                <w:b w:val="0"/>
+                <w:i w:val="0"/>
+                <w:sz w:val="18"/>
+              </w:rPr>
+              <w:t>Diversificar el perfil hacia auditoría forense, gestión integral de riesgos y consultoría</w:t>
+            </w:r>
+          </w:p>
+          <w:p>
+            <w:pPr>
+              <w:tabs>
+                <w:tab w:pos="255" w:val="left"/>
+              </w:tabs>
+              <w:spacing w:before="0" w:after="0" w:line="240" w:lineRule="auto"/>
+              <w:ind w:left="255" w:hanging="255"/>
+              <w:jc w:val="left"/>
+            </w:pPr>
+            <w:r>
+              <w:rPr>
+                <w:rFonts w:ascii="Century Gothic" w:hAnsi="Century Gothic" w:cs="Century Gothic" w:eastAsia="Century Gothic"/>
+                <w:sz w:val="18"/>
+              </w:rPr>
+              <w:t>▪</w:t>
+              <w:tab/>
+            </w:r>
+            <w:r>
+              <w:rPr>
+                <w:rFonts w:ascii="Century Gothic" w:hAnsi="Century Gothic" w:cs="Century Gothic" w:eastAsia="Century Gothic"/>
+                <w:b w:val="0"/>
+                <w:i w:val="0"/>
+                <w:sz w:val="18"/>
+              </w:rPr>
+              <w:t>Certificar competencias de pensamiento crítico y liderazgo para superar el sesgo técnico operativo</w:t>
+            </w:r>
+          </w:p>
+          <w:p>
+            <w:pPr>
+              <w:tabs>
+                <w:tab w:pos="255" w:val="left"/>
+              </w:tabs>
+              <w:spacing w:before="0" w:after="0" w:line="240" w:lineRule="auto"/>
+              <w:ind w:left="255" w:hanging="255"/>
+              <w:jc w:val="left"/>
+            </w:pPr>
+            <w:r>
+              <w:rPr>
+                <w:rFonts w:ascii="Century Gothic" w:hAnsi="Century Gothic" w:cs="Century Gothic" w:eastAsia="Century Gothic"/>
+                <w:sz w:val="18"/>
+              </w:rPr>
+              <w:t>▪</w:t>
+              <w:tab/>
+            </w:r>
+            <w:r>
+              <w:rPr>
+                <w:rFonts w:ascii="Century Gothic" w:hAnsi="Century Gothic" w:cs="Century Gothic" w:eastAsia="Century Gothic"/>
+                <w:b w:val="0"/>
+                <w:i w:val="0"/>
+                <w:sz w:val="18"/>
+              </w:rPr>
+              <w:t>Aplicar los estándares de la IFAC y del IESBA en el ejercicio independiente</w:t>
+            </w:r>
+          </w:p>
+        </w:tc>
+      </w:tr>
+      <w:tr>
+        <w:tc>
+          <w:tcPr>
+            <w:tcW w:type="dxa" w:w="2608"/>
+            <w:tcBorders>
+              <w:top w:val="single" w:sz="4" w:space="0" w:color="8EAADB"/>
+              <w:left w:val="single" w:sz="4" w:space="0" w:color="8EAADB"/>
+              <w:bottom w:val="single" w:sz="4" w:space="0" w:color="8EAADB"/>
+              <w:right w:val="single" w:sz="4" w:space="0" w:color="8EAADB"/>
+            </w:tcBorders>
+            <w:shd w:val="clear" w:color="auto" w:fill="D9E2F3"/>
+            <w:vAlign w:val="top"/>
+          </w:tcPr>
+          <w:p>
+            <w:pPr>
+              <w:spacing w:before="0" w:after="0" w:line="240" w:lineRule="auto"/>
+              <w:jc w:val="left"/>
+            </w:pPr>
+            <w:r>
+              <w:rPr>
+                <w:rFonts w:ascii="Century Gothic" w:hAnsi="Century Gothic" w:cs="Century Gothic" w:eastAsia="Century Gothic"/>
+                <w:b/>
+                <w:i w:val="0"/>
+                <w:sz w:val="18"/>
+              </w:rPr>
+              <w:t>Debilidades</w:t>
+            </w:r>
+          </w:p>
+          <w:p>
+            <w:pPr>
+              <w:tabs>
+                <w:tab w:pos="255" w:val="left"/>
+              </w:tabs>
+              <w:spacing w:before="0" w:after="0" w:line="240" w:lineRule="auto"/>
+              <w:ind w:left="255" w:hanging="255"/>
+              <w:jc w:val="left"/>
+            </w:pPr>
+            <w:r>
+              <w:rPr>
+                <w:rFonts w:ascii="Century Gothic" w:hAnsi="Century Gothic" w:cs="Century Gothic" w:eastAsia="Century Gothic"/>
+                <w:sz w:val="18"/>
+              </w:rPr>
+              <w:t>▪</w:t>
+              <w:tab/>
+            </w:r>
+            <w:r>
+              <w:rPr>
+                <w:rFonts w:ascii="Century Gothic" w:hAnsi="Century Gothic" w:cs="Century Gothic" w:eastAsia="Century Gothic"/>
+                <w:b w:val="0"/>
+                <w:i w:val="0"/>
+                <w:sz w:val="18"/>
+              </w:rPr>
+              <w:t>Brecha tecnológica del 93 % en los egresados</w:t>
+            </w:r>
+          </w:p>
+          <w:p>
+            <w:pPr>
+              <w:tabs>
+                <w:tab w:pos="255" w:val="left"/>
+              </w:tabs>
+              <w:spacing w:before="0" w:after="0" w:line="240" w:lineRule="auto"/>
+              <w:ind w:left="255" w:hanging="255"/>
+              <w:jc w:val="left"/>
+            </w:pPr>
+            <w:r>
+              <w:rPr>
+                <w:rFonts w:ascii="Century Gothic" w:hAnsi="Century Gothic" w:cs="Century Gothic" w:eastAsia="Century Gothic"/>
+                <w:sz w:val="18"/>
+              </w:rPr>
+              <w:t>▪</w:t>
+              <w:tab/>
+            </w:r>
+            <w:r>
+              <w:rPr>
+                <w:rFonts w:ascii="Century Gothic" w:hAnsi="Century Gothic" w:cs="Century Gothic" w:eastAsia="Century Gothic"/>
+                <w:b w:val="0"/>
+                <w:i w:val="0"/>
+                <w:sz w:val="18"/>
+              </w:rPr>
+              <w:t>83 % de percepción de descuido en la vivencia de valores éticos</w:t>
+            </w:r>
+          </w:p>
+          <w:p>
+            <w:pPr>
+              <w:tabs>
+                <w:tab w:pos="255" w:val="left"/>
+              </w:tabs>
+              <w:spacing w:before="0" w:after="0" w:line="240" w:lineRule="auto"/>
+              <w:ind w:left="255" w:hanging="255"/>
+              <w:jc w:val="left"/>
+            </w:pPr>
+            <w:r>
+              <w:rPr>
+                <w:rFonts w:ascii="Century Gothic" w:hAnsi="Century Gothic" w:cs="Century Gothic" w:eastAsia="Century Gothic"/>
+                <w:sz w:val="18"/>
+              </w:rPr>
+              <w:t>▪</w:t>
+              <w:tab/>
+            </w:r>
+            <w:r>
+              <w:rPr>
+                <w:rFonts w:ascii="Century Gothic" w:hAnsi="Century Gothic" w:cs="Century Gothic" w:eastAsia="Century Gothic"/>
+                <w:b w:val="0"/>
+                <w:i w:val="0"/>
+                <w:sz w:val="18"/>
+              </w:rPr>
+              <w:t>Enseñanza memorística con limitada simulación práctica</w:t>
+            </w:r>
+          </w:p>
+          <w:p>
+            <w:pPr>
+              <w:tabs>
+                <w:tab w:pos="255" w:val="left"/>
+              </w:tabs>
+              <w:spacing w:before="0" w:after="0" w:line="240" w:lineRule="auto"/>
+              <w:ind w:left="255" w:hanging="255"/>
+              <w:jc w:val="left"/>
+            </w:pPr>
+            <w:r>
+              <w:rPr>
+                <w:rFonts w:ascii="Century Gothic" w:hAnsi="Century Gothic" w:cs="Century Gothic" w:eastAsia="Century Gothic"/>
+                <w:sz w:val="18"/>
+              </w:rPr>
+              <w:t>▪</w:t>
+              <w:tab/>
+            </w:r>
+            <w:r>
+              <w:rPr>
+                <w:rFonts w:ascii="Century Gothic" w:hAnsi="Century Gothic" w:cs="Century Gothic" w:eastAsia="Century Gothic"/>
+                <w:b w:val="0"/>
+                <w:i w:val="0"/>
+                <w:sz w:val="18"/>
+              </w:rPr>
+              <w:t>Escasa formación en inglés técnico contable</w:t>
+            </w:r>
+          </w:p>
+        </w:tc>
+        <w:tc>
+          <w:tcPr>
+            <w:tcW w:type="dxa" w:w="3231"/>
+            <w:tcBorders>
+              <w:top w:val="single" w:sz="4" w:space="0" w:color="8EAADB"/>
+              <w:left w:val="single" w:sz="4" w:space="0" w:color="8EAADB"/>
+              <w:bottom w:val="single" w:sz="4" w:space="0" w:color="8EAADB"/>
+              <w:right w:val="single" w:sz="4" w:space="0" w:color="8EAADB"/>
+            </w:tcBorders>
+            <w:shd w:val="clear" w:color="auto" w:fill="D9E2F3"/>
+            <w:vAlign w:val="top"/>
+          </w:tcPr>
+          <w:p>
+            <w:pPr>
+              <w:spacing w:before="0" w:after="0" w:line="240" w:lineRule="auto"/>
+              <w:jc w:val="left"/>
+            </w:pPr>
+            <w:r>
+              <w:rPr>
+                <w:rFonts w:ascii="Century Gothic" w:hAnsi="Century Gothic" w:cs="Century Gothic" w:eastAsia="Century Gothic"/>
+                <w:b/>
+                <w:i w:val="0"/>
+                <w:sz w:val="18"/>
+              </w:rPr>
+              <w:t>Estrategias DO</w:t>
+            </w:r>
+          </w:p>
+          <w:p>
+            <w:pPr>
+              <w:tabs>
+                <w:tab w:pos="255" w:val="left"/>
+              </w:tabs>
+              <w:spacing w:before="0" w:after="0" w:line="240" w:lineRule="auto"/>
+              <w:ind w:left="255" w:hanging="255"/>
+              <w:jc w:val="left"/>
+            </w:pPr>
+            <w:r>
+              <w:rPr>
+                <w:rFonts w:ascii="Century Gothic" w:hAnsi="Century Gothic" w:cs="Century Gothic" w:eastAsia="Century Gothic"/>
+                <w:sz w:val="18"/>
+              </w:rPr>
+              <w:t>▪</w:t>
+              <w:tab/>
+            </w:r>
+            <w:r>
+              <w:rPr>
+                <w:rFonts w:ascii="Century Gothic" w:hAnsi="Century Gothic" w:cs="Century Gothic" w:eastAsia="Century Gothic"/>
+                <w:b w:val="0"/>
+                <w:i w:val="0"/>
+                <w:sz w:val="18"/>
+              </w:rPr>
+              <w:t>Equipar los laboratorios con software de planificación de recursos empresariales y herramientas de análisis de datos</w:t>
+            </w:r>
+          </w:p>
+          <w:p>
+            <w:pPr>
+              <w:tabs>
+                <w:tab w:pos="255" w:val="left"/>
+              </w:tabs>
+              <w:spacing w:before="0" w:after="0" w:line="240" w:lineRule="auto"/>
+              <w:ind w:left="255" w:hanging="255"/>
+              <w:jc w:val="left"/>
+            </w:pPr>
+            <w:r>
+              <w:rPr>
+                <w:rFonts w:ascii="Century Gothic" w:hAnsi="Century Gothic" w:cs="Century Gothic" w:eastAsia="Century Gothic"/>
+                <w:sz w:val="18"/>
+              </w:rPr>
+              <w:t>▪</w:t>
+              <w:tab/>
+            </w:r>
+            <w:r>
+              <w:rPr>
+                <w:rFonts w:ascii="Century Gothic" w:hAnsi="Century Gothic" w:cs="Century Gothic" w:eastAsia="Century Gothic"/>
+                <w:b w:val="0"/>
+                <w:i w:val="0"/>
+                <w:sz w:val="18"/>
+              </w:rPr>
+              <w:t>Aplicar el aprendizaje basado en proyectos en la enseñanza</w:t>
+            </w:r>
+          </w:p>
+          <w:p>
+            <w:pPr>
+              <w:tabs>
+                <w:tab w:pos="255" w:val="left"/>
+              </w:tabs>
+              <w:spacing w:before="0" w:after="0" w:line="240" w:lineRule="auto"/>
+              <w:ind w:left="255" w:hanging="255"/>
+              <w:jc w:val="left"/>
+            </w:pPr>
+            <w:r>
+              <w:rPr>
+                <w:rFonts w:ascii="Century Gothic" w:hAnsi="Century Gothic" w:cs="Century Gothic" w:eastAsia="Century Gothic"/>
+                <w:sz w:val="18"/>
+              </w:rPr>
+              <w:t>▪</w:t>
+              <w:tab/>
+            </w:r>
+            <w:r>
+              <w:rPr>
+                <w:rFonts w:ascii="Century Gothic" w:hAnsi="Century Gothic" w:cs="Century Gothic" w:eastAsia="Century Gothic"/>
+                <w:b w:val="0"/>
+                <w:i w:val="0"/>
+                <w:sz w:val="18"/>
+              </w:rPr>
+              <w:t>Incorporar la asignatura de Ética Contable Aplicada bajo el Código del IESBA</w:t>
+            </w:r>
+          </w:p>
+        </w:tc>
+        <w:tc>
+          <w:tcPr>
+            <w:tcW w:type="dxa" w:w="3231"/>
+            <w:tcBorders>
+              <w:top w:val="single" w:sz="4" w:space="0" w:color="8EAADB"/>
+              <w:left w:val="single" w:sz="4" w:space="0" w:color="8EAADB"/>
+              <w:bottom w:val="single" w:sz="4" w:space="0" w:color="8EAADB"/>
+              <w:right w:val="single" w:sz="4" w:space="0" w:color="8EAADB"/>
+            </w:tcBorders>
+            <w:shd w:val="clear" w:color="auto" w:fill="D9E2F3"/>
+            <w:vAlign w:val="top"/>
+          </w:tcPr>
+          <w:p>
+            <w:pPr>
+              <w:spacing w:before="0" w:after="0" w:line="240" w:lineRule="auto"/>
+              <w:jc w:val="left"/>
+            </w:pPr>
+            <w:r>
+              <w:rPr>
+                <w:rFonts w:ascii="Century Gothic" w:hAnsi="Century Gothic" w:cs="Century Gothic" w:eastAsia="Century Gothic"/>
+                <w:b/>
+                <w:i w:val="0"/>
+                <w:sz w:val="18"/>
+              </w:rPr>
+              <w:t>Estrategias DA</w:t>
+            </w:r>
+          </w:p>
+          <w:p>
+            <w:pPr>
+              <w:tabs>
+                <w:tab w:pos="255" w:val="left"/>
+              </w:tabs>
+              <w:spacing w:before="0" w:after="0" w:line="240" w:lineRule="auto"/>
+              <w:ind w:left="255" w:hanging="255"/>
+              <w:jc w:val="left"/>
+            </w:pPr>
+            <w:r>
+              <w:rPr>
+                <w:rFonts w:ascii="Century Gothic" w:hAnsi="Century Gothic" w:cs="Century Gothic" w:eastAsia="Century Gothic"/>
+                <w:sz w:val="18"/>
+              </w:rPr>
+              <w:t>▪</w:t>
+              <w:tab/>
+            </w:r>
+            <w:r>
+              <w:rPr>
+                <w:rFonts w:ascii="Century Gothic" w:hAnsi="Century Gothic" w:cs="Century Gothic" w:eastAsia="Century Gothic"/>
+                <w:b w:val="0"/>
+                <w:i w:val="0"/>
+                <w:sz w:val="18"/>
+              </w:rPr>
+              <w:t>Reemplazar la evaluación memorística por evaluación auténtica con portafolios y simuladores</w:t>
+            </w:r>
+          </w:p>
+          <w:p>
+            <w:pPr>
+              <w:tabs>
+                <w:tab w:pos="255" w:val="left"/>
+              </w:tabs>
+              <w:spacing w:before="0" w:after="0" w:line="240" w:lineRule="auto"/>
+              <w:ind w:left="255" w:hanging="255"/>
+              <w:jc w:val="left"/>
+            </w:pPr>
+            <w:r>
+              <w:rPr>
+                <w:rFonts w:ascii="Century Gothic" w:hAnsi="Century Gothic" w:cs="Century Gothic" w:eastAsia="Century Gothic"/>
+                <w:sz w:val="18"/>
+              </w:rPr>
+              <w:t>▪</w:t>
+              <w:tab/>
+            </w:r>
+            <w:r>
+              <w:rPr>
+                <w:rFonts w:ascii="Century Gothic" w:hAnsi="Century Gothic" w:cs="Century Gothic" w:eastAsia="Century Gothic"/>
+                <w:b w:val="0"/>
+                <w:i w:val="0"/>
+                <w:sz w:val="18"/>
+              </w:rPr>
+              <w:t>Incorporar el inglés técnico contable de forma transversal</w:t>
+            </w:r>
+          </w:p>
+          <w:p>
+            <w:pPr>
+              <w:tabs>
+                <w:tab w:pos="255" w:val="left"/>
+              </w:tabs>
+              <w:spacing w:before="0" w:after="0" w:line="240" w:lineRule="auto"/>
+              <w:ind w:left="255" w:hanging="255"/>
+              <w:jc w:val="left"/>
+            </w:pPr>
+            <w:r>
+              <w:rPr>
+                <w:rFonts w:ascii="Century Gothic" w:hAnsi="Century Gothic" w:cs="Century Gothic" w:eastAsia="Century Gothic"/>
+                <w:sz w:val="18"/>
+              </w:rPr>
+              <w:t>▪</w:t>
+              <w:tab/>
+            </w:r>
+            <w:r>
+              <w:rPr>
+                <w:rFonts w:ascii="Century Gothic" w:hAnsi="Century Gothic" w:cs="Century Gothic" w:eastAsia="Century Gothic"/>
+                <w:b w:val="0"/>
+                <w:i w:val="0"/>
+                <w:sz w:val="18"/>
+              </w:rPr>
+              <w:t>Ejecutar un plan de actualización docente en tecnologías de la información e inteligencia artificial</w:t>
+            </w:r>
+          </w:p>
+        </w:tc>
+      </w:tr>
+    </w:tbl>
+    <w:p>
+      <w:pPr>
+        <w:spacing w:before="40" w:after="200" w:line="240" w:lineRule="auto"/>
+        <w:jc w:val="left"/>
+      </w:pPr>
+      <w:r>
+        <w:rPr>
+          <w:rFonts w:ascii="Century Gothic" w:hAnsi="Century Gothic" w:cs="Century Gothic" w:eastAsia="Century Gothic"/>
+          <w:b w:val="0"/>
+          <w:i w:val="0"/>
+          <w:sz w:val="16"/>
+        </w:rPr>
+        <w:t>Fuente: Plan Estratégico de Desarrollo Institucional 2026-2030 de la Carrera de Contaduría Pública.</w:t>
+      </w:r>
+    </w:p>
+    <w:p>
+      <w:pPr>
+        <w:keepNext/>
+        <w:tabs>
+          <w:tab w:pos="709" w:val="left"/>
+        </w:tabs>
+        <w:spacing w:before="80" w:after="200" w:line="240" w:lineRule="auto"/>
+        <w:ind w:left="709" w:hanging="709"/>
+        <w:jc w:val="left"/>
+      </w:pPr>
+      <w:r>
+        <w:rPr>
+          <w:rFonts w:ascii="Century Gothic" w:hAnsi="Century Gothic" w:cs="Century Gothic" w:eastAsia="Century Gothic"/>
+          <w:b/>
+          <w:i w:val="0"/>
+          <w:sz w:val="22"/>
+        </w:rPr>
+        <w:t>2.3.3</w:t>
+        <w:tab/>
+      </w:r>
+      <w:r>
+        <w:rPr>
+          <w:rFonts w:ascii="Century Gothic" w:hAnsi="Century Gothic" w:cs="Century Gothic" w:eastAsia="Century Gothic"/>
+          <w:b/>
+          <w:i w:val="0"/>
+          <w:sz w:val="22"/>
+        </w:rPr>
+        <w:t>Ejes estratégicos y programas 2026-2030</w:t>
+      </w:r>
+    </w:p>
+    <w:p>
+      <w:pPr>
+        <w:keepNext/>
+        <w:spacing w:before="40" w:after="200" w:line="240" w:lineRule="auto"/>
+        <w:jc w:val="left"/>
+      </w:pPr>
+      <w:r>
+        <w:rPr>
+          <w:rFonts w:ascii="Century Gothic" w:hAnsi="Century Gothic" w:cs="Century Gothic" w:eastAsia="Century Gothic"/>
+          <w:b/>
+          <w:i w:val="0"/>
+          <w:sz w:val="22"/>
+        </w:rPr>
+        <w:t>Eje 1. Formación profesional de grado y postgrado</w:t>
+      </w:r>
+    </w:p>
+    <w:p>
+      <w:pPr>
+        <w:spacing w:before="0" w:after="200" w:line="240" w:lineRule="auto"/>
+        <w:jc w:val="both"/>
+      </w:pPr>
+      <w:r>
+        <w:rPr>
+          <w:rFonts w:ascii="Century Gothic" w:hAnsi="Century Gothic" w:cs="Century Gothic" w:eastAsia="Century Gothic"/>
+          <w:b w:val="0"/>
+          <w:i w:val="0"/>
+          <w:sz w:val="20"/>
+        </w:rPr>
+        <w:t>Este eje pone en marcha el nuevo plan de estudios, con 43 asignaturas distribuidas en cinco años y 6.000 horas académicas. El plan prevé la titulación intermedia de Contador General al concluir el tercer año y aprobar un examen de grado, la enseñanza transversal del inglés técnico contable en los últimos años y la articulación entre el grado y el postgrado mediante el diplomado como modalidad de graduación. Sus acciones prioritarias son:</w:t>
+      </w:r>
+    </w:p>
+    <w:p>
+      <w:pPr>
+        <w:numPr>
+          <w:ilvl w:val="0"/>
+          <w:numId w:val="904"/>
+        </w:numPr>
+        <w:spacing w:before="0" w:after="160" w:line="240" w:lineRule="auto"/>
+        <w:jc w:val="both"/>
+      </w:pPr>
+      <w:r>
+        <w:rPr>
+          <w:rFonts w:ascii="Century Gothic" w:hAnsi="Century Gothic" w:cs="Century Gothic" w:eastAsia="Century Gothic"/>
+          <w:b w:val="0"/>
+          <w:i w:val="0"/>
+          <w:sz w:val="20"/>
+        </w:rPr>
+        <w:t>Implementación de las nuevas asignaturas especializadas, como Ética e Independencia Profesional, Gabinete de Auditoría de Sistemas, Auditoría Ambiental y Aseguramiento de Sostenibilidad, y Auditoría Forense y Servicios Relacionados.</w:t>
+      </w:r>
+    </w:p>
+    <w:p>
+      <w:pPr>
+        <w:numPr>
+          <w:ilvl w:val="0"/>
+          <w:numId w:val="904"/>
+        </w:numPr>
+        <w:spacing w:before="0" w:after="160" w:line="240" w:lineRule="auto"/>
+        <w:jc w:val="both"/>
+      </w:pPr>
+      <w:r>
+        <w:rPr>
+          <w:rFonts w:ascii="Century Gothic" w:hAnsi="Century Gothic" w:cs="Century Gothic" w:eastAsia="Century Gothic"/>
+          <w:b w:val="0"/>
+          <w:i w:val="0"/>
+          <w:sz w:val="20"/>
+        </w:rPr>
+        <w:t>Reglamentación de los exámenes de grado para la titulación intermedia de Contador General.</w:t>
+      </w:r>
+    </w:p>
+    <w:p>
+      <w:pPr>
+        <w:numPr>
+          <w:ilvl w:val="0"/>
+          <w:numId w:val="904"/>
+        </w:numPr>
+        <w:spacing w:before="0" w:after="160" w:line="240" w:lineRule="auto"/>
+        <w:jc w:val="both"/>
+      </w:pPr>
+      <w:r>
+        <w:rPr>
+          <w:rFonts w:ascii="Century Gothic" w:hAnsi="Century Gothic" w:cs="Century Gothic" w:eastAsia="Century Gothic"/>
+          <w:b w:val="0"/>
+          <w:i w:val="0"/>
+          <w:sz w:val="20"/>
+        </w:rPr>
+        <w:t>Inclusión progresiva de bibliografía, casos de estudio y guías en inglés en los programas de las asignaturas.</w:t>
+      </w:r>
+    </w:p>
+    <w:p>
+      <w:pPr>
+        <w:numPr>
+          <w:ilvl w:val="0"/>
+          <w:numId w:val="904"/>
+        </w:numPr>
+        <w:spacing w:before="0" w:after="200" w:line="240" w:lineRule="auto"/>
+        <w:jc w:val="both"/>
+      </w:pPr>
+      <w:r>
+        <w:rPr>
+          <w:rFonts w:ascii="Century Gothic" w:hAnsi="Century Gothic" w:cs="Century Gothic" w:eastAsia="Century Gothic"/>
+          <w:b w:val="0"/>
+          <w:i w:val="0"/>
+          <w:sz w:val="20"/>
+        </w:rPr>
+        <w:t>Implementación de diplomados de titulación en Tributación Internacional, Auditoría Digital y Gestión Integral de Riesgos.</w:t>
+      </w:r>
+    </w:p>
+    <w:p>
+      <w:pPr>
+        <w:keepNext/>
+        <w:spacing w:before="40" w:after="200" w:line="240" w:lineRule="auto"/>
+        <w:jc w:val="left"/>
+      </w:pPr>
+      <w:r>
+        <w:rPr>
+          <w:rFonts w:ascii="Century Gothic" w:hAnsi="Century Gothic" w:cs="Century Gothic" w:eastAsia="Century Gothic"/>
+          <w:b/>
+          <w:i w:val="0"/>
+          <w:sz w:val="22"/>
+        </w:rPr>
+        <w:t>Eje 2. Investigación científica, tecnológica e innovación</w:t>
+      </w:r>
+    </w:p>
+    <w:p>
+      <w:pPr>
+        <w:spacing w:before="0" w:after="200" w:line="240" w:lineRule="auto"/>
+        <w:jc w:val="both"/>
+      </w:pPr>
+      <w:r>
+        <w:rPr>
+          <w:rFonts w:ascii="Century Gothic" w:hAnsi="Century Gothic" w:cs="Century Gothic" w:eastAsia="Century Gothic"/>
+          <w:b w:val="0"/>
+          <w:i w:val="0"/>
+          <w:sz w:val="20"/>
+        </w:rPr>
+        <w:t>Este eje fortalece la investigación aplicada del Instituto de Investigaciones de Ciencias Contables, Financieras y Auditoría en cuatro líneas prioritarias: auditoría digital y gobernanza de datos; reportes de sostenibilidad y aseguramiento de información no financiera; auditoría forense y prevención de delitos económicos; y fiscalidad internacional y precios de transferencia. Los resultados se traducirán en documentos de política pública dirigidos al Servicio de Impuestos Nacionales, la Contraloría General del Estado y el Colegio de Auditores o Contadores Públicos de Bolivia.</w:t>
+      </w:r>
+    </w:p>
+    <w:p>
+      <w:pPr>
+        <w:keepNext/>
+        <w:spacing w:before="40" w:after="200" w:line="240" w:lineRule="auto"/>
+        <w:jc w:val="left"/>
+      </w:pPr>
+      <w:r>
+        <w:rPr>
+          <w:rFonts w:ascii="Century Gothic" w:hAnsi="Century Gothic" w:cs="Century Gothic" w:eastAsia="Century Gothic"/>
+          <w:b/>
+          <w:i w:val="0"/>
+          <w:sz w:val="22"/>
+        </w:rPr>
+        <w:t>Eje 3. Interacción social, ética e integración institucional</w:t>
+      </w:r>
+    </w:p>
+    <w:p>
+      <w:pPr>
+        <w:spacing w:before="0" w:after="200" w:line="240" w:lineRule="auto"/>
+        <w:jc w:val="both"/>
+      </w:pPr>
+      <w:r>
+        <w:rPr>
+          <w:rFonts w:ascii="Century Gothic" w:hAnsi="Century Gothic" w:cs="Century Gothic" w:eastAsia="Century Gothic"/>
+          <w:b w:val="0"/>
+          <w:i w:val="0"/>
+          <w:sz w:val="20"/>
+        </w:rPr>
+        <w:t>Este eje vincula a la comunidad universitaria con su entorno mediante tres programas: la adopción del Código Internacional de Ética del IESBA en las actividades académicas, de investigación y de interacción social; las pasantías preprofesionales obligatorias desde el tercer año, mediante convenios con firmas de auditoría, el Servicio de Impuestos Nacionales, la Contraloría General del Estado y empresas del sector productivo; y la consultoría social contable, con gabinetes de docentes y estudiantes que brinden asesoría gratuita en contabilidad, tributación y educación financiera a pequeñas y medianas empresas, asociaciones comunitarias y emprendimientos.</w:t>
+      </w:r>
+    </w:p>
+    <w:p>
+      <w:pPr>
+        <w:keepNext/>
+        <w:spacing w:before="40" w:after="200" w:line="240" w:lineRule="auto"/>
+        <w:jc w:val="left"/>
+      </w:pPr>
+      <w:r>
+        <w:rPr>
+          <w:rFonts w:ascii="Century Gothic" w:hAnsi="Century Gothic" w:cs="Century Gothic" w:eastAsia="Century Gothic"/>
+          <w:b/>
+          <w:i w:val="0"/>
+          <w:sz w:val="22"/>
+        </w:rPr>
+        <w:t>Eje 4. Gestión de calidad, transformación digital y acreditación</w:t>
+      </w:r>
+    </w:p>
+    <w:p>
+      <w:pPr>
+        <w:spacing w:before="0" w:after="200" w:line="240" w:lineRule="auto"/>
+        <w:jc w:val="both"/>
+      </w:pPr>
+      <w:r>
+        <w:rPr>
+          <w:rFonts w:ascii="Century Gothic" w:hAnsi="Century Gothic" w:cs="Century Gothic" w:eastAsia="Century Gothic"/>
+          <w:b w:val="0"/>
+          <w:i w:val="0"/>
+          <w:sz w:val="20"/>
+        </w:rPr>
+        <w:t>Este eje comprende el equipamiento de los laboratorios de cómputo con software de planificación de recursos empresariales, herramientas de inteligencia de negocios y lenguajes de programación aplicados a las finanzas; la actualización docente en tecnologías de la información, inteligencia artificial y evaluación por competencias, conforme a la Resolución HCU N.º 032/2025; y el proceso de autoevaluación para la reacreditación ante el Comité Ejecutivo de la Universidad Boliviana y la acreditación internacional en el sistema ARCU-SUR.</w:t>
+      </w:r>
+    </w:p>
+    <w:p>
+      <w:pPr>
+        <w:keepNext/>
+        <w:tabs>
+          <w:tab w:pos="709" w:val="left"/>
+        </w:tabs>
+        <w:spacing w:before="80" w:after="200" w:line="240" w:lineRule="auto"/>
+        <w:ind w:left="709" w:hanging="709"/>
+        <w:jc w:val="left"/>
+      </w:pPr>
+      <w:r>
+        <w:rPr>
+          <w:rFonts w:ascii="Century Gothic" w:hAnsi="Century Gothic" w:cs="Century Gothic" w:eastAsia="Century Gothic"/>
+          <w:b/>
+          <w:i w:val="0"/>
+          <w:sz w:val="22"/>
+        </w:rPr>
+        <w:t>2.3.4</w:t>
+        <w:tab/>
+      </w:r>
+      <w:r>
+        <w:rPr>
+          <w:rFonts w:ascii="Century Gothic" w:hAnsi="Century Gothic" w:cs="Century Gothic" w:eastAsia="Century Gothic"/>
+          <w:b/>
+          <w:i w:val="0"/>
+          <w:sz w:val="22"/>
+        </w:rPr>
+        <w:t>Indicadores y metas 2026-2030</w:t>
+      </w:r>
+    </w:p>
+    <w:p>
+      <w:pPr>
+        <w:keepNext/>
+        <w:spacing w:before="40" w:after="80" w:line="240" w:lineRule="auto"/>
+        <w:jc w:val="center"/>
+      </w:pPr>
+      <w:r>
+        <w:rPr>
+          <w:rFonts w:ascii="Century Gothic" w:hAnsi="Century Gothic" w:cs="Century Gothic" w:eastAsia="Century Gothic"/>
+          <w:b/>
+          <w:i w:val="0"/>
+          <w:sz w:val="20"/>
+        </w:rPr>
+        <w:t>Cuadro 2. Matriz de indicadores y metas del Plan de Desarrollo</w:t>
+      </w:r>
+    </w:p>
+    <w:tbl>
+      <w:tblPr>
+        <w:tblW w:type="auto" w:w="0"/>
+        <w:jc w:val="center"/>
+        <w:tblLayout w:type="fixed"/>
+        <w:tblLook w:firstColumn="1" w:firstRow="1" w:lastColumn="0" w:lastRow="0" w:noHBand="0" w:noVBand="1" w:val="04A0"/>
+      </w:tblPr>
+      <w:tblGrid>
+        <w:gridCol w:w="794"/>
+        <w:gridCol w:w="1587"/>
+        <w:gridCol w:w="2041"/>
+        <w:gridCol w:w="1474"/>
+        <w:gridCol w:w="1814"/>
+        <w:gridCol w:w="1361"/>
+      </w:tblGrid>
+      <w:tr>
+        <w:trPr>
+          <w:tblHeader/>
+        </w:trPr>
+        <w:tc>
+          <w:tcPr>
+            <w:tcW w:type="dxa" w:w="794"/>
+            <w:tcBorders>
+              <w:top w:val="single" w:sz="4" w:space="0" w:color="4472C4"/>
+              <w:left w:val="single" w:sz="4" w:space="0" w:color="4472C4"/>
+              <w:bottom w:val="single" w:sz="4" w:space="0" w:color="4472C4"/>
+              <w:right w:val="single" w:sz="4" w:space="0" w:color="4472C4"/>
+            </w:tcBorders>
+            <w:shd w:val="clear" w:color="auto" w:fill="4472C4"/>
+            <w:vAlign w:val="center"/>
+          </w:tcPr>
+          <w:p>
+            <w:pPr>
+              <w:spacing w:before="0" w:after="0" w:line="240" w:lineRule="auto"/>
+              <w:jc w:val="center"/>
+            </w:pPr>
+            <w:r>
+              <w:rPr>
+                <w:rFonts w:ascii="Century Gothic" w:hAnsi="Century Gothic" w:cs="Century Gothic" w:eastAsia="Century Gothic"/>
+                <w:b/>
+                <w:i w:val="0"/>
+                <w:color w:val="FFFFFF"/>
+                <w:sz w:val="16"/>
+              </w:rPr>
+              <w:t>Eje</w:t>
+            </w:r>
+          </w:p>
+        </w:tc>
+        <w:tc>
+          <w:tcPr>
+            <w:tcW w:type="dxa" w:w="1587"/>
+            <w:tcBorders>
+              <w:top w:val="single" w:sz="4" w:space="0" w:color="4472C4"/>
+              <w:left w:val="single" w:sz="4" w:space="0" w:color="4472C4"/>
+              <w:bottom w:val="single" w:sz="4" w:space="0" w:color="4472C4"/>
+              <w:right w:val="single" w:sz="4" w:space="0" w:color="4472C4"/>
+            </w:tcBorders>
+            <w:shd w:val="clear" w:color="auto" w:fill="4472C4"/>
+            <w:vAlign w:val="center"/>
+          </w:tcPr>
+          <w:p>
+            <w:pPr>
+              <w:spacing w:before="0" w:after="0" w:line="240" w:lineRule="auto"/>
+              <w:jc w:val="center"/>
+            </w:pPr>
+            <w:r>
+              <w:rPr>
+                <w:rFonts w:ascii="Century Gothic" w:hAnsi="Century Gothic" w:cs="Century Gothic" w:eastAsia="Century Gothic"/>
+                <w:b/>
+                <w:i w:val="0"/>
+                <w:color w:val="FFFFFF"/>
+                <w:sz w:val="16"/>
+              </w:rPr>
+              <w:t>Programa</w:t>
+            </w:r>
+          </w:p>
+        </w:tc>
+        <w:tc>
+          <w:tcPr>
+            <w:tcW w:type="dxa" w:w="2041"/>
+            <w:tcBorders>
+              <w:top w:val="single" w:sz="4" w:space="0" w:color="4472C4"/>
+              <w:left w:val="single" w:sz="4" w:space="0" w:color="4472C4"/>
+              <w:bottom w:val="single" w:sz="4" w:space="0" w:color="4472C4"/>
+              <w:right w:val="single" w:sz="4" w:space="0" w:color="4472C4"/>
+            </w:tcBorders>
+            <w:shd w:val="clear" w:color="auto" w:fill="4472C4"/>
+            <w:vAlign w:val="center"/>
+          </w:tcPr>
+          <w:p>
+            <w:pPr>
+              <w:spacing w:before="0" w:after="0" w:line="240" w:lineRule="auto"/>
+              <w:jc w:val="center"/>
+            </w:pPr>
+            <w:r>
+              <w:rPr>
+                <w:rFonts w:ascii="Century Gothic" w:hAnsi="Century Gothic" w:cs="Century Gothic" w:eastAsia="Century Gothic"/>
+                <w:b/>
+                <w:i w:val="0"/>
+                <w:color w:val="FFFFFF"/>
+                <w:sz w:val="16"/>
+              </w:rPr>
+              <w:t>Indicador</w:t>
+            </w:r>
+          </w:p>
+        </w:tc>
+        <w:tc>
+          <w:tcPr>
+            <w:tcW w:type="dxa" w:w="1474"/>
+            <w:tcBorders>
+              <w:top w:val="single" w:sz="4" w:space="0" w:color="4472C4"/>
+              <w:left w:val="single" w:sz="4" w:space="0" w:color="4472C4"/>
+              <w:bottom w:val="single" w:sz="4" w:space="0" w:color="4472C4"/>
+              <w:right w:val="single" w:sz="4" w:space="0" w:color="4472C4"/>
+            </w:tcBorders>
+            <w:shd w:val="clear" w:color="auto" w:fill="4472C4"/>
+            <w:vAlign w:val="center"/>
+          </w:tcPr>
+          <w:p>
+            <w:pPr>
+              <w:spacing w:before="0" w:after="0" w:line="240" w:lineRule="auto"/>
+              <w:jc w:val="center"/>
+            </w:pPr>
+            <w:r>
+              <w:rPr>
+                <w:rFonts w:ascii="Century Gothic" w:hAnsi="Century Gothic" w:cs="Century Gothic" w:eastAsia="Century Gothic"/>
+                <w:b/>
+                <w:i w:val="0"/>
+                <w:color w:val="FFFFFF"/>
+                <w:sz w:val="16"/>
+              </w:rPr>
+              <w:t>Línea base 2025</w:t>
+            </w:r>
+          </w:p>
+        </w:tc>
+        <w:tc>
+          <w:tcPr>
+            <w:tcW w:type="dxa" w:w="1814"/>
+            <w:tcBorders>
+              <w:top w:val="single" w:sz="4" w:space="0" w:color="4472C4"/>
+              <w:left w:val="single" w:sz="4" w:space="0" w:color="4472C4"/>
+              <w:bottom w:val="single" w:sz="4" w:space="0" w:color="4472C4"/>
+              <w:right w:val="single" w:sz="4" w:space="0" w:color="4472C4"/>
+            </w:tcBorders>
+            <w:shd w:val="clear" w:color="auto" w:fill="4472C4"/>
+            <w:vAlign w:val="center"/>
+          </w:tcPr>
+          <w:p>
+            <w:pPr>
+              <w:spacing w:before="0" w:after="0" w:line="240" w:lineRule="auto"/>
+              <w:jc w:val="center"/>
+            </w:pPr>
+            <w:r>
+              <w:rPr>
+                <w:rFonts w:ascii="Century Gothic" w:hAnsi="Century Gothic" w:cs="Century Gothic" w:eastAsia="Century Gothic"/>
+                <w:b/>
+                <w:i w:val="0"/>
+                <w:color w:val="FFFFFF"/>
+                <w:sz w:val="16"/>
+              </w:rPr>
+              <w:t>Meta 2030</w:t>
+            </w:r>
+          </w:p>
+        </w:tc>
+        <w:tc>
+          <w:tcPr>
+            <w:tcW w:type="dxa" w:w="1361"/>
+            <w:tcBorders>
+              <w:top w:val="single" w:sz="4" w:space="0" w:color="4472C4"/>
+              <w:left w:val="single" w:sz="4" w:space="0" w:color="4472C4"/>
+              <w:bottom w:val="single" w:sz="4" w:space="0" w:color="4472C4"/>
+              <w:right w:val="single" w:sz="4" w:space="0" w:color="4472C4"/>
+            </w:tcBorders>
+            <w:shd w:val="clear" w:color="auto" w:fill="4472C4"/>
+            <w:vAlign w:val="center"/>
+          </w:tcPr>
+          <w:p>
+            <w:pPr>
+              <w:spacing w:before="0" w:after="0" w:line="240" w:lineRule="auto"/>
+              <w:jc w:val="center"/>
+            </w:pPr>
+            <w:r>
+              <w:rPr>
+                <w:rFonts w:ascii="Century Gothic" w:hAnsi="Century Gothic" w:cs="Century Gothic" w:eastAsia="Century Gothic"/>
+                <w:b/>
+                <w:i w:val="0"/>
+                <w:color w:val="FFFFFF"/>
+                <w:sz w:val="16"/>
+              </w:rPr>
+              <w:t>Responsable</w:t>
+            </w:r>
+          </w:p>
+        </w:tc>
+      </w:tr>
+      <w:tr>
+        <w:tc>
+          <w:tcPr>
+            <w:tcW w:type="dxa" w:w="794"/>
+            <w:tcBorders>
+              <w:top w:val="single" w:sz="4" w:space="0" w:color="8EAADB"/>
+              <w:left w:val="single" w:sz="4" w:space="0" w:color="8EAADB"/>
+              <w:bottom w:val="single" w:sz="4" w:space="0" w:color="8EAADB"/>
+              <w:right w:val="single" w:sz="4" w:space="0" w:color="8EAADB"/>
+            </w:tcBorders>
+            <w:shd w:val="clear" w:color="auto" w:fill="D9E2F3"/>
+            <w:vAlign w:val="top"/>
+          </w:tcPr>
+          <w:p>
+            <w:pPr>
+              <w:spacing w:before="0" w:after="0" w:line="240" w:lineRule="auto"/>
+              <w:jc w:val="left"/>
+            </w:pPr>
+            <w:r>
+              <w:rPr>
+                <w:rFonts w:ascii="Century Gothic" w:hAnsi="Century Gothic" w:cs="Century Gothic" w:eastAsia="Century Gothic"/>
+                <w:b w:val="0"/>
+                <w:i w:val="0"/>
+                <w:sz w:val="16"/>
+              </w:rPr>
+              <w:t>1</w:t>
+            </w:r>
+          </w:p>
+        </w:tc>
+        <w:tc>
+          <w:tcPr>
+            <w:tcW w:type="dxa" w:w="1587"/>
+            <w:tcBorders>
+              <w:top w:val="single" w:sz="4" w:space="0" w:color="8EAADB"/>
+              <w:left w:val="single" w:sz="4" w:space="0" w:color="8EAADB"/>
+              <w:bottom w:val="single" w:sz="4" w:space="0" w:color="8EAADB"/>
+              <w:right w:val="single" w:sz="4" w:space="0" w:color="8EAADB"/>
+            </w:tcBorders>
+            <w:shd w:val="clear" w:color="auto" w:fill="D9E2F3"/>
+            <w:vAlign w:val="top"/>
+          </w:tcPr>
+          <w:p>
+            <w:pPr>
+              <w:spacing w:before="0" w:after="0" w:line="240" w:lineRule="auto"/>
+              <w:jc w:val="left"/>
+            </w:pPr>
+            <w:r>
+              <w:rPr>
+                <w:rFonts w:ascii="Century Gothic" w:hAnsi="Century Gothic" w:cs="Century Gothic" w:eastAsia="Century Gothic"/>
+                <w:b w:val="0"/>
+                <w:i w:val="0"/>
+                <w:sz w:val="16"/>
+              </w:rPr>
+              <w:t>Renovación curricular y titulación intermedia</w:t>
+            </w:r>
+          </w:p>
+        </w:tc>
+        <w:tc>
+          <w:tcPr>
+            <w:tcW w:type="dxa" w:w="2041"/>
+            <w:tcBorders>
+              <w:top w:val="single" w:sz="4" w:space="0" w:color="8EAADB"/>
+              <w:left w:val="single" w:sz="4" w:space="0" w:color="8EAADB"/>
+              <w:bottom w:val="single" w:sz="4" w:space="0" w:color="8EAADB"/>
+              <w:right w:val="single" w:sz="4" w:space="0" w:color="8EAADB"/>
+            </w:tcBorders>
+            <w:shd w:val="clear" w:color="auto" w:fill="D9E2F3"/>
+            <w:vAlign w:val="top"/>
+          </w:tcPr>
+          <w:p>
+            <w:pPr>
+              <w:spacing w:before="0" w:after="0" w:line="240" w:lineRule="auto"/>
+              <w:jc w:val="left"/>
+            </w:pPr>
+            <w:r>
+              <w:rPr>
+                <w:rFonts w:ascii="Century Gothic" w:hAnsi="Century Gothic" w:cs="Century Gothic" w:eastAsia="Century Gothic"/>
+                <w:b w:val="0"/>
+                <w:i w:val="0"/>
+                <w:sz w:val="16"/>
+              </w:rPr>
+              <w:t>Porcentaje de asignaturas del nuevo plan implementadas, con titulación intermedia reglamentada</w:t>
+            </w:r>
+          </w:p>
+        </w:tc>
+        <w:tc>
+          <w:tcPr>
+            <w:tcW w:type="dxa" w:w="1474"/>
+            <w:tcBorders>
+              <w:top w:val="single" w:sz="4" w:space="0" w:color="8EAADB"/>
+              <w:left w:val="single" w:sz="4" w:space="0" w:color="8EAADB"/>
+              <w:bottom w:val="single" w:sz="4" w:space="0" w:color="8EAADB"/>
+              <w:right w:val="single" w:sz="4" w:space="0" w:color="8EAADB"/>
+            </w:tcBorders>
+            <w:shd w:val="clear" w:color="auto" w:fill="D9E2F3"/>
+            <w:vAlign w:val="top"/>
+          </w:tcPr>
+          <w:p>
+            <w:pPr>
+              <w:spacing w:before="0" w:after="0" w:line="240" w:lineRule="auto"/>
+              <w:jc w:val="left"/>
+            </w:pPr>
+            <w:r>
+              <w:rPr>
+                <w:rFonts w:ascii="Century Gothic" w:hAnsi="Century Gothic" w:cs="Century Gothic" w:eastAsia="Century Gothic"/>
+                <w:b w:val="0"/>
+                <w:i w:val="0"/>
+                <w:sz w:val="16"/>
+              </w:rPr>
+              <w:t>0 %</w:t>
+            </w:r>
+          </w:p>
+        </w:tc>
+        <w:tc>
+          <w:tcPr>
+            <w:tcW w:type="dxa" w:w="1814"/>
+            <w:tcBorders>
+              <w:top w:val="single" w:sz="4" w:space="0" w:color="8EAADB"/>
+              <w:left w:val="single" w:sz="4" w:space="0" w:color="8EAADB"/>
+              <w:bottom w:val="single" w:sz="4" w:space="0" w:color="8EAADB"/>
+              <w:right w:val="single" w:sz="4" w:space="0" w:color="8EAADB"/>
+            </w:tcBorders>
+            <w:shd w:val="clear" w:color="auto" w:fill="D9E2F3"/>
+            <w:vAlign w:val="top"/>
+          </w:tcPr>
+          <w:p>
+            <w:pPr>
+              <w:spacing w:before="0" w:after="0" w:line="240" w:lineRule="auto"/>
+              <w:jc w:val="left"/>
+            </w:pPr>
+            <w:r>
+              <w:rPr>
+                <w:rFonts w:ascii="Century Gothic" w:hAnsi="Century Gothic" w:cs="Century Gothic" w:eastAsia="Century Gothic"/>
+                <w:b w:val="0"/>
+                <w:i w:val="0"/>
+                <w:sz w:val="16"/>
+              </w:rPr>
+              <w:t>100 % de las 43 asignaturas implementadas y titulación de Contador General activa</w:t>
+            </w:r>
+          </w:p>
+        </w:tc>
+        <w:tc>
+          <w:tcPr>
+            <w:tcW w:type="dxa" w:w="1361"/>
+            <w:tcBorders>
+              <w:top w:val="single" w:sz="4" w:space="0" w:color="8EAADB"/>
+              <w:left w:val="single" w:sz="4" w:space="0" w:color="8EAADB"/>
+              <w:bottom w:val="single" w:sz="4" w:space="0" w:color="8EAADB"/>
+              <w:right w:val="single" w:sz="4" w:space="0" w:color="8EAADB"/>
+            </w:tcBorders>
+            <w:shd w:val="clear" w:color="auto" w:fill="D9E2F3"/>
+            <w:vAlign w:val="top"/>
+          </w:tcPr>
+          <w:p>
+            <w:pPr>
+              <w:spacing w:before="0" w:after="0" w:line="240" w:lineRule="auto"/>
+              <w:jc w:val="left"/>
+            </w:pPr>
+            <w:r>
+              <w:rPr>
+                <w:rFonts w:ascii="Century Gothic" w:hAnsi="Century Gothic" w:cs="Century Gothic" w:eastAsia="Century Gothic"/>
+                <w:b w:val="0"/>
+                <w:i w:val="0"/>
+                <w:sz w:val="16"/>
+              </w:rPr>
+              <w:t>Dirección de Carrera</w:t>
+            </w:r>
+          </w:p>
+        </w:tc>
+      </w:tr>
+      <w:tr>
+        <w:tc>
+          <w:tcPr>
+            <w:tcW w:type="dxa" w:w="794"/>
+            <w:tcBorders>
+              <w:top w:val="single" w:sz="4" w:space="0" w:color="8EAADB"/>
+              <w:left w:val="single" w:sz="4" w:space="0" w:color="8EAADB"/>
+              <w:bottom w:val="single" w:sz="4" w:space="0" w:color="8EAADB"/>
+              <w:right w:val="single" w:sz="4" w:space="0" w:color="8EAADB"/>
+            </w:tcBorders>
+            <w:shd w:val="clear" w:color="auto" w:fill="D9E2F3"/>
+            <w:vAlign w:val="top"/>
+          </w:tcPr>
+          <w:p>
+            <w:pPr>
+              <w:spacing w:before="0" w:after="0" w:line="240" w:lineRule="auto"/>
+              <w:jc w:val="left"/>
+            </w:pPr>
+            <w:r>
+              <w:rPr>
+                <w:rFonts w:ascii="Century Gothic" w:hAnsi="Century Gothic" w:cs="Century Gothic" w:eastAsia="Century Gothic"/>
+                <w:b w:val="0"/>
+                <w:i w:val="0"/>
+                <w:sz w:val="16"/>
+              </w:rPr>
+              <w:t>1</w:t>
+            </w:r>
+          </w:p>
+        </w:tc>
+        <w:tc>
+          <w:tcPr>
+            <w:tcW w:type="dxa" w:w="1587"/>
+            <w:tcBorders>
+              <w:top w:val="single" w:sz="4" w:space="0" w:color="8EAADB"/>
+              <w:left w:val="single" w:sz="4" w:space="0" w:color="8EAADB"/>
+              <w:bottom w:val="single" w:sz="4" w:space="0" w:color="8EAADB"/>
+              <w:right w:val="single" w:sz="4" w:space="0" w:color="8EAADB"/>
+            </w:tcBorders>
+            <w:shd w:val="clear" w:color="auto" w:fill="D9E2F3"/>
+            <w:vAlign w:val="top"/>
+          </w:tcPr>
+          <w:p>
+            <w:pPr>
+              <w:spacing w:before="0" w:after="0" w:line="240" w:lineRule="auto"/>
+              <w:jc w:val="left"/>
+            </w:pPr>
+            <w:r>
+              <w:rPr>
+                <w:rFonts w:ascii="Century Gothic" w:hAnsi="Century Gothic" w:cs="Century Gothic" w:eastAsia="Century Gothic"/>
+                <w:b w:val="0"/>
+                <w:i w:val="0"/>
+                <w:sz w:val="16"/>
+              </w:rPr>
+              <w:t>Inglés técnico contable</w:t>
+            </w:r>
+          </w:p>
+        </w:tc>
+        <w:tc>
+          <w:tcPr>
+            <w:tcW w:type="dxa" w:w="2041"/>
+            <w:tcBorders>
+              <w:top w:val="single" w:sz="4" w:space="0" w:color="8EAADB"/>
+              <w:left w:val="single" w:sz="4" w:space="0" w:color="8EAADB"/>
+              <w:bottom w:val="single" w:sz="4" w:space="0" w:color="8EAADB"/>
+              <w:right w:val="single" w:sz="4" w:space="0" w:color="8EAADB"/>
+            </w:tcBorders>
+            <w:shd w:val="clear" w:color="auto" w:fill="D9E2F3"/>
+            <w:vAlign w:val="top"/>
+          </w:tcPr>
+          <w:p>
+            <w:pPr>
+              <w:spacing w:before="0" w:after="0" w:line="240" w:lineRule="auto"/>
+              <w:jc w:val="left"/>
+            </w:pPr>
+            <w:r>
+              <w:rPr>
+                <w:rFonts w:ascii="Century Gothic" w:hAnsi="Century Gothic" w:cs="Century Gothic" w:eastAsia="Century Gothic"/>
+                <w:b w:val="0"/>
+                <w:i w:val="0"/>
+                <w:sz w:val="16"/>
+              </w:rPr>
+              <w:t>Porcentaje de estudiantes que acreditan competencia en inglés técnico contable</w:t>
+            </w:r>
+          </w:p>
+        </w:tc>
+        <w:tc>
+          <w:tcPr>
+            <w:tcW w:type="dxa" w:w="1474"/>
+            <w:tcBorders>
+              <w:top w:val="single" w:sz="4" w:space="0" w:color="8EAADB"/>
+              <w:left w:val="single" w:sz="4" w:space="0" w:color="8EAADB"/>
+              <w:bottom w:val="single" w:sz="4" w:space="0" w:color="8EAADB"/>
+              <w:right w:val="single" w:sz="4" w:space="0" w:color="8EAADB"/>
+            </w:tcBorders>
+            <w:shd w:val="clear" w:color="auto" w:fill="D9E2F3"/>
+            <w:vAlign w:val="top"/>
+          </w:tcPr>
+          <w:p>
+            <w:pPr>
+              <w:spacing w:before="0" w:after="0" w:line="240" w:lineRule="auto"/>
+              <w:jc w:val="left"/>
+            </w:pPr>
+            <w:r>
+              <w:rPr>
+                <w:rFonts w:ascii="Century Gothic" w:hAnsi="Century Gothic" w:cs="Century Gothic" w:eastAsia="Century Gothic"/>
+                <w:b w:val="0"/>
+                <w:i w:val="0"/>
+                <w:sz w:val="16"/>
+              </w:rPr>
+              <w:t>Por establecer</w:t>
+            </w:r>
+          </w:p>
+        </w:tc>
+        <w:tc>
+          <w:tcPr>
+            <w:tcW w:type="dxa" w:w="1814"/>
+            <w:tcBorders>
+              <w:top w:val="single" w:sz="4" w:space="0" w:color="8EAADB"/>
+              <w:left w:val="single" w:sz="4" w:space="0" w:color="8EAADB"/>
+              <w:bottom w:val="single" w:sz="4" w:space="0" w:color="8EAADB"/>
+              <w:right w:val="single" w:sz="4" w:space="0" w:color="8EAADB"/>
+            </w:tcBorders>
+            <w:shd w:val="clear" w:color="auto" w:fill="D9E2F3"/>
+            <w:vAlign w:val="top"/>
+          </w:tcPr>
+          <w:p>
+            <w:pPr>
+              <w:spacing w:before="0" w:after="0" w:line="240" w:lineRule="auto"/>
+              <w:jc w:val="left"/>
+            </w:pPr>
+            <w:r>
+              <w:rPr>
+                <w:rFonts w:ascii="Century Gothic" w:hAnsi="Century Gothic" w:cs="Century Gothic" w:eastAsia="Century Gothic"/>
+                <w:b w:val="0"/>
+                <w:i w:val="0"/>
+                <w:sz w:val="16"/>
+              </w:rPr>
+              <w:t>100 % de los estudiantes con suficiencia acreditada al concluir el grado</w:t>
+            </w:r>
+          </w:p>
+        </w:tc>
+        <w:tc>
+          <w:tcPr>
+            <w:tcW w:type="dxa" w:w="1361"/>
+            <w:tcBorders>
+              <w:top w:val="single" w:sz="4" w:space="0" w:color="8EAADB"/>
+              <w:left w:val="single" w:sz="4" w:space="0" w:color="8EAADB"/>
+              <w:bottom w:val="single" w:sz="4" w:space="0" w:color="8EAADB"/>
+              <w:right w:val="single" w:sz="4" w:space="0" w:color="8EAADB"/>
+            </w:tcBorders>
+            <w:shd w:val="clear" w:color="auto" w:fill="D9E2F3"/>
+            <w:vAlign w:val="top"/>
+          </w:tcPr>
+          <w:p>
+            <w:pPr>
+              <w:spacing w:before="0" w:after="0" w:line="240" w:lineRule="auto"/>
+              <w:jc w:val="left"/>
+            </w:pPr>
+            <w:r>
+              <w:rPr>
+                <w:rFonts w:ascii="Century Gothic" w:hAnsi="Century Gothic" w:cs="Century Gothic" w:eastAsia="Century Gothic"/>
+                <w:b w:val="0"/>
+                <w:i w:val="0"/>
+                <w:sz w:val="16"/>
+              </w:rPr>
+              <w:t>Dirección de Carrera</w:t>
+            </w:r>
+          </w:p>
+        </w:tc>
+      </w:tr>
+      <w:tr>
+        <w:tc>
+          <w:tcPr>
+            <w:tcW w:type="dxa" w:w="794"/>
+            <w:tcBorders>
+              <w:top w:val="single" w:sz="4" w:space="0" w:color="8EAADB"/>
+              <w:left w:val="single" w:sz="4" w:space="0" w:color="8EAADB"/>
+              <w:bottom w:val="single" w:sz="4" w:space="0" w:color="8EAADB"/>
+              <w:right w:val="single" w:sz="4" w:space="0" w:color="8EAADB"/>
+            </w:tcBorders>
+            <w:shd w:val="clear" w:color="auto" w:fill="D9E2F3"/>
+            <w:vAlign w:val="top"/>
+          </w:tcPr>
+          <w:p>
+            <w:pPr>
+              <w:spacing w:before="0" w:after="0" w:line="240" w:lineRule="auto"/>
+              <w:jc w:val="left"/>
+            </w:pPr>
+            <w:r>
+              <w:rPr>
+                <w:rFonts w:ascii="Century Gothic" w:hAnsi="Century Gothic" w:cs="Century Gothic" w:eastAsia="Century Gothic"/>
+                <w:b w:val="0"/>
+                <w:i w:val="0"/>
+                <w:sz w:val="16"/>
+              </w:rPr>
+              <w:t>1</w:t>
+            </w:r>
+          </w:p>
+        </w:tc>
+        <w:tc>
+          <w:tcPr>
+            <w:tcW w:type="dxa" w:w="1587"/>
+            <w:tcBorders>
+              <w:top w:val="single" w:sz="4" w:space="0" w:color="8EAADB"/>
+              <w:left w:val="single" w:sz="4" w:space="0" w:color="8EAADB"/>
+              <w:bottom w:val="single" w:sz="4" w:space="0" w:color="8EAADB"/>
+              <w:right w:val="single" w:sz="4" w:space="0" w:color="8EAADB"/>
+            </w:tcBorders>
+            <w:shd w:val="clear" w:color="auto" w:fill="D9E2F3"/>
+            <w:vAlign w:val="top"/>
+          </w:tcPr>
+          <w:p>
+            <w:pPr>
+              <w:spacing w:before="0" w:after="0" w:line="240" w:lineRule="auto"/>
+              <w:jc w:val="left"/>
+            </w:pPr>
+            <w:r>
+              <w:rPr>
+                <w:rFonts w:ascii="Century Gothic" w:hAnsi="Century Gothic" w:cs="Century Gothic" w:eastAsia="Century Gothic"/>
+                <w:b w:val="0"/>
+                <w:i w:val="0"/>
+                <w:sz w:val="16"/>
+              </w:rPr>
+              <w:t>Titulación mediante diplomado</w:t>
+            </w:r>
+          </w:p>
+        </w:tc>
+        <w:tc>
+          <w:tcPr>
+            <w:tcW w:type="dxa" w:w="2041"/>
+            <w:tcBorders>
+              <w:top w:val="single" w:sz="4" w:space="0" w:color="8EAADB"/>
+              <w:left w:val="single" w:sz="4" w:space="0" w:color="8EAADB"/>
+              <w:bottom w:val="single" w:sz="4" w:space="0" w:color="8EAADB"/>
+              <w:right w:val="single" w:sz="4" w:space="0" w:color="8EAADB"/>
+            </w:tcBorders>
+            <w:shd w:val="clear" w:color="auto" w:fill="D9E2F3"/>
+            <w:vAlign w:val="top"/>
+          </w:tcPr>
+          <w:p>
+            <w:pPr>
+              <w:spacing w:before="0" w:after="0" w:line="240" w:lineRule="auto"/>
+              <w:jc w:val="left"/>
+            </w:pPr>
+            <w:r>
+              <w:rPr>
+                <w:rFonts w:ascii="Century Gothic" w:hAnsi="Century Gothic" w:cs="Century Gothic" w:eastAsia="Century Gothic"/>
+                <w:b w:val="0"/>
+                <w:i w:val="0"/>
+                <w:sz w:val="16"/>
+              </w:rPr>
+              <w:t>Porcentaje de graduados titulados por la modalidad de diplomado</w:t>
+            </w:r>
+          </w:p>
+        </w:tc>
+        <w:tc>
+          <w:tcPr>
+            <w:tcW w:type="dxa" w:w="1474"/>
+            <w:tcBorders>
+              <w:top w:val="single" w:sz="4" w:space="0" w:color="8EAADB"/>
+              <w:left w:val="single" w:sz="4" w:space="0" w:color="8EAADB"/>
+              <w:bottom w:val="single" w:sz="4" w:space="0" w:color="8EAADB"/>
+              <w:right w:val="single" w:sz="4" w:space="0" w:color="8EAADB"/>
+            </w:tcBorders>
+            <w:shd w:val="clear" w:color="auto" w:fill="D9E2F3"/>
+            <w:vAlign w:val="top"/>
+          </w:tcPr>
+          <w:p>
+            <w:pPr>
+              <w:spacing w:before="0" w:after="0" w:line="240" w:lineRule="auto"/>
+              <w:jc w:val="left"/>
+            </w:pPr>
+            <w:r>
+              <w:rPr>
+                <w:rFonts w:ascii="Century Gothic" w:hAnsi="Century Gothic" w:cs="Century Gothic" w:eastAsia="Century Gothic"/>
+                <w:b w:val="0"/>
+                <w:i w:val="0"/>
+                <w:sz w:val="16"/>
+              </w:rPr>
+              <w:t>0 %</w:t>
+            </w:r>
+          </w:p>
+        </w:tc>
+        <w:tc>
+          <w:tcPr>
+            <w:tcW w:type="dxa" w:w="1814"/>
+            <w:tcBorders>
+              <w:top w:val="single" w:sz="4" w:space="0" w:color="8EAADB"/>
+              <w:left w:val="single" w:sz="4" w:space="0" w:color="8EAADB"/>
+              <w:bottom w:val="single" w:sz="4" w:space="0" w:color="8EAADB"/>
+              <w:right w:val="single" w:sz="4" w:space="0" w:color="8EAADB"/>
+            </w:tcBorders>
+            <w:shd w:val="clear" w:color="auto" w:fill="D9E2F3"/>
+            <w:vAlign w:val="top"/>
+          </w:tcPr>
+          <w:p>
+            <w:pPr>
+              <w:spacing w:before="0" w:after="0" w:line="240" w:lineRule="auto"/>
+              <w:jc w:val="left"/>
+            </w:pPr>
+            <w:r>
+              <w:rPr>
+                <w:rFonts w:ascii="Century Gothic" w:hAnsi="Century Gothic" w:cs="Century Gothic" w:eastAsia="Century Gothic"/>
+                <w:b w:val="0"/>
+                <w:i w:val="0"/>
+                <w:sz w:val="16"/>
+              </w:rPr>
+              <w:t>40 % de los graduados anuales</w:t>
+            </w:r>
+          </w:p>
+        </w:tc>
+        <w:tc>
+          <w:tcPr>
+            <w:tcW w:type="dxa" w:w="1361"/>
+            <w:tcBorders>
+              <w:top w:val="single" w:sz="4" w:space="0" w:color="8EAADB"/>
+              <w:left w:val="single" w:sz="4" w:space="0" w:color="8EAADB"/>
+              <w:bottom w:val="single" w:sz="4" w:space="0" w:color="8EAADB"/>
+              <w:right w:val="single" w:sz="4" w:space="0" w:color="8EAADB"/>
+            </w:tcBorders>
+            <w:shd w:val="clear" w:color="auto" w:fill="D9E2F3"/>
+            <w:vAlign w:val="top"/>
+          </w:tcPr>
+          <w:p>
+            <w:pPr>
+              <w:spacing w:before="0" w:after="0" w:line="240" w:lineRule="auto"/>
+              <w:jc w:val="left"/>
+            </w:pPr>
+            <w:r>
+              <w:rPr>
+                <w:rFonts w:ascii="Century Gothic" w:hAnsi="Century Gothic" w:cs="Century Gothic" w:eastAsia="Century Gothic"/>
+                <w:b w:val="0"/>
+                <w:i w:val="0"/>
+                <w:sz w:val="16"/>
+              </w:rPr>
+              <w:t>Unidad de Postgrado y Dirección de Carrera</w:t>
+            </w:r>
+          </w:p>
+        </w:tc>
+      </w:tr>
+      <w:tr>
+        <w:tc>
+          <w:tcPr>
+            <w:tcW w:type="dxa" w:w="794"/>
+            <w:tcBorders>
+              <w:top w:val="single" w:sz="4" w:space="0" w:color="8EAADB"/>
+              <w:left w:val="single" w:sz="4" w:space="0" w:color="8EAADB"/>
+              <w:bottom w:val="single" w:sz="4" w:space="0" w:color="8EAADB"/>
+              <w:right w:val="single" w:sz="4" w:space="0" w:color="8EAADB"/>
+            </w:tcBorders>
+            <w:shd w:val="clear" w:color="auto" w:fill="D9E2F3"/>
+            <w:vAlign w:val="top"/>
+          </w:tcPr>
+          <w:p>
+            <w:pPr>
+              <w:spacing w:before="0" w:after="0" w:line="240" w:lineRule="auto"/>
+              <w:jc w:val="left"/>
+            </w:pPr>
+            <w:r>
+              <w:rPr>
+                <w:rFonts w:ascii="Century Gothic" w:hAnsi="Century Gothic" w:cs="Century Gothic" w:eastAsia="Century Gothic"/>
+                <w:b w:val="0"/>
+                <w:i w:val="0"/>
+                <w:sz w:val="16"/>
+              </w:rPr>
+              <w:t>2</w:t>
+            </w:r>
+          </w:p>
+        </w:tc>
+        <w:tc>
+          <w:tcPr>
+            <w:tcW w:type="dxa" w:w="1587"/>
+            <w:tcBorders>
+              <w:top w:val="single" w:sz="4" w:space="0" w:color="8EAADB"/>
+              <w:left w:val="single" w:sz="4" w:space="0" w:color="8EAADB"/>
+              <w:bottom w:val="single" w:sz="4" w:space="0" w:color="8EAADB"/>
+              <w:right w:val="single" w:sz="4" w:space="0" w:color="8EAADB"/>
+            </w:tcBorders>
+            <w:shd w:val="clear" w:color="auto" w:fill="D9E2F3"/>
+            <w:vAlign w:val="top"/>
+          </w:tcPr>
+          <w:p>
+            <w:pPr>
+              <w:spacing w:before="0" w:after="0" w:line="240" w:lineRule="auto"/>
+              <w:jc w:val="left"/>
+            </w:pPr>
+            <w:r>
+              <w:rPr>
+                <w:rFonts w:ascii="Century Gothic" w:hAnsi="Century Gothic" w:cs="Century Gothic" w:eastAsia="Century Gothic"/>
+                <w:b w:val="0"/>
+                <w:i w:val="0"/>
+                <w:sz w:val="16"/>
+              </w:rPr>
+              <w:t>Investigación aplicada</w:t>
+            </w:r>
+          </w:p>
+        </w:tc>
+        <w:tc>
+          <w:tcPr>
+            <w:tcW w:type="dxa" w:w="2041"/>
+            <w:tcBorders>
+              <w:top w:val="single" w:sz="4" w:space="0" w:color="8EAADB"/>
+              <w:left w:val="single" w:sz="4" w:space="0" w:color="8EAADB"/>
+              <w:bottom w:val="single" w:sz="4" w:space="0" w:color="8EAADB"/>
+              <w:right w:val="single" w:sz="4" w:space="0" w:color="8EAADB"/>
+            </w:tcBorders>
+            <w:shd w:val="clear" w:color="auto" w:fill="D9E2F3"/>
+            <w:vAlign w:val="top"/>
+          </w:tcPr>
+          <w:p>
+            <w:pPr>
+              <w:spacing w:before="0" w:after="0" w:line="240" w:lineRule="auto"/>
+              <w:jc w:val="left"/>
+            </w:pPr>
+            <w:r>
+              <w:rPr>
+                <w:rFonts w:ascii="Century Gothic" w:hAnsi="Century Gothic" w:cs="Century Gothic" w:eastAsia="Century Gothic"/>
+                <w:b w:val="0"/>
+                <w:i w:val="0"/>
+                <w:sz w:val="16"/>
+              </w:rPr>
+              <w:t>Publicaciones indexadas y documentos de política pública en las cuatro líneas prioritarias</w:t>
+            </w:r>
+          </w:p>
+        </w:tc>
+        <w:tc>
+          <w:tcPr>
+            <w:tcW w:type="dxa" w:w="1474"/>
+            <w:tcBorders>
+              <w:top w:val="single" w:sz="4" w:space="0" w:color="8EAADB"/>
+              <w:left w:val="single" w:sz="4" w:space="0" w:color="8EAADB"/>
+              <w:bottom w:val="single" w:sz="4" w:space="0" w:color="8EAADB"/>
+              <w:right w:val="single" w:sz="4" w:space="0" w:color="8EAADB"/>
+            </w:tcBorders>
+            <w:shd w:val="clear" w:color="auto" w:fill="D9E2F3"/>
+            <w:vAlign w:val="top"/>
+          </w:tcPr>
+          <w:p>
+            <w:pPr>
+              <w:spacing w:before="0" w:after="0" w:line="240" w:lineRule="auto"/>
+              <w:jc w:val="left"/>
+            </w:pPr>
+            <w:r>
+              <w:rPr>
+                <w:rFonts w:ascii="Century Gothic" w:hAnsi="Century Gothic" w:cs="Century Gothic" w:eastAsia="Century Gothic"/>
+                <w:b w:val="0"/>
+                <w:i w:val="0"/>
+                <w:sz w:val="16"/>
+              </w:rPr>
+              <w:t>0 publicaciones</w:t>
+            </w:r>
+          </w:p>
+        </w:tc>
+        <w:tc>
+          <w:tcPr>
+            <w:tcW w:type="dxa" w:w="1814"/>
+            <w:tcBorders>
+              <w:top w:val="single" w:sz="4" w:space="0" w:color="8EAADB"/>
+              <w:left w:val="single" w:sz="4" w:space="0" w:color="8EAADB"/>
+              <w:bottom w:val="single" w:sz="4" w:space="0" w:color="8EAADB"/>
+              <w:right w:val="single" w:sz="4" w:space="0" w:color="8EAADB"/>
+            </w:tcBorders>
+            <w:shd w:val="clear" w:color="auto" w:fill="D9E2F3"/>
+            <w:vAlign w:val="top"/>
+          </w:tcPr>
+          <w:p>
+            <w:pPr>
+              <w:spacing w:before="0" w:after="0" w:line="240" w:lineRule="auto"/>
+              <w:jc w:val="left"/>
+            </w:pPr>
+            <w:r>
+              <w:rPr>
+                <w:rFonts w:ascii="Century Gothic" w:hAnsi="Century Gothic" w:cs="Century Gothic" w:eastAsia="Century Gothic"/>
+                <w:b w:val="0"/>
+                <w:i w:val="0"/>
+                <w:sz w:val="16"/>
+              </w:rPr>
+              <w:t>15 publicaciones indexadas y 5 documentos de política pública</w:t>
+            </w:r>
+          </w:p>
+        </w:tc>
+        <w:tc>
+          <w:tcPr>
+            <w:tcW w:type="dxa" w:w="1361"/>
+            <w:tcBorders>
+              <w:top w:val="single" w:sz="4" w:space="0" w:color="8EAADB"/>
+              <w:left w:val="single" w:sz="4" w:space="0" w:color="8EAADB"/>
+              <w:bottom w:val="single" w:sz="4" w:space="0" w:color="8EAADB"/>
+              <w:right w:val="single" w:sz="4" w:space="0" w:color="8EAADB"/>
+            </w:tcBorders>
+            <w:shd w:val="clear" w:color="auto" w:fill="D9E2F3"/>
+            <w:vAlign w:val="top"/>
+          </w:tcPr>
+          <w:p>
+            <w:pPr>
+              <w:spacing w:before="0" w:after="0" w:line="240" w:lineRule="auto"/>
+              <w:jc w:val="left"/>
+            </w:pPr>
+            <w:r>
+              <w:rPr>
+                <w:rFonts w:ascii="Century Gothic" w:hAnsi="Century Gothic" w:cs="Century Gothic" w:eastAsia="Century Gothic"/>
+                <w:b w:val="0"/>
+                <w:i w:val="0"/>
+                <w:sz w:val="16"/>
+              </w:rPr>
+              <w:t>Instituto de Investigaciones</w:t>
+            </w:r>
+          </w:p>
+        </w:tc>
+      </w:tr>
+      <w:tr>
+        <w:tc>
+          <w:tcPr>
+            <w:tcW w:type="dxa" w:w="794"/>
+            <w:tcBorders>
+              <w:top w:val="single" w:sz="4" w:space="0" w:color="8EAADB"/>
+              <w:left w:val="single" w:sz="4" w:space="0" w:color="8EAADB"/>
+              <w:bottom w:val="single" w:sz="4" w:space="0" w:color="8EAADB"/>
+              <w:right w:val="single" w:sz="4" w:space="0" w:color="8EAADB"/>
+            </w:tcBorders>
+            <w:shd w:val="clear" w:color="auto" w:fill="D9E2F3"/>
+            <w:vAlign w:val="top"/>
+          </w:tcPr>
+          <w:p>
+            <w:pPr>
+              <w:spacing w:before="0" w:after="0" w:line="240" w:lineRule="auto"/>
+              <w:jc w:val="left"/>
+            </w:pPr>
+            <w:r>
+              <w:rPr>
+                <w:rFonts w:ascii="Century Gothic" w:hAnsi="Century Gothic" w:cs="Century Gothic" w:eastAsia="Century Gothic"/>
+                <w:b w:val="0"/>
+                <w:i w:val="0"/>
+                <w:sz w:val="16"/>
+              </w:rPr>
+              <w:t>3</w:t>
+            </w:r>
+          </w:p>
+        </w:tc>
+        <w:tc>
+          <w:tcPr>
+            <w:tcW w:type="dxa" w:w="1587"/>
+            <w:tcBorders>
+              <w:top w:val="single" w:sz="4" w:space="0" w:color="8EAADB"/>
+              <w:left w:val="single" w:sz="4" w:space="0" w:color="8EAADB"/>
+              <w:bottom w:val="single" w:sz="4" w:space="0" w:color="8EAADB"/>
+              <w:right w:val="single" w:sz="4" w:space="0" w:color="8EAADB"/>
+            </w:tcBorders>
+            <w:shd w:val="clear" w:color="auto" w:fill="D9E2F3"/>
+            <w:vAlign w:val="top"/>
+          </w:tcPr>
+          <w:p>
+            <w:pPr>
+              <w:spacing w:before="0" w:after="0" w:line="240" w:lineRule="auto"/>
+              <w:jc w:val="left"/>
+            </w:pPr>
+            <w:r>
+              <w:rPr>
+                <w:rFonts w:ascii="Century Gothic" w:hAnsi="Century Gothic" w:cs="Century Gothic" w:eastAsia="Century Gothic"/>
+                <w:b w:val="0"/>
+                <w:i w:val="0"/>
+                <w:sz w:val="16"/>
+              </w:rPr>
+              <w:t>Pasantías preprofesionales</w:t>
+            </w:r>
+          </w:p>
+        </w:tc>
+        <w:tc>
+          <w:tcPr>
+            <w:tcW w:type="dxa" w:w="2041"/>
+            <w:tcBorders>
+              <w:top w:val="single" w:sz="4" w:space="0" w:color="8EAADB"/>
+              <w:left w:val="single" w:sz="4" w:space="0" w:color="8EAADB"/>
+              <w:bottom w:val="single" w:sz="4" w:space="0" w:color="8EAADB"/>
+              <w:right w:val="single" w:sz="4" w:space="0" w:color="8EAADB"/>
+            </w:tcBorders>
+            <w:shd w:val="clear" w:color="auto" w:fill="D9E2F3"/>
+            <w:vAlign w:val="top"/>
+          </w:tcPr>
+          <w:p>
+            <w:pPr>
+              <w:spacing w:before="0" w:after="0" w:line="240" w:lineRule="auto"/>
+              <w:jc w:val="left"/>
+            </w:pPr>
+            <w:r>
+              <w:rPr>
+                <w:rFonts w:ascii="Century Gothic" w:hAnsi="Century Gothic" w:cs="Century Gothic" w:eastAsia="Century Gothic"/>
+                <w:b w:val="0"/>
+                <w:i w:val="0"/>
+                <w:sz w:val="16"/>
+              </w:rPr>
+              <w:t>Porcentaje de estudiantes de tercer a quinto año con pasantías por convenio</w:t>
+            </w:r>
+          </w:p>
+        </w:tc>
+        <w:tc>
+          <w:tcPr>
+            <w:tcW w:type="dxa" w:w="1474"/>
+            <w:tcBorders>
+              <w:top w:val="single" w:sz="4" w:space="0" w:color="8EAADB"/>
+              <w:left w:val="single" w:sz="4" w:space="0" w:color="8EAADB"/>
+              <w:bottom w:val="single" w:sz="4" w:space="0" w:color="8EAADB"/>
+              <w:right w:val="single" w:sz="4" w:space="0" w:color="8EAADB"/>
+            </w:tcBorders>
+            <w:shd w:val="clear" w:color="auto" w:fill="D9E2F3"/>
+            <w:vAlign w:val="top"/>
+          </w:tcPr>
+          <w:p>
+            <w:pPr>
+              <w:spacing w:before="0" w:after="0" w:line="240" w:lineRule="auto"/>
+              <w:jc w:val="left"/>
+            </w:pPr>
+            <w:r>
+              <w:rPr>
+                <w:rFonts w:ascii="Century Gothic" w:hAnsi="Century Gothic" w:cs="Century Gothic" w:eastAsia="Century Gothic"/>
+                <w:b w:val="0"/>
+                <w:i w:val="0"/>
+                <w:sz w:val="16"/>
+              </w:rPr>
+              <w:t>Por establecer</w:t>
+            </w:r>
+          </w:p>
+        </w:tc>
+        <w:tc>
+          <w:tcPr>
+            <w:tcW w:type="dxa" w:w="1814"/>
+            <w:tcBorders>
+              <w:top w:val="single" w:sz="4" w:space="0" w:color="8EAADB"/>
+              <w:left w:val="single" w:sz="4" w:space="0" w:color="8EAADB"/>
+              <w:bottom w:val="single" w:sz="4" w:space="0" w:color="8EAADB"/>
+              <w:right w:val="single" w:sz="4" w:space="0" w:color="8EAADB"/>
+            </w:tcBorders>
+            <w:shd w:val="clear" w:color="auto" w:fill="D9E2F3"/>
+            <w:vAlign w:val="top"/>
+          </w:tcPr>
+          <w:p>
+            <w:pPr>
+              <w:spacing w:before="0" w:after="0" w:line="240" w:lineRule="auto"/>
+              <w:jc w:val="left"/>
+            </w:pPr>
+            <w:r>
+              <w:rPr>
+                <w:rFonts w:ascii="Century Gothic" w:hAnsi="Century Gothic" w:cs="Century Gothic" w:eastAsia="Century Gothic"/>
+                <w:b w:val="0"/>
+                <w:i w:val="0"/>
+                <w:sz w:val="16"/>
+              </w:rPr>
+              <w:t>100 % de los estudiantes habilitados</w:t>
+            </w:r>
+          </w:p>
+        </w:tc>
+        <w:tc>
+          <w:tcPr>
+            <w:tcW w:type="dxa" w:w="1361"/>
+            <w:tcBorders>
+              <w:top w:val="single" w:sz="4" w:space="0" w:color="8EAADB"/>
+              <w:left w:val="single" w:sz="4" w:space="0" w:color="8EAADB"/>
+              <w:bottom w:val="single" w:sz="4" w:space="0" w:color="8EAADB"/>
+              <w:right w:val="single" w:sz="4" w:space="0" w:color="8EAADB"/>
+            </w:tcBorders>
+            <w:shd w:val="clear" w:color="auto" w:fill="D9E2F3"/>
+            <w:vAlign w:val="top"/>
+          </w:tcPr>
+          <w:p>
+            <w:pPr>
+              <w:spacing w:before="0" w:after="0" w:line="240" w:lineRule="auto"/>
+              <w:jc w:val="left"/>
+            </w:pPr>
+            <w:r>
+              <w:rPr>
+                <w:rFonts w:ascii="Century Gothic" w:hAnsi="Century Gothic" w:cs="Century Gothic" w:eastAsia="Century Gothic"/>
+                <w:b w:val="0"/>
+                <w:i w:val="0"/>
+                <w:sz w:val="16"/>
+              </w:rPr>
+              <w:t>Dirección de Carrera</w:t>
+            </w:r>
+          </w:p>
+        </w:tc>
+      </w:tr>
+      <w:tr>
+        <w:tc>
+          <w:tcPr>
+            <w:tcW w:type="dxa" w:w="794"/>
+            <w:tcBorders>
+              <w:top w:val="single" w:sz="4" w:space="0" w:color="8EAADB"/>
+              <w:left w:val="single" w:sz="4" w:space="0" w:color="8EAADB"/>
+              <w:bottom w:val="single" w:sz="4" w:space="0" w:color="8EAADB"/>
+              <w:right w:val="single" w:sz="4" w:space="0" w:color="8EAADB"/>
+            </w:tcBorders>
+            <w:shd w:val="clear" w:color="auto" w:fill="D9E2F3"/>
+            <w:vAlign w:val="top"/>
+          </w:tcPr>
+          <w:p>
+            <w:pPr>
+              <w:spacing w:before="0" w:after="0" w:line="240" w:lineRule="auto"/>
+              <w:jc w:val="left"/>
+            </w:pPr>
+            <w:r>
+              <w:rPr>
+                <w:rFonts w:ascii="Century Gothic" w:hAnsi="Century Gothic" w:cs="Century Gothic" w:eastAsia="Century Gothic"/>
+                <w:b w:val="0"/>
+                <w:i w:val="0"/>
+                <w:sz w:val="16"/>
+              </w:rPr>
+              <w:t>3</w:t>
+            </w:r>
+          </w:p>
+        </w:tc>
+        <w:tc>
+          <w:tcPr>
+            <w:tcW w:type="dxa" w:w="1587"/>
+            <w:tcBorders>
+              <w:top w:val="single" w:sz="4" w:space="0" w:color="8EAADB"/>
+              <w:left w:val="single" w:sz="4" w:space="0" w:color="8EAADB"/>
+              <w:bottom w:val="single" w:sz="4" w:space="0" w:color="8EAADB"/>
+              <w:right w:val="single" w:sz="4" w:space="0" w:color="8EAADB"/>
+            </w:tcBorders>
+            <w:shd w:val="clear" w:color="auto" w:fill="D9E2F3"/>
+            <w:vAlign w:val="top"/>
+          </w:tcPr>
+          <w:p>
+            <w:pPr>
+              <w:spacing w:before="0" w:after="0" w:line="240" w:lineRule="auto"/>
+              <w:jc w:val="left"/>
+            </w:pPr>
+            <w:r>
+              <w:rPr>
+                <w:rFonts w:ascii="Century Gothic" w:hAnsi="Century Gothic" w:cs="Century Gothic" w:eastAsia="Century Gothic"/>
+                <w:b w:val="0"/>
+                <w:i w:val="0"/>
+                <w:sz w:val="16"/>
+              </w:rPr>
+              <w:t>Formación ética y consultoría social</w:t>
+            </w:r>
+          </w:p>
+        </w:tc>
+        <w:tc>
+          <w:tcPr>
+            <w:tcW w:type="dxa" w:w="2041"/>
+            <w:tcBorders>
+              <w:top w:val="single" w:sz="4" w:space="0" w:color="8EAADB"/>
+              <w:left w:val="single" w:sz="4" w:space="0" w:color="8EAADB"/>
+              <w:bottom w:val="single" w:sz="4" w:space="0" w:color="8EAADB"/>
+              <w:right w:val="single" w:sz="4" w:space="0" w:color="8EAADB"/>
+            </w:tcBorders>
+            <w:shd w:val="clear" w:color="auto" w:fill="D9E2F3"/>
+            <w:vAlign w:val="top"/>
+          </w:tcPr>
+          <w:p>
+            <w:pPr>
+              <w:spacing w:before="0" w:after="0" w:line="240" w:lineRule="auto"/>
+              <w:jc w:val="left"/>
+            </w:pPr>
+            <w:r>
+              <w:rPr>
+                <w:rFonts w:ascii="Century Gothic" w:hAnsi="Century Gothic" w:cs="Century Gothic" w:eastAsia="Century Gothic"/>
+                <w:b w:val="0"/>
+                <w:i w:val="0"/>
+                <w:sz w:val="16"/>
+              </w:rPr>
+              <w:t>Porcentaje de estudiantes formados en el Código del IESBA y participantes en la consultoría social</w:t>
+            </w:r>
+          </w:p>
+        </w:tc>
+        <w:tc>
+          <w:tcPr>
+            <w:tcW w:type="dxa" w:w="1474"/>
+            <w:tcBorders>
+              <w:top w:val="single" w:sz="4" w:space="0" w:color="8EAADB"/>
+              <w:left w:val="single" w:sz="4" w:space="0" w:color="8EAADB"/>
+              <w:bottom w:val="single" w:sz="4" w:space="0" w:color="8EAADB"/>
+              <w:right w:val="single" w:sz="4" w:space="0" w:color="8EAADB"/>
+            </w:tcBorders>
+            <w:shd w:val="clear" w:color="auto" w:fill="D9E2F3"/>
+            <w:vAlign w:val="top"/>
+          </w:tcPr>
+          <w:p>
+            <w:pPr>
+              <w:spacing w:before="0" w:after="0" w:line="240" w:lineRule="auto"/>
+              <w:jc w:val="left"/>
+            </w:pPr>
+            <w:r>
+              <w:rPr>
+                <w:rFonts w:ascii="Century Gothic" w:hAnsi="Century Gothic" w:cs="Century Gothic" w:eastAsia="Century Gothic"/>
+                <w:b w:val="0"/>
+                <w:i w:val="0"/>
+                <w:sz w:val="16"/>
+              </w:rPr>
+              <w:t>83 % de estudiantes percibe descuido ético</w:t>
+            </w:r>
+          </w:p>
+        </w:tc>
+        <w:tc>
+          <w:tcPr>
+            <w:tcW w:type="dxa" w:w="1814"/>
+            <w:tcBorders>
+              <w:top w:val="single" w:sz="4" w:space="0" w:color="8EAADB"/>
+              <w:left w:val="single" w:sz="4" w:space="0" w:color="8EAADB"/>
+              <w:bottom w:val="single" w:sz="4" w:space="0" w:color="8EAADB"/>
+              <w:right w:val="single" w:sz="4" w:space="0" w:color="8EAADB"/>
+            </w:tcBorders>
+            <w:shd w:val="clear" w:color="auto" w:fill="D9E2F3"/>
+            <w:vAlign w:val="top"/>
+          </w:tcPr>
+          <w:p>
+            <w:pPr>
+              <w:spacing w:before="0" w:after="0" w:line="240" w:lineRule="auto"/>
+              <w:jc w:val="left"/>
+            </w:pPr>
+            <w:r>
+              <w:rPr>
+                <w:rFonts w:ascii="Century Gothic" w:hAnsi="Century Gothic" w:cs="Century Gothic" w:eastAsia="Century Gothic"/>
+                <w:b w:val="0"/>
+                <w:i w:val="0"/>
+                <w:sz w:val="16"/>
+              </w:rPr>
+              <w:t>100 % de los estudiantes formados</w:t>
+            </w:r>
+          </w:p>
+        </w:tc>
+        <w:tc>
+          <w:tcPr>
+            <w:tcW w:type="dxa" w:w="1361"/>
+            <w:tcBorders>
+              <w:top w:val="single" w:sz="4" w:space="0" w:color="8EAADB"/>
+              <w:left w:val="single" w:sz="4" w:space="0" w:color="8EAADB"/>
+              <w:bottom w:val="single" w:sz="4" w:space="0" w:color="8EAADB"/>
+              <w:right w:val="single" w:sz="4" w:space="0" w:color="8EAADB"/>
+            </w:tcBorders>
+            <w:shd w:val="clear" w:color="auto" w:fill="D9E2F3"/>
+            <w:vAlign w:val="top"/>
+          </w:tcPr>
+          <w:p>
+            <w:pPr>
+              <w:spacing w:before="0" w:after="0" w:line="240" w:lineRule="auto"/>
+              <w:jc w:val="left"/>
+            </w:pPr>
+            <w:r>
+              <w:rPr>
+                <w:rFonts w:ascii="Century Gothic" w:hAnsi="Century Gothic" w:cs="Century Gothic" w:eastAsia="Century Gothic"/>
+                <w:b w:val="0"/>
+                <w:i w:val="0"/>
+                <w:sz w:val="16"/>
+              </w:rPr>
+              <w:t>Dirección de Carrera</w:t>
+            </w:r>
+          </w:p>
+        </w:tc>
+      </w:tr>
+      <w:tr>
+        <w:tc>
+          <w:tcPr>
+            <w:tcW w:type="dxa" w:w="794"/>
+            <w:tcBorders>
+              <w:top w:val="single" w:sz="4" w:space="0" w:color="8EAADB"/>
+              <w:left w:val="single" w:sz="4" w:space="0" w:color="8EAADB"/>
+              <w:bottom w:val="single" w:sz="4" w:space="0" w:color="8EAADB"/>
+              <w:right w:val="single" w:sz="4" w:space="0" w:color="8EAADB"/>
+            </w:tcBorders>
+            <w:shd w:val="clear" w:color="auto" w:fill="D9E2F3"/>
+            <w:vAlign w:val="top"/>
+          </w:tcPr>
+          <w:p>
+            <w:pPr>
+              <w:spacing w:before="0" w:after="0" w:line="240" w:lineRule="auto"/>
+              <w:jc w:val="left"/>
+            </w:pPr>
+            <w:r>
+              <w:rPr>
+                <w:rFonts w:ascii="Century Gothic" w:hAnsi="Century Gothic" w:cs="Century Gothic" w:eastAsia="Century Gothic"/>
+                <w:b w:val="0"/>
+                <w:i w:val="0"/>
+                <w:sz w:val="16"/>
+              </w:rPr>
+              <w:t>4</w:t>
+            </w:r>
+          </w:p>
+        </w:tc>
+        <w:tc>
+          <w:tcPr>
+            <w:tcW w:type="dxa" w:w="1587"/>
+            <w:tcBorders>
+              <w:top w:val="single" w:sz="4" w:space="0" w:color="8EAADB"/>
+              <w:left w:val="single" w:sz="4" w:space="0" w:color="8EAADB"/>
+              <w:bottom w:val="single" w:sz="4" w:space="0" w:color="8EAADB"/>
+              <w:right w:val="single" w:sz="4" w:space="0" w:color="8EAADB"/>
+            </w:tcBorders>
+            <w:shd w:val="clear" w:color="auto" w:fill="D9E2F3"/>
+            <w:vAlign w:val="top"/>
+          </w:tcPr>
+          <w:p>
+            <w:pPr>
+              <w:spacing w:before="0" w:after="0" w:line="240" w:lineRule="auto"/>
+              <w:jc w:val="left"/>
+            </w:pPr>
+            <w:r>
+              <w:rPr>
+                <w:rFonts w:ascii="Century Gothic" w:hAnsi="Century Gothic" w:cs="Century Gothic" w:eastAsia="Century Gothic"/>
+                <w:b w:val="0"/>
+                <w:i w:val="0"/>
+                <w:sz w:val="16"/>
+              </w:rPr>
+              <w:t>Laboratorios</w:t>
+            </w:r>
+          </w:p>
+        </w:tc>
+        <w:tc>
+          <w:tcPr>
+            <w:tcW w:type="dxa" w:w="2041"/>
+            <w:tcBorders>
+              <w:top w:val="single" w:sz="4" w:space="0" w:color="8EAADB"/>
+              <w:left w:val="single" w:sz="4" w:space="0" w:color="8EAADB"/>
+              <w:bottom w:val="single" w:sz="4" w:space="0" w:color="8EAADB"/>
+              <w:right w:val="single" w:sz="4" w:space="0" w:color="8EAADB"/>
+            </w:tcBorders>
+            <w:shd w:val="clear" w:color="auto" w:fill="D9E2F3"/>
+            <w:vAlign w:val="top"/>
+          </w:tcPr>
+          <w:p>
+            <w:pPr>
+              <w:spacing w:before="0" w:after="0" w:line="240" w:lineRule="auto"/>
+              <w:jc w:val="left"/>
+            </w:pPr>
+            <w:r>
+              <w:rPr>
+                <w:rFonts w:ascii="Century Gothic" w:hAnsi="Century Gothic" w:cs="Century Gothic" w:eastAsia="Century Gothic"/>
+                <w:b w:val="0"/>
+                <w:i w:val="0"/>
+                <w:sz w:val="16"/>
+              </w:rPr>
+              <w:t>Porcentaje de laboratorios con software de gestión empresarial y de análisis de datos</w:t>
+            </w:r>
+          </w:p>
+        </w:tc>
+        <w:tc>
+          <w:tcPr>
+            <w:tcW w:type="dxa" w:w="1474"/>
+            <w:tcBorders>
+              <w:top w:val="single" w:sz="4" w:space="0" w:color="8EAADB"/>
+              <w:left w:val="single" w:sz="4" w:space="0" w:color="8EAADB"/>
+              <w:bottom w:val="single" w:sz="4" w:space="0" w:color="8EAADB"/>
+              <w:right w:val="single" w:sz="4" w:space="0" w:color="8EAADB"/>
+            </w:tcBorders>
+            <w:shd w:val="clear" w:color="auto" w:fill="D9E2F3"/>
+            <w:vAlign w:val="top"/>
+          </w:tcPr>
+          <w:p>
+            <w:pPr>
+              <w:spacing w:before="0" w:after="0" w:line="240" w:lineRule="auto"/>
+              <w:jc w:val="left"/>
+            </w:pPr>
+            <w:r>
+              <w:rPr>
+                <w:rFonts w:ascii="Century Gothic" w:hAnsi="Century Gothic" w:cs="Century Gothic" w:eastAsia="Century Gothic"/>
+                <w:b w:val="0"/>
+                <w:i w:val="0"/>
+                <w:sz w:val="16"/>
+              </w:rPr>
+              <w:t>Por establecer</w:t>
+            </w:r>
+          </w:p>
+        </w:tc>
+        <w:tc>
+          <w:tcPr>
+            <w:tcW w:type="dxa" w:w="1814"/>
+            <w:tcBorders>
+              <w:top w:val="single" w:sz="4" w:space="0" w:color="8EAADB"/>
+              <w:left w:val="single" w:sz="4" w:space="0" w:color="8EAADB"/>
+              <w:bottom w:val="single" w:sz="4" w:space="0" w:color="8EAADB"/>
+              <w:right w:val="single" w:sz="4" w:space="0" w:color="8EAADB"/>
+            </w:tcBorders>
+            <w:shd w:val="clear" w:color="auto" w:fill="D9E2F3"/>
+            <w:vAlign w:val="top"/>
+          </w:tcPr>
+          <w:p>
+            <w:pPr>
+              <w:spacing w:before="0" w:after="0" w:line="240" w:lineRule="auto"/>
+              <w:jc w:val="left"/>
+            </w:pPr>
+            <w:r>
+              <w:rPr>
+                <w:rFonts w:ascii="Century Gothic" w:hAnsi="Century Gothic" w:cs="Century Gothic" w:eastAsia="Century Gothic"/>
+                <w:b w:val="0"/>
+                <w:i w:val="0"/>
+                <w:sz w:val="16"/>
+              </w:rPr>
+              <w:t>100 % de laboratorios con licencias y herramientas analíticas</w:t>
+            </w:r>
+          </w:p>
+        </w:tc>
+        <w:tc>
+          <w:tcPr>
+            <w:tcW w:type="dxa" w:w="1361"/>
+            <w:tcBorders>
+              <w:top w:val="single" w:sz="4" w:space="0" w:color="8EAADB"/>
+              <w:left w:val="single" w:sz="4" w:space="0" w:color="8EAADB"/>
+              <w:bottom w:val="single" w:sz="4" w:space="0" w:color="8EAADB"/>
+              <w:right w:val="single" w:sz="4" w:space="0" w:color="8EAADB"/>
+            </w:tcBorders>
+            <w:shd w:val="clear" w:color="auto" w:fill="D9E2F3"/>
+            <w:vAlign w:val="top"/>
+          </w:tcPr>
+          <w:p>
+            <w:pPr>
+              <w:spacing w:before="0" w:after="0" w:line="240" w:lineRule="auto"/>
+              <w:jc w:val="left"/>
+            </w:pPr>
+            <w:r>
+              <w:rPr>
+                <w:rFonts w:ascii="Century Gothic" w:hAnsi="Century Gothic" w:cs="Century Gothic" w:eastAsia="Century Gothic"/>
+                <w:b w:val="0"/>
+                <w:i w:val="0"/>
+                <w:sz w:val="16"/>
+              </w:rPr>
+              <w:t>Dirección de Carrera</w:t>
+            </w:r>
+          </w:p>
+        </w:tc>
+      </w:tr>
+      <w:tr>
+        <w:tc>
+          <w:tcPr>
+            <w:tcW w:type="dxa" w:w="794"/>
+            <w:tcBorders>
+              <w:top w:val="single" w:sz="4" w:space="0" w:color="8EAADB"/>
+              <w:left w:val="single" w:sz="4" w:space="0" w:color="8EAADB"/>
+              <w:bottom w:val="single" w:sz="4" w:space="0" w:color="8EAADB"/>
+              <w:right w:val="single" w:sz="4" w:space="0" w:color="8EAADB"/>
+            </w:tcBorders>
+            <w:shd w:val="clear" w:color="auto" w:fill="D9E2F3"/>
+            <w:vAlign w:val="top"/>
+          </w:tcPr>
+          <w:p>
+            <w:pPr>
+              <w:spacing w:before="0" w:after="0" w:line="240" w:lineRule="auto"/>
+              <w:jc w:val="left"/>
+            </w:pPr>
+            <w:r>
+              <w:rPr>
+                <w:rFonts w:ascii="Century Gothic" w:hAnsi="Century Gothic" w:cs="Century Gothic" w:eastAsia="Century Gothic"/>
+                <w:b w:val="0"/>
+                <w:i w:val="0"/>
+                <w:sz w:val="16"/>
+              </w:rPr>
+              <w:t>4</w:t>
+            </w:r>
+          </w:p>
+        </w:tc>
+        <w:tc>
+          <w:tcPr>
+            <w:tcW w:type="dxa" w:w="1587"/>
+            <w:tcBorders>
+              <w:top w:val="single" w:sz="4" w:space="0" w:color="8EAADB"/>
+              <w:left w:val="single" w:sz="4" w:space="0" w:color="8EAADB"/>
+              <w:bottom w:val="single" w:sz="4" w:space="0" w:color="8EAADB"/>
+              <w:right w:val="single" w:sz="4" w:space="0" w:color="8EAADB"/>
+            </w:tcBorders>
+            <w:shd w:val="clear" w:color="auto" w:fill="D9E2F3"/>
+            <w:vAlign w:val="top"/>
+          </w:tcPr>
+          <w:p>
+            <w:pPr>
+              <w:spacing w:before="0" w:after="0" w:line="240" w:lineRule="auto"/>
+              <w:jc w:val="left"/>
+            </w:pPr>
+            <w:r>
+              <w:rPr>
+                <w:rFonts w:ascii="Century Gothic" w:hAnsi="Century Gothic" w:cs="Century Gothic" w:eastAsia="Century Gothic"/>
+                <w:b w:val="0"/>
+                <w:i w:val="0"/>
+                <w:sz w:val="16"/>
+              </w:rPr>
+              <w:t>Actualización docente</w:t>
+            </w:r>
+          </w:p>
+        </w:tc>
+        <w:tc>
+          <w:tcPr>
+            <w:tcW w:type="dxa" w:w="2041"/>
+            <w:tcBorders>
+              <w:top w:val="single" w:sz="4" w:space="0" w:color="8EAADB"/>
+              <w:left w:val="single" w:sz="4" w:space="0" w:color="8EAADB"/>
+              <w:bottom w:val="single" w:sz="4" w:space="0" w:color="8EAADB"/>
+              <w:right w:val="single" w:sz="4" w:space="0" w:color="8EAADB"/>
+            </w:tcBorders>
+            <w:shd w:val="clear" w:color="auto" w:fill="D9E2F3"/>
+            <w:vAlign w:val="top"/>
+          </w:tcPr>
+          <w:p>
+            <w:pPr>
+              <w:spacing w:before="0" w:after="0" w:line="240" w:lineRule="auto"/>
+              <w:jc w:val="left"/>
+            </w:pPr>
+            <w:r>
+              <w:rPr>
+                <w:rFonts w:ascii="Century Gothic" w:hAnsi="Century Gothic" w:cs="Century Gothic" w:eastAsia="Century Gothic"/>
+                <w:b w:val="0"/>
+                <w:i w:val="0"/>
+                <w:sz w:val="16"/>
+              </w:rPr>
+              <w:t>Porcentaje de docentes capacitados en tecnologías de la información, inteligencia artificial y enseñanza por competencias</w:t>
+            </w:r>
+          </w:p>
+        </w:tc>
+        <w:tc>
+          <w:tcPr>
+            <w:tcW w:type="dxa" w:w="1474"/>
+            <w:tcBorders>
+              <w:top w:val="single" w:sz="4" w:space="0" w:color="8EAADB"/>
+              <w:left w:val="single" w:sz="4" w:space="0" w:color="8EAADB"/>
+              <w:bottom w:val="single" w:sz="4" w:space="0" w:color="8EAADB"/>
+              <w:right w:val="single" w:sz="4" w:space="0" w:color="8EAADB"/>
+            </w:tcBorders>
+            <w:shd w:val="clear" w:color="auto" w:fill="D9E2F3"/>
+            <w:vAlign w:val="top"/>
+          </w:tcPr>
+          <w:p>
+            <w:pPr>
+              <w:spacing w:before="0" w:after="0" w:line="240" w:lineRule="auto"/>
+              <w:jc w:val="left"/>
+            </w:pPr>
+            <w:r>
+              <w:rPr>
+                <w:rFonts w:ascii="Century Gothic" w:hAnsi="Century Gothic" w:cs="Century Gothic" w:eastAsia="Century Gothic"/>
+                <w:b w:val="0"/>
+                <w:i w:val="0"/>
+                <w:sz w:val="16"/>
+              </w:rPr>
+              <w:t>Por establecer</w:t>
+            </w:r>
+          </w:p>
+        </w:tc>
+        <w:tc>
+          <w:tcPr>
+            <w:tcW w:type="dxa" w:w="1814"/>
+            <w:tcBorders>
+              <w:top w:val="single" w:sz="4" w:space="0" w:color="8EAADB"/>
+              <w:left w:val="single" w:sz="4" w:space="0" w:color="8EAADB"/>
+              <w:bottom w:val="single" w:sz="4" w:space="0" w:color="8EAADB"/>
+              <w:right w:val="single" w:sz="4" w:space="0" w:color="8EAADB"/>
+            </w:tcBorders>
+            <w:shd w:val="clear" w:color="auto" w:fill="D9E2F3"/>
+            <w:vAlign w:val="top"/>
+          </w:tcPr>
+          <w:p>
+            <w:pPr>
+              <w:spacing w:before="0" w:after="0" w:line="240" w:lineRule="auto"/>
+              <w:jc w:val="left"/>
+            </w:pPr>
+            <w:r>
+              <w:rPr>
+                <w:rFonts w:ascii="Century Gothic" w:hAnsi="Century Gothic" w:cs="Century Gothic" w:eastAsia="Century Gothic"/>
+                <w:b w:val="0"/>
+                <w:i w:val="0"/>
+                <w:sz w:val="16"/>
+              </w:rPr>
+              <w:t>100 % de los docentes capacitados</w:t>
+            </w:r>
+          </w:p>
+        </w:tc>
+        <w:tc>
+          <w:tcPr>
+            <w:tcW w:type="dxa" w:w="1361"/>
+            <w:tcBorders>
+              <w:top w:val="single" w:sz="4" w:space="0" w:color="8EAADB"/>
+              <w:left w:val="single" w:sz="4" w:space="0" w:color="8EAADB"/>
+              <w:bottom w:val="single" w:sz="4" w:space="0" w:color="8EAADB"/>
+              <w:right w:val="single" w:sz="4" w:space="0" w:color="8EAADB"/>
+            </w:tcBorders>
+            <w:shd w:val="clear" w:color="auto" w:fill="D9E2F3"/>
+            <w:vAlign w:val="top"/>
+          </w:tcPr>
+          <w:p>
+            <w:pPr>
+              <w:spacing w:before="0" w:after="0" w:line="240" w:lineRule="auto"/>
+              <w:jc w:val="left"/>
+            </w:pPr>
+            <w:r>
+              <w:rPr>
+                <w:rFonts w:ascii="Century Gothic" w:hAnsi="Century Gothic" w:cs="Century Gothic" w:eastAsia="Century Gothic"/>
+                <w:b w:val="0"/>
+                <w:i w:val="0"/>
+                <w:sz w:val="16"/>
+              </w:rPr>
+              <w:t>Dirección de Carrera</w:t>
+            </w:r>
+          </w:p>
+        </w:tc>
+      </w:tr>
+      <w:tr>
+        <w:tc>
+          <w:tcPr>
+            <w:tcW w:type="dxa" w:w="794"/>
+            <w:tcBorders>
+              <w:top w:val="single" w:sz="4" w:space="0" w:color="8EAADB"/>
+              <w:left w:val="single" w:sz="4" w:space="0" w:color="8EAADB"/>
+              <w:bottom w:val="single" w:sz="4" w:space="0" w:color="8EAADB"/>
+              <w:right w:val="single" w:sz="4" w:space="0" w:color="8EAADB"/>
+            </w:tcBorders>
+            <w:shd w:val="clear" w:color="auto" w:fill="D9E2F3"/>
+            <w:vAlign w:val="top"/>
+          </w:tcPr>
+          <w:p>
+            <w:pPr>
+              <w:spacing w:before="0" w:after="0" w:line="240" w:lineRule="auto"/>
+              <w:jc w:val="left"/>
+            </w:pPr>
+            <w:r>
+              <w:rPr>
+                <w:rFonts w:ascii="Century Gothic" w:hAnsi="Century Gothic" w:cs="Century Gothic" w:eastAsia="Century Gothic"/>
+                <w:b w:val="0"/>
+                <w:i w:val="0"/>
+                <w:sz w:val="16"/>
+              </w:rPr>
+              <w:t>4</w:t>
+            </w:r>
+          </w:p>
+        </w:tc>
+        <w:tc>
+          <w:tcPr>
+            <w:tcW w:type="dxa" w:w="1587"/>
+            <w:tcBorders>
+              <w:top w:val="single" w:sz="4" w:space="0" w:color="8EAADB"/>
+              <w:left w:val="single" w:sz="4" w:space="0" w:color="8EAADB"/>
+              <w:bottom w:val="single" w:sz="4" w:space="0" w:color="8EAADB"/>
+              <w:right w:val="single" w:sz="4" w:space="0" w:color="8EAADB"/>
+            </w:tcBorders>
+            <w:shd w:val="clear" w:color="auto" w:fill="D9E2F3"/>
+            <w:vAlign w:val="top"/>
+          </w:tcPr>
+          <w:p>
+            <w:pPr>
+              <w:spacing w:before="0" w:after="0" w:line="240" w:lineRule="auto"/>
+              <w:jc w:val="left"/>
+            </w:pPr>
+            <w:r>
+              <w:rPr>
+                <w:rFonts w:ascii="Century Gothic" w:hAnsi="Century Gothic" w:cs="Century Gothic" w:eastAsia="Century Gothic"/>
+                <w:b w:val="0"/>
+                <w:i w:val="0"/>
+                <w:sz w:val="16"/>
+              </w:rPr>
+              <w:t>Acreditación</w:t>
+            </w:r>
+          </w:p>
+        </w:tc>
+        <w:tc>
+          <w:tcPr>
+            <w:tcW w:type="dxa" w:w="2041"/>
+            <w:tcBorders>
+              <w:top w:val="single" w:sz="4" w:space="0" w:color="8EAADB"/>
+              <w:left w:val="single" w:sz="4" w:space="0" w:color="8EAADB"/>
+              <w:bottom w:val="single" w:sz="4" w:space="0" w:color="8EAADB"/>
+              <w:right w:val="single" w:sz="4" w:space="0" w:color="8EAADB"/>
+            </w:tcBorders>
+            <w:shd w:val="clear" w:color="auto" w:fill="D9E2F3"/>
+            <w:vAlign w:val="top"/>
+          </w:tcPr>
+          <w:p>
+            <w:pPr>
+              <w:spacing w:before="0" w:after="0" w:line="240" w:lineRule="auto"/>
+              <w:jc w:val="left"/>
+            </w:pPr>
+            <w:r>
+              <w:rPr>
+                <w:rFonts w:ascii="Century Gothic" w:hAnsi="Century Gothic" w:cs="Century Gothic" w:eastAsia="Century Gothic"/>
+                <w:b w:val="0"/>
+                <w:i w:val="0"/>
+                <w:sz w:val="16"/>
+              </w:rPr>
+              <w:t>Estado de la acreditación de la Carrera</w:t>
+            </w:r>
+          </w:p>
+        </w:tc>
+        <w:tc>
+          <w:tcPr>
+            <w:tcW w:type="dxa" w:w="1474"/>
+            <w:tcBorders>
+              <w:top w:val="single" w:sz="4" w:space="0" w:color="8EAADB"/>
+              <w:left w:val="single" w:sz="4" w:space="0" w:color="8EAADB"/>
+              <w:bottom w:val="single" w:sz="4" w:space="0" w:color="8EAADB"/>
+              <w:right w:val="single" w:sz="4" w:space="0" w:color="8EAADB"/>
+            </w:tcBorders>
+            <w:shd w:val="clear" w:color="auto" w:fill="D9E2F3"/>
+            <w:vAlign w:val="top"/>
+          </w:tcPr>
+          <w:p>
+            <w:pPr>
+              <w:spacing w:before="0" w:after="0" w:line="240" w:lineRule="auto"/>
+              <w:jc w:val="left"/>
+            </w:pPr>
+            <w:r>
+              <w:rPr>
+                <w:rFonts w:ascii="Century Gothic" w:hAnsi="Century Gothic" w:cs="Century Gothic" w:eastAsia="Century Gothic"/>
+                <w:b w:val="0"/>
+                <w:i w:val="0"/>
+                <w:sz w:val="16"/>
+              </w:rPr>
+              <w:t>Acreditación de 2015 por renovar</w:t>
+            </w:r>
+          </w:p>
+        </w:tc>
+        <w:tc>
+          <w:tcPr>
+            <w:tcW w:type="dxa" w:w="1814"/>
+            <w:tcBorders>
+              <w:top w:val="single" w:sz="4" w:space="0" w:color="8EAADB"/>
+              <w:left w:val="single" w:sz="4" w:space="0" w:color="8EAADB"/>
+              <w:bottom w:val="single" w:sz="4" w:space="0" w:color="8EAADB"/>
+              <w:right w:val="single" w:sz="4" w:space="0" w:color="8EAADB"/>
+            </w:tcBorders>
+            <w:shd w:val="clear" w:color="auto" w:fill="D9E2F3"/>
+            <w:vAlign w:val="top"/>
+          </w:tcPr>
+          <w:p>
+            <w:pPr>
+              <w:spacing w:before="0" w:after="0" w:line="240" w:lineRule="auto"/>
+              <w:jc w:val="left"/>
+            </w:pPr>
+            <w:r>
+              <w:rPr>
+                <w:rFonts w:ascii="Century Gothic" w:hAnsi="Century Gothic" w:cs="Century Gothic" w:eastAsia="Century Gothic"/>
+                <w:b w:val="0"/>
+                <w:i w:val="0"/>
+                <w:sz w:val="16"/>
+              </w:rPr>
+              <w:t>Reacreditación ante el CEUB y acreditación ARCU-SUR</w:t>
+            </w:r>
+          </w:p>
+        </w:tc>
+        <w:tc>
+          <w:tcPr>
+            <w:tcW w:type="dxa" w:w="1361"/>
+            <w:tcBorders>
+              <w:top w:val="single" w:sz="4" w:space="0" w:color="8EAADB"/>
+              <w:left w:val="single" w:sz="4" w:space="0" w:color="8EAADB"/>
+              <w:bottom w:val="single" w:sz="4" w:space="0" w:color="8EAADB"/>
+              <w:right w:val="single" w:sz="4" w:space="0" w:color="8EAADB"/>
+            </w:tcBorders>
+            <w:shd w:val="clear" w:color="auto" w:fill="D9E2F3"/>
+            <w:vAlign w:val="top"/>
+          </w:tcPr>
+          <w:p>
+            <w:pPr>
+              <w:spacing w:before="0" w:after="0" w:line="240" w:lineRule="auto"/>
+              <w:jc w:val="left"/>
+            </w:pPr>
+            <w:r>
+              <w:rPr>
+                <w:rFonts w:ascii="Century Gothic" w:hAnsi="Century Gothic" w:cs="Century Gothic" w:eastAsia="Century Gothic"/>
+                <w:b w:val="0"/>
+                <w:i w:val="0"/>
+                <w:sz w:val="16"/>
+              </w:rPr>
+              <w:t>Decanato y Dirección de Carrera</w:t>
+            </w:r>
+          </w:p>
+        </w:tc>
+      </w:tr>
+    </w:tbl>
+    <w:p>
+      <w:pPr>
+        <w:spacing w:before="40" w:after="200" w:line="240" w:lineRule="auto"/>
+        <w:jc w:val="left"/>
+      </w:pPr>
+      <w:r>
+        <w:rPr>
+          <w:rFonts w:ascii="Century Gothic" w:hAnsi="Century Gothic" w:cs="Century Gothic" w:eastAsia="Century Gothic"/>
+          <w:b w:val="0"/>
+          <w:i w:val="0"/>
+          <w:sz w:val="16"/>
+        </w:rPr>
+        <w:t>Fuente: Plan Estratégico de Desarrollo Institucional 2026-2030 de la Carrera de Contaduría Pública. Las líneas base marcadas como por establecer deben medirse al inicio de la implementación.</w:t>
       </w:r>
     </w:p>
     <w:p>
@@ -2154,7 +5778,7 @@
       <w:pPr>
         <w:numPr>
           <w:ilvl w:val="0"/>
-          <w:numId w:val="902"/>
+          <w:numId w:val="905"/>
         </w:numPr>
         <w:spacing w:before="0" w:after="160" w:line="240" w:lineRule="auto"/>
         <w:jc w:val="both"/>
@@ -2182,7 +5806,7 @@
       <w:pPr>
         <w:numPr>
           <w:ilvl w:val="0"/>
-          <w:numId w:val="902"/>
+          <w:numId w:val="905"/>
         </w:numPr>
         <w:spacing w:before="0" w:after="160" w:line="240" w:lineRule="auto"/>
         <w:jc w:val="both"/>
@@ -2210,7 +5834,7 @@
       <w:pPr>
         <w:numPr>
           <w:ilvl w:val="0"/>
-          <w:numId w:val="902"/>
+          <w:numId w:val="905"/>
         </w:numPr>
         <w:spacing w:before="0" w:after="160" w:line="240" w:lineRule="auto"/>
         <w:jc w:val="both"/>
@@ -2238,7 +5862,7 @@
       <w:pPr>
         <w:numPr>
           <w:ilvl w:val="0"/>
-          <w:numId w:val="902"/>
+          <w:numId w:val="905"/>
         </w:numPr>
         <w:spacing w:before="0" w:after="160" w:line="240" w:lineRule="auto"/>
         <w:jc w:val="both"/>
@@ -2266,7 +5890,7 @@
       <w:pPr>
         <w:numPr>
           <w:ilvl w:val="0"/>
-          <w:numId w:val="902"/>
+          <w:numId w:val="905"/>
         </w:numPr>
         <w:spacing w:before="0" w:after="160" w:line="240" w:lineRule="auto"/>
         <w:jc w:val="both"/>
@@ -2294,7 +5918,7 @@
       <w:pPr>
         <w:numPr>
           <w:ilvl w:val="0"/>
-          <w:numId w:val="902"/>
+          <w:numId w:val="905"/>
         </w:numPr>
         <w:spacing w:before="0" w:after="200" w:line="240" w:lineRule="auto"/>
         <w:jc w:val="both"/>
@@ -3094,7 +6718,7 @@
       <w:pPr>
         <w:numPr>
           <w:ilvl w:val="0"/>
-          <w:numId w:val="903"/>
+          <w:numId w:val="906"/>
         </w:numPr>
         <w:spacing w:before="0" w:after="160" w:line="240" w:lineRule="auto"/>
         <w:jc w:val="both"/>
@@ -3122,7 +6746,7 @@
       <w:pPr>
         <w:numPr>
           <w:ilvl w:val="0"/>
-          <w:numId w:val="903"/>
+          <w:numId w:val="906"/>
         </w:numPr>
         <w:spacing w:before="0" w:after="160" w:line="240" w:lineRule="auto"/>
         <w:jc w:val="both"/>
@@ -3150,7 +6774,7 @@
       <w:pPr>
         <w:numPr>
           <w:ilvl w:val="0"/>
-          <w:numId w:val="903"/>
+          <w:numId w:val="906"/>
         </w:numPr>
         <w:spacing w:before="0" w:after="160" w:line="240" w:lineRule="auto"/>
         <w:jc w:val="both"/>
@@ -3178,7 +6802,7 @@
       <w:pPr>
         <w:numPr>
           <w:ilvl w:val="0"/>
-          <w:numId w:val="903"/>
+          <w:numId w:val="906"/>
         </w:numPr>
         <w:spacing w:before="0" w:after="160" w:line="240" w:lineRule="auto"/>
         <w:jc w:val="both"/>
@@ -3206,7 +6830,7 @@
       <w:pPr>
         <w:numPr>
           <w:ilvl w:val="0"/>
-          <w:numId w:val="903"/>
+          <w:numId w:val="906"/>
         </w:numPr>
         <w:spacing w:before="0" w:after="160" w:line="240" w:lineRule="auto"/>
         <w:jc w:val="both"/>
@@ -3234,7 +6858,7 @@
       <w:pPr>
         <w:numPr>
           <w:ilvl w:val="0"/>
-          <w:numId w:val="903"/>
+          <w:numId w:val="906"/>
         </w:numPr>
         <w:spacing w:before="0" w:after="160" w:line="240" w:lineRule="auto"/>
         <w:jc w:val="both"/>
@@ -3262,7 +6886,7 @@
       <w:pPr>
         <w:numPr>
           <w:ilvl w:val="0"/>
-          <w:numId w:val="903"/>
+          <w:numId w:val="906"/>
         </w:numPr>
         <w:spacing w:before="0" w:after="160" w:line="240" w:lineRule="auto"/>
         <w:jc w:val="both"/>
@@ -3290,7 +6914,7 @@
       <w:pPr>
         <w:numPr>
           <w:ilvl w:val="0"/>
-          <w:numId w:val="903"/>
+          <w:numId w:val="906"/>
         </w:numPr>
         <w:spacing w:before="0" w:after="160" w:line="240" w:lineRule="auto"/>
         <w:jc w:val="both"/>
@@ -3318,7 +6942,7 @@
       <w:pPr>
         <w:numPr>
           <w:ilvl w:val="0"/>
-          <w:numId w:val="903"/>
+          <w:numId w:val="906"/>
         </w:numPr>
         <w:spacing w:before="0" w:after="160" w:line="240" w:lineRule="auto"/>
         <w:jc w:val="both"/>
@@ -3346,7 +6970,7 @@
       <w:pPr>
         <w:numPr>
           <w:ilvl w:val="0"/>
-          <w:numId w:val="903"/>
+          <w:numId w:val="906"/>
         </w:numPr>
         <w:spacing w:before="0" w:after="200" w:line="240" w:lineRule="auto"/>
         <w:jc w:val="both"/>
@@ -3443,7 +7067,7 @@
           <w:i w:val="0"/>
           <w:sz w:val="20"/>
         </w:rPr>
-        <w:t>Cuadro 1. Personal administrativo de planta</w:t>
+        <w:t>Cuadro 3. Personal administrativo de planta</w:t>
       </w:r>
     </w:p>
     <w:tbl>
@@ -4344,7 +7968,7 @@
           <w:i w:val="0"/>
           <w:sz w:val="20"/>
         </w:rPr>
-        <w:t>Cuadro 2. Personal administrativo a contrato</w:t>
+        <w:t>Cuadro 4. Personal administrativo a contrato</w:t>
       </w:r>
     </w:p>
     <w:tbl>
@@ -5959,7 +9583,7 @@
           <w:i w:val="0"/>
           <w:sz w:val="20"/>
         </w:rPr>
-        <w:t>Cuadro 3. Personal de las unidades dependientes de la Carrera</w:t>
+        <w:t>Cuadro 5. Personal de las unidades dependientes de la Carrera</w:t>
       </w:r>
     </w:p>
     <w:tbl>
@@ -7109,7 +10733,7 @@
           <w:i w:val="0"/>
           <w:sz w:val="20"/>
         </w:rPr>
-        <w:t>Cuadro 4. Docentes por categoría</w:t>
+        <w:t>Cuadro 6. Docentes por categoría</w:t>
       </w:r>
     </w:p>
     <w:tbl>
@@ -7518,7 +11142,7 @@
           <w:i w:val="0"/>
           <w:sz w:val="20"/>
         </w:rPr>
-        <w:t>Cuadro 5. Carga horaria de los docentes por áreas, expresada en cantidad de docentes</w:t>
+        <w:t>Cuadro 7. Carga horaria de los docentes por áreas, expresada en cantidad de docentes</w:t>
       </w:r>
     </w:p>
     <w:tbl>
@@ -10484,7 +14108,7 @@
           <w:i w:val="0"/>
           <w:sz w:val="20"/>
         </w:rPr>
-        <w:t>Cuadro 6. Docentes sin duplicidad entre áreas</w:t>
+        <w:t>Cuadro 8. Docentes sin duplicidad entre áreas</w:t>
       </w:r>
     </w:p>
     <w:tbl>
@@ -10586,7 +14210,7 @@
                 <w:i w:val="0"/>
                 <w:sz w:val="20"/>
               </w:rPr>
-              <w:t>Sumatoria total según el Cuadro 5</w:t>
+              <w:t>Sumatoria total según el Cuadro 7</w:t>
             </w:r>
           </w:p>
         </w:tc>
@@ -10812,14 +14436,14 @@
           <w:i w:val="0"/>
           <w:sz w:val="20"/>
         </w:rPr>
-        <w:t>Los Cuadros 5 y 6 permiten establecer lo siguiente:</w:t>
+        <w:t>Los Cuadros 7 y 8 permiten establecer lo siguiente:</w:t>
       </w:r>
     </w:p>
     <w:p>
       <w:pPr>
         <w:numPr>
           <w:ilvl w:val="0"/>
-          <w:numId w:val="904"/>
+          <w:numId w:val="907"/>
         </w:numPr>
         <w:spacing w:before="0" w:after="160" w:line="240" w:lineRule="auto"/>
         <w:jc w:val="both"/>
@@ -10838,7 +14462,7 @@
       <w:pPr>
         <w:numPr>
           <w:ilvl w:val="0"/>
-          <w:numId w:val="904"/>
+          <w:numId w:val="907"/>
         </w:numPr>
         <w:spacing w:before="0" w:after="160" w:line="240" w:lineRule="auto"/>
         <w:jc w:val="both"/>
@@ -10857,7 +14481,7 @@
       <w:pPr>
         <w:numPr>
           <w:ilvl w:val="0"/>
-          <w:numId w:val="904"/>
+          <w:numId w:val="907"/>
         </w:numPr>
         <w:spacing w:before="0" w:after="200" w:line="240" w:lineRule="auto"/>
         <w:jc w:val="both"/>
@@ -10900,7 +14524,7 @@
           <w:i w:val="0"/>
           <w:sz w:val="20"/>
         </w:rPr>
-        <w:t>Cuadro 7. Docentes por áreas y categoría, expresado en cantidad</w:t>
+        <w:t>Cuadro 9. Docentes por áreas y categoría, expresado en cantidad</w:t>
       </w:r>
     </w:p>
     <w:tbl>
@@ -13546,7 +17170,7 @@
           <w:i w:val="0"/>
           <w:sz w:val="20"/>
         </w:rPr>
-        <w:t>Cuadro 8. Docentes por áreas y categoría, expresado en porcentaje</w:t>
+        <w:t>Cuadro 10. Docentes por áreas y categoría, expresado en porcentaje</w:t>
       </w:r>
     </w:p>
     <w:tbl>
@@ -16176,7 +19800,7 @@
           <w:i w:val="0"/>
           <w:sz w:val="16"/>
         </w:rPr>
-        <w:t>Fuente: elaboración propia con base en el Cuadro 7.</w:t>
+        <w:t>Fuente: elaboración propia con base en el Cuadro 9.</w:t>
       </w:r>
     </w:p>
     <w:p>
@@ -16191,7 +19815,7 @@
           <w:i w:val="0"/>
           <w:sz w:val="20"/>
         </w:rPr>
-        <w:t>Según los Cuadros 7 y 8, existen 85 designaciones de docentes titulares, equivalentes al 46,45 %, y 98 de docentes interinos e invitados, equivalentes al 53,55 %. Aunque ambos grupos guardan cierto equilibrio, la normativa universitaria vigente establece que un porcentaje significativo de los docentes debe ser titular para asegurar la continuidad y la excelencia académica. Por tanto, la Carrera requiere incorporar a la brevedad docentes titulares mediante convocatoria pública a concurso de méritos y exámenes de competencia.</w:t>
+        <w:t>Según los Cuadros 9 y 10, existen 85 designaciones de docentes titulares, equivalentes al 46,45 %, y 98 de docentes interinos e invitados, equivalentes al 53,55 %. Aunque ambos grupos guardan cierto equilibrio, la normativa universitaria vigente establece que un porcentaje significativo de los docentes debe ser titular para asegurar la continuidad y la excelencia académica. Por tanto, la Carrera requiere incorporar a la brevedad docentes titulares mediante convocatoria pública a concurso de méritos y exámenes de competencia.</w:t>
       </w:r>
     </w:p>
     <w:p>
@@ -16252,7 +19876,7 @@
           <w:i w:val="0"/>
           <w:sz w:val="20"/>
         </w:rPr>
-        <w:t>Cuadro 9. Estudiantes matriculados e inscritos</w:t>
+        <w:t>Cuadro 11. Estudiantes matriculados e inscritos</w:t>
       </w:r>
     </w:p>
     <w:tbl>
@@ -16987,14 +20611,14 @@
           <w:i w:val="0"/>
           <w:sz w:val="20"/>
         </w:rPr>
-        <w:t>Del Cuadro 9 se establece lo siguiente:</w:t>
+        <w:t>Del Cuadro 11 se establece lo siguiente:</w:t>
       </w:r>
     </w:p>
     <w:p>
       <w:pPr>
         <w:numPr>
           <w:ilvl w:val="0"/>
-          <w:numId w:val="905"/>
+          <w:numId w:val="908"/>
         </w:numPr>
         <w:spacing w:before="0" w:after="160" w:line="240" w:lineRule="auto"/>
         <w:jc w:val="both"/>
@@ -17013,7 +20637,7 @@
       <w:pPr>
         <w:numPr>
           <w:ilvl w:val="0"/>
-          <w:numId w:val="905"/>
+          <w:numId w:val="908"/>
         </w:numPr>
         <w:spacing w:before="0" w:after="160" w:line="240" w:lineRule="auto"/>
         <w:jc w:val="both"/>
@@ -17032,7 +20656,7 @@
       <w:pPr>
         <w:numPr>
           <w:ilvl w:val="0"/>
-          <w:numId w:val="905"/>
+          <w:numId w:val="908"/>
         </w:numPr>
         <w:spacing w:before="0" w:after="200" w:line="240" w:lineRule="auto"/>
         <w:jc w:val="both"/>
@@ -17059,7 +20683,7 @@
           <w:i w:val="0"/>
           <w:sz w:val="20"/>
         </w:rPr>
-        <w:t>Las cifras de inscritos del Cuadro 9 corresponden a la sede de La Paz. Si se suman los 104 estudiantes de las sedes desconcentradas, la Carrera registró 3.247 inscritos en la gestión 2025, de los cuales 1.830 son mujeres, el 56 %, y 1.417 varones, el 44 %. Además, 1.589 estudiantes, el 48,9 %, realizan actividad laboral remunerada de forma paralela a sus estudios, condición que explica la existencia del turno nocturno y que el nuevo plan de estudios debe tomar en cuenta. Los nuevos inscritos anuales fueron 498 en 2023, 448 en 2024 y 471 en 2025, y en 2025 se registraron 396 estudiantes con siete a nueve años de permanencia en la Carrera.</w:t>
+        <w:t>Las cifras de inscritos del Cuadro 11 corresponden a la sede de La Paz. Si se suman los 104 estudiantes de las sedes desconcentradas, la Carrera registró 3.247 inscritos en la gestión 2025, de los cuales 1.830 son mujeres, el 56 %, y 1.417 varones, el 44 %. Además, 1.589 estudiantes, el 48,9 %, realizan actividad laboral remunerada de forma paralela a sus estudios, condición que explica la existencia del turno nocturno y que el nuevo plan de estudios debe tomar en cuenta. Los nuevos inscritos anuales fueron 498 en 2023, 448 en 2024 y 471 en 2025, y en 2025 se registraron 396 estudiantes con siete a nueve años de permanencia en la Carrera.</w:t>
       </w:r>
     </w:p>
     <w:p>
@@ -17075,7 +20699,7 @@
           <w:i w:val="0"/>
           <w:sz w:val="20"/>
         </w:rPr>
-        <w:t>Cuadro 10. Estudiantes titulados por modalidad de graduación</w:t>
+        <w:t>Cuadro 12. Estudiantes titulados por modalidad de graduación</w:t>
       </w:r>
     </w:p>
     <w:tbl>
@@ -18660,7 +22284,7 @@
           <w:i w:val="0"/>
           <w:sz w:val="20"/>
         </w:rPr>
-        <w:t>Según el Cuadro 10, la mayoría de los estudiantes se titula mediante el examen de grado, que en el periodo 2021 a 2025 representa el 69,7 % del total de titulados. Las demás modalidades tienen una participación reducida, debido principalmente a la falta de convenios interinstitucionales que permitan desarrollarlas de manera efectiva dentro del marco normativo de la Universidad Mayor de San Andrés.</w:t>
+        <w:t>Según el Cuadro 12, la mayoría de los estudiantes se titula mediante el examen de grado, que en el periodo 2021 a 2025 representa el 69,7 % del total de titulados. Las demás modalidades tienen una participación reducida, debido principalmente a la falta de convenios interinstitucionales que permitan desarrollarlas de manera efectiva dentro del marco normativo de la Universidad Mayor de San Andrés.</w:t>
       </w:r>
     </w:p>
     <w:p>
@@ -18676,7 +22300,7 @@
           <w:i w:val="0"/>
           <w:sz w:val="20"/>
         </w:rPr>
-        <w:t>Cuadro 11. Estudiantes inscritos por asignatura y paralelo</w:t>
+        <w:t>Cuadro 13. Estudiantes inscritos por asignatura y paralelo</w:t>
       </w:r>
     </w:p>
     <w:tbl>
@@ -19297,7 +22921,7 @@
           <w:i w:val="0"/>
           <w:sz w:val="20"/>
         </w:rPr>
-        <w:t>Según el Cuadro 11, el promedio de estudiantes por paralelo se mantiene entre 104 y 109 en el periodo 2023 a 2026, una cifra elevada respecto a lo que requiere el trabajo académico por competencias. Además, el total de inscripciones por asignatura creció de 22.636 a 24.117. Por tanto, la Carrera necesita un mayor número de docentes y la asignación de mayor carga horaria para cumplir adecuadamente su cometido.</w:t>
+        <w:t>Según el Cuadro 13, el promedio de estudiantes por paralelo se mantiene entre 104 y 109 en el periodo 2023 a 2026, una cifra elevada respecto a lo que requiere el trabajo académico por competencias. Además, el total de inscripciones por asignatura creció de 22.636 a 24.117. Por tanto, la Carrera necesita un mayor número de docentes y la asignación de mayor carga horaria para cumplir adecuadamente su cometido.</w:t>
       </w:r>
     </w:p>
     <w:sectPr>
@@ -19832,7 +23456,7 @@
     </w:lvlOverride>
   </w:num>
   <w:num w:numId="902">
-    <w:abstractNumId w:val="901"/>
+    <w:abstractNumId w:val="900"/>
     <w:lvlOverride w:ilvl="0">
       <w:startOverride w:val="1"/>
     </w:lvlOverride>
@@ -19850,6 +23474,24 @@
     </w:lvlOverride>
   </w:num>
   <w:num w:numId="905">
+    <w:abstractNumId w:val="901"/>
+    <w:lvlOverride w:ilvl="0">
+      <w:startOverride w:val="1"/>
+    </w:lvlOverride>
+  </w:num>
+  <w:num w:numId="906">
+    <w:abstractNumId w:val="900"/>
+    <w:lvlOverride w:ilvl="0">
+      <w:startOverride w:val="1"/>
+    </w:lvlOverride>
+  </w:num>
+  <w:num w:numId="907">
+    <w:abstractNumId w:val="900"/>
+    <w:lvlOverride w:ilvl="0">
+      <w:startOverride w:val="1"/>
+    </w:lvlOverride>
+  </w:num>
+  <w:num w:numId="908">
     <w:abstractNumId w:val="900"/>
     <w:lvlOverride w:ilvl="0">
       <w:startOverride w:val="1"/>

</xml_diff>

<commit_message>
Agrega punto 3 Justificación de la innovación curricular y corrige cifras de Ipsos en 2.3
Co-Authored-By: Claude Opus 5.5 <noreply@anthropic.com>
Claude-Session: https://claude.ai/code/session_01Li7yxA95TVg4oPXuqG5DZe
</commit_message>
<xml_diff>
--- a/rediseno_2026/2. Antecedentes.docx
+++ b/rediseno_2026/2. Antecedentes.docx
@@ -2415,7 +2415,7 @@
           <w:i w:val="0"/>
           <w:sz w:val="20"/>
         </w:rPr>
-        <w:t xml:space="preserve"> El estudio de Ipsos CIESMORI de 2025 registra una brecha del 93 % en habilidades tecnológicas de los egresados, y el 75 % de los profesionales demanda dominio de software contable, sistemas de planificación de recursos empresariales y herramientas de análisis de datos. El Future of Jobs Report 2025 del Foro Económico Mundial ubica a la inteligencia artificial y al análisis de grandes volúmenes de datos como las competencias de mayor crecimiento.</w:t>
+        <w:t xml:space="preserve"> El estudio de Ipsos CIESMORI de 2025 registra una brecha de 43 puntos porcentuales entre la necesidad laboral de habilidades tecnológicas básicas, que el 98 % de los egresados considera necesarias, y su aplicación durante la formación, que solo el 55 % reconoce; en las habilidades tecnológicas emergentes la brecha llega a 51 puntos. Además, el 75 % de los egresados demanda dominio de software contable, sistemas de planificación de recursos empresariales y herramientas de análisis de datos. El Future of Jobs Report 2025 del Foro Económico Mundial ubica a la inteligencia artificial y al análisis de grandes volúmenes de datos como las competencias de mayor crecimiento.</w:t>
       </w:r>
     </w:p>
     <w:p>
@@ -2471,7 +2471,7 @@
           <w:i w:val="0"/>
           <w:sz w:val="20"/>
         </w:rPr>
-        <w:t xml:space="preserve"> El 52 % de los graduados trabaja en relación de dependencia, pero el 77 % de ellos se ubica en niveles técnico operativos y solo el 23 % accede a cargos gerenciales. La auditoría interna es el principal campo de inserción, con el 35 %, y el 41 % de los profesionales ejerce de forma independiente.</w:t>
+        <w:t xml:space="preserve"> El 52 % de los graduados trabaja en relación de dependencia, pero el 77 % de ellos se ubica en niveles técnico operativos y solo el 23 % accede a cargos gerenciales. La auditoría interna es el principal campo de inserción, con el 35 %, y el 31 % de los egresados ejerce de forma independiente o como consultor.</w:t>
       </w:r>
     </w:p>
     <w:p>
@@ -2555,7 +2555,7 @@
           <w:i w:val="0"/>
           <w:sz w:val="20"/>
         </w:rPr>
-        <w:t xml:space="preserve"> Ipsos CIESMORI identifica brechas en gestión del tiempo, del 81 %, y en pensamiento crítico, del 78 %; el BID señala la falta de habilidades blandas como la principal barrera de contratación, con el 26 %, y el 89 % de los estudiantes identifica la demanda de idiomas y tecnología como una amenaza para su inserción laboral.</w:t>
+        <w:t xml:space="preserve"> Ipsos CIESMORI identifica brechas de 35 puntos porcentuales en gestión del tiempo y de 25 puntos en pensamiento crítico entre su necesidad laboral y su aplicación en la formación; el BID señala la falta de habilidades blandas como la principal barrera de contratación, con el 26 %, y el 89 % de los estudiantes identifica la demanda de idiomas y tecnología como una amenaza para su inserción laboral.</w:t>
       </w:r>
     </w:p>
     <w:p>
@@ -3363,7 +3363,7 @@
                 <w:i w:val="0"/>
                 <w:sz w:val="18"/>
               </w:rPr>
-              <w:t>Brecha tecnológica del 93 % en los egresados</w:t>
+              <w:t>Brecha de 43 a 51 puntos porcentuales en habilidades tecnológicas de los egresados</w:t>
             </w:r>
           </w:p>
           <w:p>

</xml_diff>

<commit_message>
Agrega punto 5 Admisión, promoción y graduación y unifica la sigla PETAENG
Co-Authored-By: Claude Opus 5.5 <noreply@anthropic.com>
Claude-Session: https://claude.ai/code/session_01Li7yxA95TVg4oPXuqG5DZe
</commit_message>
<xml_diff>
--- a/rediseno_2026/2. Antecedentes.docx
+++ b/rediseno_2026/2. Antecedentes.docx
@@ -9801,7 +9801,7 @@
                 <w:i w:val="0"/>
                 <w:sz w:val="20"/>
               </w:rPr>
-              <w:t>PETAEG</w:t>
+              <w:t>PETAENG</w:t>
             </w:r>
           </w:p>
         </w:tc>
@@ -9915,7 +9915,7 @@
                 <w:i w:val="0"/>
                 <w:sz w:val="20"/>
               </w:rPr>
-              <w:t>PETAEG</w:t>
+              <w:t>PETAENG</w:t>
             </w:r>
           </w:p>
         </w:tc>
@@ -10627,7 +10627,7 @@
           <w:i w:val="0"/>
           <w:sz w:val="16"/>
         </w:rPr>
-        <w:t>PETAEG: Plan Excepcional de Titulación para Antiguos Estudiantes No Graduados. Fuente: Diagnóstico de la Carrera de Contaduría Pública, 2026.</w:t>
+        <w:t>PETAENG: Plan Excepcional de Titulación para Antiguos Estudiantes No Graduados. Fuente: Diagnóstico de la Carrera de Contaduría Pública, 2026.</w:t>
       </w:r>
     </w:p>
     <w:p>
@@ -10642,7 +10642,7 @@
           <w:i w:val="0"/>
           <w:sz w:val="20"/>
         </w:rPr>
-        <w:t>Las unidades dependientes no cuentan con ítems de planta. El PETAEG financia con recursos propios a dos servidores, responsables de la gestión académica y financiera y del apoyo administrativo, y la Unidad de Postgrado financia a cinco servidores en gestión secretarial, gestión documental, administración financiera, sistemas y apoyo administrativo. Esta capacidad de autogestión les permite atender sus propios requerimientos sin afectar la estructura administrativa de la Carrera, pero su continuidad depende de la generación de recursos propios.</w:t>
+        <w:t>Las unidades dependientes no cuentan con ítems de planta. El PETAENG financia con recursos propios a dos servidores, responsables de la gestión académica y financiera y del apoyo administrativo, y la Unidad de Postgrado financia a cinco servidores en gestión secretarial, gestión documental, administración financiera, sistemas y apoyo administrativo. Esta capacidad de autogestión les permite atender sus propios requerimientos sin afectar la estructura administrativa de la Carrera, pero su continuidad depende de la generación de recursos propios.</w:t>
       </w:r>
     </w:p>
     <w:p>

</xml_diff>